<commit_message>
Committing updated version file, release-notes.txt file, and CTAM onboarding documentation
</commit_message>
<xml_diff>
--- a/docs/CTAM - OnBoarding Document.docx
+++ b/docs/CTAM - OnBoarding Document.docx
@@ -1,6 +1,6 @@
 
 <file path=word/document.xml><?xml version="1.0" encoding="utf-8"?>
-<w:document xmlns:wpc="http://schemas.microsoft.com/office/word/2010/wordprocessingCanvas" xmlns:cx="http://schemas.microsoft.com/office/drawing/2014/chartex" xmlns:cx1="http://schemas.microsoft.com/office/drawing/2015/9/8/chartex" xmlns:cx2="http://schemas.microsoft.com/office/drawing/2015/10/21/chartex" xmlns:cx3="http://schemas.microsoft.com/office/drawing/2016/5/9/chartex" xmlns:cx4="http://schemas.microsoft.com/office/drawing/2016/5/10/chartex" xmlns:cx5="http://schemas.microsoft.com/office/drawing/2016/5/11/chartex" xmlns:cx6="http://schemas.microsoft.com/office/drawing/2016/5/12/chartex" xmlns:cx7="http://schemas.microsoft.com/office/drawing/2016/5/13/chartex" xmlns:cx8="http://schemas.microsoft.com/office/drawing/2016/5/14/chartex" xmlns:mc="http://schemas.openxmlformats.org/markup-compatibility/2006" xmlns:aink="http://schemas.microsoft.com/office/drawing/2016/ink" xmlns:am3d="http://schemas.microsoft.com/office/drawing/2017/model3d" xmlns:o="urn:schemas-microsoft-com:office:office" xmlns:oel="http://schemas.microsoft.com/office/2019/extlst" xmlns:r="http://schemas.openxmlformats.org/officeDocument/2006/relationships" xmlns:m="http://schemas.openxmlformats.org/officeDocument/2006/math" xmlns:v="urn:schemas-microsoft-com:vml" xmlns:wp14="http://schemas.microsoft.com/office/word/2010/wordprocessingDrawing" xmlns:wp="http://schemas.openxmlformats.org/drawingml/2006/wordprocessingDrawing" xmlns:w10="urn:schemas-microsoft-com:office:word" xmlns:w="http://schemas.openxmlformats.org/wordprocessingml/2006/main" xmlns:w14="http://schemas.microsoft.com/office/word/2010/wordml" xmlns:w15="http://schemas.microsoft.com/office/word/2012/wordml" xmlns:w16cex="http://schemas.microsoft.com/office/word/2018/wordml/cex" xmlns:w16cid="http://schemas.microsoft.com/office/word/2016/wordml/cid" xmlns:w16="http://schemas.microsoft.com/office/word/2018/wordml" xmlns:w16sdtdh="http://schemas.microsoft.com/office/word/2020/wordml/sdtdatahash" xmlns:w16se="http://schemas.microsoft.com/office/word/2015/wordml/symex" xmlns:wpg="http://schemas.microsoft.com/office/word/2010/wordprocessingGroup" xmlns:wpi="http://schemas.microsoft.com/office/word/2010/wordprocessingInk" xmlns:wne="http://schemas.microsoft.com/office/word/2006/wordml" xmlns:wps="http://schemas.microsoft.com/office/word/2010/wordprocessingShape" mc:Ignorable="w14 w15 w16se w16cid w16 w16cex w16sdtdh wp14">
+<w:document xmlns:wpc="http://schemas.microsoft.com/office/word/2010/wordprocessingCanvas" xmlns:cx="http://schemas.microsoft.com/office/drawing/2014/chartex" xmlns:cx1="http://schemas.microsoft.com/office/drawing/2015/9/8/chartex" xmlns:cx2="http://schemas.microsoft.com/office/drawing/2015/10/21/chartex" xmlns:cx3="http://schemas.microsoft.com/office/drawing/2016/5/9/chartex" xmlns:cx4="http://schemas.microsoft.com/office/drawing/2016/5/10/chartex" xmlns:cx5="http://schemas.microsoft.com/office/drawing/2016/5/11/chartex" xmlns:cx6="http://schemas.microsoft.com/office/drawing/2016/5/12/chartex" xmlns:cx7="http://schemas.microsoft.com/office/drawing/2016/5/13/chartex" xmlns:cx8="http://schemas.microsoft.com/office/drawing/2016/5/14/chartex" xmlns:mc="http://schemas.openxmlformats.org/markup-compatibility/2006" xmlns:aink="http://schemas.microsoft.com/office/drawing/2016/ink" xmlns:am3d="http://schemas.microsoft.com/office/drawing/2017/model3d" xmlns:o="urn:schemas-microsoft-com:office:office" xmlns:oel="http://schemas.microsoft.com/office/2019/extlst" xmlns:r="http://schemas.openxmlformats.org/officeDocument/2006/relationships" xmlns:m="http://schemas.openxmlformats.org/officeDocument/2006/math" xmlns:v="urn:schemas-microsoft-com:vml" xmlns:wp14="http://schemas.microsoft.com/office/word/2010/wordprocessingDrawing" xmlns:wp="http://schemas.openxmlformats.org/drawingml/2006/wordprocessingDrawing" xmlns:w10="urn:schemas-microsoft-com:office:word" xmlns:w="http://schemas.openxmlformats.org/wordprocessingml/2006/main" xmlns:w14="http://schemas.microsoft.com/office/word/2010/wordml" xmlns:w15="http://schemas.microsoft.com/office/word/2012/wordml" xmlns:w16cex="http://schemas.microsoft.com/office/word/2018/wordml/cex" xmlns:w16cid="http://schemas.microsoft.com/office/word/2016/wordml/cid" xmlns:w16="http://schemas.microsoft.com/office/word/2018/wordml" xmlns:w16du="http://schemas.microsoft.com/office/word/2023/wordml/word16du" xmlns:w16sdtdh="http://schemas.microsoft.com/office/word/2020/wordml/sdtdatahash" xmlns:w16sdtfl="http://schemas.microsoft.com/office/word/2024/wordml/sdtformatlock" xmlns:w16se="http://schemas.microsoft.com/office/word/2015/wordml/symex" xmlns:wpg="http://schemas.microsoft.com/office/word/2010/wordprocessingGroup" xmlns:wpi="http://schemas.microsoft.com/office/word/2010/wordprocessingInk" xmlns:wne="http://schemas.microsoft.com/office/word/2006/wordml" xmlns:wps="http://schemas.microsoft.com/office/word/2010/wordprocessingShape" mc:Ignorable="w14 w15 w16se w16cid w16 w16cex w16sdtdh w16sdtfl w16du wp14">
   <w:body>
     <w:p>
       <w:pPr>
@@ -21,7 +21,7 @@
       <w:pPr>
         <w:pStyle w:val="Heading1"/>
       </w:pPr>
-      <w:bookmarkStart w:id="0" w:name="_Toc151983249"/>
+      <w:bookmarkStart w:id="0" w:name="_Toc193706965"/>
       <w:r>
         <w:t>Table Of Contents</w:t>
       </w:r>
@@ -70,6 +70,7 @@
               <w:noProof/>
               <w:sz w:val="24"/>
               <w:szCs w:val="24"/>
+              <w:lang w:val="en-IN" w:eastAsia="en-IN"/>
             </w:rPr>
           </w:pPr>
           <w:r>
@@ -81,7 +82,7 @@
           <w:r>
             <w:fldChar w:fldCharType="separate"/>
           </w:r>
-          <w:hyperlink w:anchor="_Toc151983249" w:history="1">
+          <w:hyperlink w:anchor="_Toc193706965" w:history="1">
             <w:r>
               <w:rPr>
                 <w:rStyle w:val="Hyperlink"/>
@@ -108,7 +109,7 @@
                 <w:noProof/>
                 <w:webHidden/>
               </w:rPr>
-              <w:instrText xml:space="preserve"> PAGEREF _Toc151983249 \h </w:instrText>
+              <w:instrText xml:space="preserve"> PAGEREF _Toc193706965 \h </w:instrText>
             </w:r>
             <w:r>
               <w:rPr>
@@ -150,9 +151,10 @@
               <w:noProof/>
               <w:sz w:val="24"/>
               <w:szCs w:val="24"/>
+              <w:lang w:val="en-IN" w:eastAsia="en-IN"/>
             </w:rPr>
           </w:pPr>
-          <w:hyperlink w:anchor="_Toc151983250" w:history="1">
+          <w:hyperlink w:anchor="_Toc193706966" w:history="1">
             <w:r>
               <w:rPr>
                 <w:rStyle w:val="Hyperlink"/>
@@ -180,7 +182,7 @@
                 <w:noProof/>
                 <w:webHidden/>
               </w:rPr>
-              <w:instrText xml:space="preserve"> PAGEREF _Toc151983250 \h </w:instrText>
+              <w:instrText xml:space="preserve"> PAGEREF _Toc193706966 \h </w:instrText>
             </w:r>
             <w:r>
               <w:rPr>
@@ -222,9 +224,10 @@
               <w:noProof/>
               <w:sz w:val="24"/>
               <w:szCs w:val="24"/>
+              <w:lang w:val="en-IN" w:eastAsia="en-IN"/>
             </w:rPr>
           </w:pPr>
-          <w:hyperlink w:anchor="_Toc151983251" w:history="1">
+          <w:hyperlink w:anchor="_Toc193706967" w:history="1">
             <w:r>
               <w:rPr>
                 <w:rStyle w:val="Hyperlink"/>
@@ -252,7 +255,7 @@
                 <w:noProof/>
                 <w:webHidden/>
               </w:rPr>
-              <w:instrText xml:space="preserve"> PAGEREF _Toc151983251 \h </w:instrText>
+              <w:instrText xml:space="preserve"> PAGEREF _Toc193706967 \h </w:instrText>
             </w:r>
             <w:r>
               <w:rPr>
@@ -295,9 +298,10 @@
               <w:noProof/>
               <w:sz w:val="24"/>
               <w:szCs w:val="24"/>
+              <w:lang w:val="en-IN" w:eastAsia="en-IN"/>
             </w:rPr>
           </w:pPr>
-          <w:hyperlink w:anchor="_Toc151983252" w:history="1">
+          <w:hyperlink w:anchor="_Toc193706968" w:history="1">
             <w:r>
               <w:rPr>
                 <w:rStyle w:val="Hyperlink"/>
@@ -312,6 +316,7 @@
                 <w:noProof/>
                 <w:sz w:val="24"/>
                 <w:szCs w:val="24"/>
+                <w:lang w:val="en-IN" w:eastAsia="en-IN"/>
               </w:rPr>
               <w:tab/>
             </w:r>
@@ -342,7 +347,7 @@
                 <w:noProof/>
                 <w:webHidden/>
               </w:rPr>
-              <w:instrText xml:space="preserve"> PAGEREF _Toc151983252 \h </w:instrText>
+              <w:instrText xml:space="preserve"> PAGEREF _Toc193706968 \h </w:instrText>
             </w:r>
             <w:r>
               <w:rPr>
@@ -385,9 +390,10 @@
               <w:noProof/>
               <w:sz w:val="24"/>
               <w:szCs w:val="24"/>
+              <w:lang w:val="en-IN" w:eastAsia="en-IN"/>
             </w:rPr>
           </w:pPr>
-          <w:hyperlink w:anchor="_Toc151983253" w:history="1">
+          <w:hyperlink w:anchor="_Toc193706969" w:history="1">
             <w:r>
               <w:rPr>
                 <w:rStyle w:val="Hyperlink"/>
@@ -402,6 +408,7 @@
                 <w:noProof/>
                 <w:sz w:val="24"/>
                 <w:szCs w:val="24"/>
+                <w:lang w:val="en-IN" w:eastAsia="en-IN"/>
               </w:rPr>
               <w:tab/>
             </w:r>
@@ -432,7 +439,7 @@
                 <w:noProof/>
                 <w:webHidden/>
               </w:rPr>
-              <w:instrText xml:space="preserve"> PAGEREF _Toc151983253 \h </w:instrText>
+              <w:instrText xml:space="preserve"> PAGEREF _Toc193706969 \h </w:instrText>
             </w:r>
             <w:r>
               <w:rPr>
@@ -475,9 +482,10 @@
               <w:noProof/>
               <w:sz w:val="24"/>
               <w:szCs w:val="24"/>
+              <w:lang w:val="en-IN" w:eastAsia="en-IN"/>
             </w:rPr>
           </w:pPr>
-          <w:hyperlink w:anchor="_Toc151983254" w:history="1">
+          <w:hyperlink w:anchor="_Toc193706970" w:history="1">
             <w:r>
               <w:rPr>
                 <w:rStyle w:val="Hyperlink"/>
@@ -491,6 +499,7 @@
                 <w:noProof/>
                 <w:sz w:val="24"/>
                 <w:szCs w:val="24"/>
+                <w:lang w:val="en-IN" w:eastAsia="en-IN"/>
               </w:rPr>
               <w:tab/>
             </w:r>
@@ -520,7 +529,7 @@
                 <w:noProof/>
                 <w:webHidden/>
               </w:rPr>
-              <w:instrText xml:space="preserve"> PAGEREF _Toc151983254 \h </w:instrText>
+              <w:instrText xml:space="preserve"> PAGEREF _Toc193706970 \h </w:instrText>
             </w:r>
             <w:r>
               <w:rPr>
@@ -563,9 +572,10 @@
               <w:noProof/>
               <w:sz w:val="24"/>
               <w:szCs w:val="24"/>
+              <w:lang w:val="en-IN" w:eastAsia="en-IN"/>
             </w:rPr>
           </w:pPr>
-          <w:hyperlink w:anchor="_Toc151983255" w:history="1">
+          <w:hyperlink w:anchor="_Toc193706971" w:history="1">
             <w:r>
               <w:rPr>
                 <w:rStyle w:val="Hyperlink"/>
@@ -580,6 +590,7 @@
                 <w:noProof/>
                 <w:sz w:val="24"/>
                 <w:szCs w:val="24"/>
+                <w:lang w:val="en-IN" w:eastAsia="en-IN"/>
               </w:rPr>
               <w:tab/>
             </w:r>
@@ -610,7 +621,7 @@
                 <w:noProof/>
                 <w:webHidden/>
               </w:rPr>
-              <w:instrText xml:space="preserve"> PAGEREF _Toc151983255 \h </w:instrText>
+              <w:instrText xml:space="preserve"> PAGEREF _Toc193706971 \h </w:instrText>
             </w:r>
             <w:r>
               <w:rPr>
@@ -653,9 +664,10 @@
               <w:noProof/>
               <w:sz w:val="24"/>
               <w:szCs w:val="24"/>
+              <w:lang w:val="en-IN" w:eastAsia="en-IN"/>
             </w:rPr>
           </w:pPr>
-          <w:hyperlink w:anchor="_Toc151983256" w:history="1">
+          <w:hyperlink w:anchor="_Toc193706972" w:history="1">
             <w:r>
               <w:rPr>
                 <w:rStyle w:val="Hyperlink"/>
@@ -669,6 +681,7 @@
                 <w:noProof/>
                 <w:sz w:val="24"/>
                 <w:szCs w:val="24"/>
+                <w:lang w:val="en-IN" w:eastAsia="en-IN"/>
               </w:rPr>
               <w:tab/>
             </w:r>
@@ -698,7 +711,7 @@
                 <w:noProof/>
                 <w:webHidden/>
               </w:rPr>
-              <w:instrText xml:space="preserve"> PAGEREF _Toc151983256 \h </w:instrText>
+              <w:instrText xml:space="preserve"> PAGEREF _Toc193706972 \h </w:instrText>
             </w:r>
             <w:r>
               <w:rPr>
@@ -740,9 +753,10 @@
               <w:noProof/>
               <w:sz w:val="24"/>
               <w:szCs w:val="24"/>
+              <w:lang w:val="en-IN" w:eastAsia="en-IN"/>
             </w:rPr>
           </w:pPr>
-          <w:hyperlink w:anchor="_Toc151983257" w:history="1">
+          <w:hyperlink w:anchor="_Toc193706973" w:history="1">
             <w:r>
               <w:rPr>
                 <w:rStyle w:val="Hyperlink"/>
@@ -769,7 +783,7 @@
                 <w:noProof/>
                 <w:webHidden/>
               </w:rPr>
-              <w:instrText xml:space="preserve"> PAGEREF _Toc151983257 \h </w:instrText>
+              <w:instrText xml:space="preserve"> PAGEREF _Toc193706973 \h </w:instrText>
             </w:r>
             <w:r>
               <w:rPr>
@@ -811,9 +825,10 @@
               <w:noProof/>
               <w:sz w:val="24"/>
               <w:szCs w:val="24"/>
+              <w:lang w:val="en-IN" w:eastAsia="en-IN"/>
             </w:rPr>
           </w:pPr>
-          <w:hyperlink w:anchor="_Toc151983258" w:history="1">
+          <w:hyperlink w:anchor="_Toc193706974" w:history="1">
             <w:r>
               <w:rPr>
                 <w:rStyle w:val="Hyperlink"/>
@@ -840,7 +855,7 @@
                 <w:noProof/>
                 <w:webHidden/>
               </w:rPr>
-              <w:instrText xml:space="preserve"> PAGEREF _Toc151983258 \h </w:instrText>
+              <w:instrText xml:space="preserve"> PAGEREF _Toc193706974 \h </w:instrText>
             </w:r>
             <w:r>
               <w:rPr>
@@ -882,9 +897,10 @@
               <w:noProof/>
               <w:sz w:val="24"/>
               <w:szCs w:val="24"/>
+              <w:lang w:val="en-IN" w:eastAsia="en-IN"/>
             </w:rPr>
           </w:pPr>
-          <w:hyperlink w:anchor="_Toc151983259" w:history="1">
+          <w:hyperlink w:anchor="_Toc193706975" w:history="1">
             <w:r>
               <w:rPr>
                 <w:rStyle w:val="Hyperlink"/>
@@ -911,7 +927,7 @@
                 <w:noProof/>
                 <w:webHidden/>
               </w:rPr>
-              <w:instrText xml:space="preserve"> PAGEREF _Toc151983259 \h </w:instrText>
+              <w:instrText xml:space="preserve"> PAGEREF _Toc193706975 \h </w:instrText>
             </w:r>
             <w:r>
               <w:rPr>
@@ -943,6 +959,150 @@
           </w:hyperlink>
         </w:p>
         <w:p>
+          <w:pPr>
+            <w:pStyle w:val="TOC1"/>
+            <w:tabs>
+              <w:tab w:val="right" w:leader="dot" w:pos="9350"/>
+            </w:tabs>
+            <w:rPr>
+              <w:rFonts w:eastAsiaTheme="minorEastAsia"/>
+              <w:noProof/>
+              <w:sz w:val="24"/>
+              <w:szCs w:val="24"/>
+              <w:lang w:val="en-IN" w:eastAsia="en-IN"/>
+            </w:rPr>
+          </w:pPr>
+          <w:hyperlink w:anchor="_Toc193706976" w:history="1">
+            <w:r>
+              <w:rPr>
+                <w:rStyle w:val="Hyperlink"/>
+                <w:noProof/>
+              </w:rPr>
+              <w:t>Full FW Rollback Flow</w:t>
+            </w:r>
+            <w:r>
+              <w:rPr>
+                <w:noProof/>
+                <w:webHidden/>
+              </w:rPr>
+              <w:tab/>
+            </w:r>
+            <w:r>
+              <w:rPr>
+                <w:noProof/>
+                <w:webHidden/>
+              </w:rPr>
+              <w:fldChar w:fldCharType="begin"/>
+            </w:r>
+            <w:r>
+              <w:rPr>
+                <w:noProof/>
+                <w:webHidden/>
+              </w:rPr>
+              <w:instrText xml:space="preserve"> PAGEREF _Toc193706976 \h </w:instrText>
+            </w:r>
+            <w:r>
+              <w:rPr>
+                <w:noProof/>
+                <w:webHidden/>
+              </w:rPr>
+            </w:r>
+            <w:r>
+              <w:rPr>
+                <w:noProof/>
+                <w:webHidden/>
+              </w:rPr>
+              <w:fldChar w:fldCharType="separate"/>
+            </w:r>
+            <w:r>
+              <w:rPr>
+                <w:noProof/>
+                <w:webHidden/>
+              </w:rPr>
+              <w:t>5</w:t>
+            </w:r>
+            <w:r>
+              <w:rPr>
+                <w:noProof/>
+                <w:webHidden/>
+              </w:rPr>
+              <w:fldChar w:fldCharType="end"/>
+            </w:r>
+          </w:hyperlink>
+        </w:p>
+        <w:p>
+          <w:pPr>
+            <w:pStyle w:val="TOC1"/>
+            <w:tabs>
+              <w:tab w:val="right" w:leader="dot" w:pos="9350"/>
+            </w:tabs>
+            <w:rPr>
+              <w:rFonts w:eastAsiaTheme="minorEastAsia"/>
+              <w:noProof/>
+              <w:sz w:val="24"/>
+              <w:szCs w:val="24"/>
+              <w:lang w:val="en-IN" w:eastAsia="en-IN"/>
+            </w:rPr>
+          </w:pPr>
+          <w:hyperlink w:anchor="_Toc193706977" w:history="1">
+            <w:r>
+              <w:rPr>
+                <w:rStyle w:val="Hyperlink"/>
+                <w:noProof/>
+              </w:rPr>
+              <w:t>CTAM Documentation Guide</w:t>
+            </w:r>
+            <w:r>
+              <w:rPr>
+                <w:noProof/>
+                <w:webHidden/>
+              </w:rPr>
+              <w:tab/>
+            </w:r>
+            <w:r>
+              <w:rPr>
+                <w:noProof/>
+                <w:webHidden/>
+              </w:rPr>
+              <w:fldChar w:fldCharType="begin"/>
+            </w:r>
+            <w:r>
+              <w:rPr>
+                <w:noProof/>
+                <w:webHidden/>
+              </w:rPr>
+              <w:instrText xml:space="preserve"> PAGEREF _Toc193706977 \h </w:instrText>
+            </w:r>
+            <w:r>
+              <w:rPr>
+                <w:noProof/>
+                <w:webHidden/>
+              </w:rPr>
+            </w:r>
+            <w:r>
+              <w:rPr>
+                <w:noProof/>
+                <w:webHidden/>
+              </w:rPr>
+              <w:fldChar w:fldCharType="separate"/>
+            </w:r>
+            <w:r>
+              <w:rPr>
+                <w:noProof/>
+                <w:webHidden/>
+              </w:rPr>
+              <w:t>6</w:t>
+            </w:r>
+            <w:r>
+              <w:rPr>
+                <w:noProof/>
+                <w:webHidden/>
+              </w:rPr>
+              <w:fldChar w:fldCharType="end"/>
+            </w:r>
+          </w:hyperlink>
+        </w:p>
+        <w:p>
           <w:r>
             <w:rPr>
               <w:b/>
@@ -1002,7 +1162,7 @@
           <w:rFonts w:ascii="Calibri" w:hAnsi="Calibri" w:cs="Calibri"/>
         </w:rPr>
       </w:pPr>
-      <w:bookmarkStart w:id="1" w:name="_Toc151983250"/>
+      <w:bookmarkStart w:id="1" w:name="_Toc193706966"/>
       <w:r>
         <w:rPr>
           <w:rFonts w:ascii="Calibri" w:hAnsi="Calibri" w:cs="Calibri"/>
@@ -1211,7 +1371,7 @@
           <w:rFonts w:ascii="Calibri" w:hAnsi="Calibri" w:cs="Calibri"/>
         </w:rPr>
       </w:pPr>
-      <w:bookmarkStart w:id="2" w:name="_Toc151983251"/>
+      <w:bookmarkStart w:id="2" w:name="_Toc193706967"/>
       <w:r>
         <w:rPr>
           <w:rFonts w:ascii="Calibri" w:hAnsi="Calibri" w:cs="Calibri"/>
@@ -1231,7 +1391,7 @@
           <w:rFonts w:ascii="Calibri" w:hAnsi="Calibri" w:cs="Calibri"/>
         </w:rPr>
       </w:pPr>
-      <w:bookmarkStart w:id="3" w:name="_Toc151983252"/>
+      <w:bookmarkStart w:id="3" w:name="_Toc193706968"/>
       <w:r>
         <w:rPr>
           <w:rFonts w:ascii="Calibri" w:hAnsi="Calibri" w:cs="Calibri"/>
@@ -1358,7 +1518,7 @@
           <w:rFonts w:ascii="Calibri" w:hAnsi="Calibri" w:cs="Calibri"/>
         </w:rPr>
       </w:pPr>
-      <w:bookmarkStart w:id="4" w:name="_Toc151983253"/>
+      <w:bookmarkStart w:id="4" w:name="_Toc193706969"/>
       <w:r>
         <w:rPr>
           <w:rFonts w:ascii="Calibri" w:hAnsi="Calibri" w:cs="Calibri"/>
@@ -1719,7 +1879,7 @@
           <w:numId w:val="2"/>
         </w:numPr>
       </w:pPr>
-      <w:bookmarkStart w:id="5" w:name="_Toc151983254"/>
+      <w:bookmarkStart w:id="5" w:name="_Toc193706970"/>
       <w:r>
         <w:lastRenderedPageBreak/>
         <w:t>Discover Test Cases</w:t>
@@ -2605,22 +2765,8 @@
           <w:szCs w:val="24"/>
           <w14:ligatures w14:val="none"/>
         </w:rPr>
-        <w:t xml:space="preserve"> -</w:t>
-      </w:r>
-      <w:proofErr w:type="gramStart"/>
-      <w:r>
-        <w:rPr>
-          <w:rFonts w:ascii="Calibri" w:eastAsia="Times New Roman" w:hAnsi="Calibri" w:cs="Calibri"/>
-          <w:b/>
-          <w:bCs/>
-          <w:kern w:val="0"/>
-          <w:sz w:val="24"/>
-          <w:szCs w:val="24"/>
-          <w14:ligatures w14:val="none"/>
-        </w:rPr>
-        <w:t>l</w:t>
-      </w:r>
-      <w:proofErr w:type="gramEnd"/>
+        <w:t xml:space="preserve"> -l</w:t>
+      </w:r>
     </w:p>
     <w:p>
       <w:pPr>
@@ -2633,7 +2779,7 @@
           <w:rFonts w:eastAsia="Times New Roman"/>
         </w:rPr>
       </w:pPr>
-      <w:bookmarkStart w:id="6" w:name="_Toc151983255"/>
+      <w:bookmarkStart w:id="6" w:name="_Toc193706971"/>
       <w:r>
         <w:rPr>
           <w:rFonts w:eastAsia="Times New Roman"/>
@@ -2693,7 +2839,43 @@
           <w:sz w:val="22"/>
           <w:szCs w:val="22"/>
         </w:rPr>
-        <w:t xml:space="preserve">To run anything we need this properties in </w:t>
+        <w:t xml:space="preserve">To run </w:t>
+      </w:r>
+      <w:proofErr w:type="gramStart"/>
+      <w:r>
+        <w:rPr>
+          <w:rFonts w:ascii="Calibri" w:hAnsi="Calibri" w:cs="Calibri"/>
+          <w:sz w:val="22"/>
+          <w:szCs w:val="22"/>
+        </w:rPr>
+        <w:t>anything</w:t>
+      </w:r>
+      <w:proofErr w:type="gramEnd"/>
+      <w:r>
+        <w:rPr>
+          <w:rFonts w:ascii="Calibri" w:hAnsi="Calibri" w:cs="Calibri"/>
+          <w:sz w:val="22"/>
+          <w:szCs w:val="22"/>
+        </w:rPr>
+        <w:t xml:space="preserve"> we need </w:t>
+      </w:r>
+      <w:proofErr w:type="gramStart"/>
+      <w:r>
+        <w:rPr>
+          <w:rFonts w:ascii="Calibri" w:hAnsi="Calibri" w:cs="Calibri"/>
+          <w:sz w:val="22"/>
+          <w:szCs w:val="22"/>
+        </w:rPr>
+        <w:t>this properties</w:t>
+      </w:r>
+      <w:proofErr w:type="gramEnd"/>
+      <w:r>
+        <w:rPr>
+          <w:rFonts w:ascii="Calibri" w:hAnsi="Calibri" w:cs="Calibri"/>
+          <w:sz w:val="22"/>
+          <w:szCs w:val="22"/>
+        </w:rPr>
+        <w:t xml:space="preserve"> in </w:t>
       </w:r>
       <w:proofErr w:type="spellStart"/>
       <w:r>
@@ -3434,7 +3616,6 @@
         <w:t>DefaultPrefix</w:t>
       </w:r>
       <w:proofErr w:type="spellEnd"/>
-      <w:proofErr w:type="gramEnd"/>
       <w:r>
         <w:rPr>
           <w:rFonts w:ascii="Consolas" w:eastAsia="Times New Roman" w:hAnsi="Consolas" w:cs="Calibri"/>
@@ -3457,6 +3638,7 @@
         </w:rPr>
         <w:t>: {</w:t>
       </w:r>
+      <w:proofErr w:type="gramEnd"/>
     </w:p>
     <w:p>
       <w:pPr>
@@ -4599,20 +4781,8 @@
           <w:kern w:val="0"/>
           <w14:ligatures w14:val="none"/>
         </w:rPr>
-        <w:t>&gt; -</w:t>
-      </w:r>
-      <w:proofErr w:type="gramStart"/>
-      <w:r>
-        <w:rPr>
-          <w:rFonts w:ascii="Calibri" w:eastAsia="Times New Roman" w:hAnsi="Calibri" w:cs="Calibri"/>
-          <w:b/>
-          <w:bCs/>
-          <w:kern w:val="0"/>
-          <w14:ligatures w14:val="none"/>
-        </w:rPr>
-        <w:t>d</w:t>
-      </w:r>
-      <w:proofErr w:type="gramEnd"/>
+        <w:t>&gt; -d</w:t>
+      </w:r>
     </w:p>
     <w:p>
       <w:pPr>
@@ -4647,7 +4817,7 @@
           <w:numId w:val="2"/>
         </w:numPr>
       </w:pPr>
-      <w:bookmarkStart w:id="7" w:name="_Toc151983256"/>
+      <w:bookmarkStart w:id="7" w:name="_Toc193706972"/>
       <w:r>
         <w:t>Basic Test Cases</w:t>
       </w:r>
@@ -5602,7 +5772,7 @@
       <w:pPr>
         <w:pStyle w:val="Heading1"/>
       </w:pPr>
-      <w:bookmarkStart w:id="8" w:name="_Toc151983257"/>
+      <w:bookmarkStart w:id="8" w:name="_Toc193706973"/>
       <w:r>
         <w:t>Enable &amp; Verify AC Cycle Test Case</w:t>
       </w:r>
@@ -5647,7 +5817,43 @@
           <w:sz w:val="22"/>
           <w:szCs w:val="22"/>
         </w:rPr>
-        <w:t xml:space="preserve">To run the below test case we need this properties in </w:t>
+        <w:t xml:space="preserve">To run the below test </w:t>
+      </w:r>
+      <w:proofErr w:type="gramStart"/>
+      <w:r>
+        <w:rPr>
+          <w:rFonts w:ascii="Calibri" w:hAnsi="Calibri" w:cs="Calibri"/>
+          <w:sz w:val="22"/>
+          <w:szCs w:val="22"/>
+        </w:rPr>
+        <w:t>case</w:t>
+      </w:r>
+      <w:proofErr w:type="gramEnd"/>
+      <w:r>
+        <w:rPr>
+          <w:rFonts w:ascii="Calibri" w:hAnsi="Calibri" w:cs="Calibri"/>
+          <w:sz w:val="22"/>
+          <w:szCs w:val="22"/>
+        </w:rPr>
+        <w:t xml:space="preserve"> we need </w:t>
+      </w:r>
+      <w:proofErr w:type="gramStart"/>
+      <w:r>
+        <w:rPr>
+          <w:rFonts w:ascii="Calibri" w:hAnsi="Calibri" w:cs="Calibri"/>
+          <w:sz w:val="22"/>
+          <w:szCs w:val="22"/>
+        </w:rPr>
+        <w:t>this properties</w:t>
+      </w:r>
+      <w:proofErr w:type="gramEnd"/>
+      <w:r>
+        <w:rPr>
+          <w:rFonts w:ascii="Calibri" w:hAnsi="Calibri" w:cs="Calibri"/>
+          <w:sz w:val="22"/>
+          <w:szCs w:val="22"/>
+        </w:rPr>
+        <w:t xml:space="preserve"> in </w:t>
       </w:r>
       <w:proofErr w:type="spellStart"/>
       <w:r>
@@ -6107,7 +6313,7 @@
       <w:pPr>
         <w:pStyle w:val="Heading1"/>
       </w:pPr>
-      <w:bookmarkStart w:id="9" w:name="_Toc151983258"/>
+      <w:bookmarkStart w:id="9" w:name="_Toc193706974"/>
       <w:r>
         <w:lastRenderedPageBreak/>
         <w:t>Execute Service Validator</w:t>
@@ -6587,7 +6793,7 @@
       <w:pPr>
         <w:pStyle w:val="Heading1"/>
       </w:pPr>
-      <w:bookmarkStart w:id="10" w:name="_Toc151983259"/>
+      <w:bookmarkStart w:id="10" w:name="_Toc193706975"/>
       <w:r>
         <w:t>Full FW Update Flow</w:t>
       </w:r>
@@ -6602,7 +6808,15 @@
         </w:numPr>
       </w:pPr>
       <w:r>
-        <w:t xml:space="preserve">For running firmware update test cases we need additional configuration file which is </w:t>
+        <w:t xml:space="preserve">For running </w:t>
+      </w:r>
+      <w:proofErr w:type="gramStart"/>
+      <w:r>
+        <w:t>firmware update test cases</w:t>
+      </w:r>
+      <w:proofErr w:type="gramEnd"/>
+      <w:r>
+        <w:t xml:space="preserve"> we need additional configuration file which is </w:t>
       </w:r>
       <w:proofErr w:type="spellStart"/>
       <w:r>
@@ -7551,7 +7765,25 @@
           <w:kern w:val="0"/>
           <w14:ligatures w14:val="none"/>
         </w:rPr>
-        <w:t xml:space="preserve"> we need to verify that if the firmware is updated correctly or not. If verified, then test case passed else fail</w:t>
+        <w:t xml:space="preserve"> we need to </w:t>
+      </w:r>
+      <w:proofErr w:type="gramStart"/>
+      <w:r>
+        <w:rPr>
+          <w:rFonts w:ascii="Calibri" w:eastAsia="Times New Roman" w:hAnsi="Calibri" w:cs="Calibri"/>
+          <w:kern w:val="0"/>
+          <w14:ligatures w14:val="none"/>
+        </w:rPr>
+        <w:t>verify that</w:t>
+      </w:r>
+      <w:proofErr w:type="gramEnd"/>
+      <w:r>
+        <w:rPr>
+          <w:rFonts w:ascii="Calibri" w:eastAsia="Times New Roman" w:hAnsi="Calibri" w:cs="Calibri"/>
+          <w:kern w:val="0"/>
+          <w14:ligatures w14:val="none"/>
+        </w:rPr>
+        <w:t xml:space="preserve"> if the firmware is updated correctly or not. If verified, then test case passed else fail</w:t>
       </w:r>
       <w:r>
         <w:rPr>
@@ -7899,9 +8131,11 @@
       <w:pPr>
         <w:pStyle w:val="Heading1"/>
       </w:pPr>
+      <w:bookmarkStart w:id="11" w:name="_Toc193706976"/>
       <w:r>
         <w:t>Full FW Rollback Flow</w:t>
       </w:r>
+      <w:bookmarkEnd w:id="11"/>
     </w:p>
     <w:p>
       <w:pPr>
@@ -7912,7 +8146,15 @@
         </w:numPr>
       </w:pPr>
       <w:r>
-        <w:t xml:space="preserve">For running firmware update test cases we need additional configuration file which is </w:t>
+        <w:t xml:space="preserve">For running </w:t>
+      </w:r>
+      <w:proofErr w:type="gramStart"/>
+      <w:r>
+        <w:t>firmware update test cases</w:t>
+      </w:r>
+      <w:proofErr w:type="gramEnd"/>
+      <w:r>
+        <w:t xml:space="preserve"> we need additional configuration file which is </w:t>
       </w:r>
       <w:proofErr w:type="spellStart"/>
       <w:r>
@@ -9216,14 +9458,158 @@
         <w:t>0</w:t>
       </w:r>
     </w:p>
+    <w:p/>
+    <w:p>
+      <w:pPr>
+        <w:pStyle w:val="Heading1"/>
+      </w:pPr>
+      <w:bookmarkStart w:id="12" w:name="_Toc193706520"/>
+      <w:bookmarkStart w:id="13" w:name="_Toc193706977"/>
+      <w:r>
+        <w:t xml:space="preserve">CTAM </w:t>
+      </w:r>
+      <w:r>
+        <w:t>Documentation</w:t>
+      </w:r>
+      <w:r>
+        <w:t xml:space="preserve"> Guide</w:t>
+      </w:r>
+      <w:bookmarkEnd w:id="12"/>
+      <w:bookmarkEnd w:id="13"/>
+    </w:p>
+    <w:p>
+      <w:pPr>
+        <w:rPr>
+          <w:lang w:val="en-IN"/>
+        </w:rPr>
+      </w:pPr>
+      <w:r>
+        <w:rPr>
+          <w:lang w:val="en-IN"/>
+        </w:rPr>
+        <w:t xml:space="preserve">CTAM </w:t>
+      </w:r>
+      <w:r>
+        <w:rPr>
+          <w:lang w:val="en-IN"/>
+        </w:rPr>
+        <w:t>documentation provides a comprehensive overview of CTAM, including architecture details, test scenarios, and usage instructions.</w:t>
+      </w:r>
+    </w:p>
+    <w:p>
+      <w:pPr>
+        <w:rPr>
+          <w:b/>
+          <w:bCs/>
+          <w:lang w:val="en-IN"/>
+        </w:rPr>
+      </w:pPr>
+      <w:r>
+        <w:rPr>
+          <w:b/>
+          <w:bCs/>
+          <w:lang w:val="en-IN"/>
+        </w:rPr>
+        <w:t>How to Create and View Documentation</w:t>
+      </w:r>
+    </w:p>
     <w:p>
       <w:pPr>
         <w:pStyle w:val="ListParagraph"/>
         <w:numPr>
           <w:ilvl w:val="0"/>
-          <w:numId w:val="35"/>
+          <w:numId w:val="37"/>
         </w:numPr>
-      </w:pPr>
+        <w:rPr>
+          <w:lang w:val="en-IN"/>
+        </w:rPr>
+      </w:pPr>
+      <w:r>
+        <w:rPr>
+          <w:lang w:val="en-IN"/>
+        </w:rPr>
+        <w:t xml:space="preserve">For setup and to generate the documentation, please refer to the </w:t>
+      </w:r>
+      <w:r>
+        <w:rPr>
+          <w:b/>
+          <w:bCs/>
+          <w:lang w:val="en-IN"/>
+        </w:rPr>
+        <w:t>README</w:t>
+      </w:r>
+      <w:r>
+        <w:rPr>
+          <w:lang w:val="en-IN"/>
+        </w:rPr>
+        <w:t xml:space="preserve"> file in the repository. It contains detailed steps for configuring and building the documentation.</w:t>
+      </w:r>
+    </w:p>
+    <w:p>
+      <w:pPr>
+        <w:pStyle w:val="ListParagraph"/>
+        <w:rPr>
+          <w:lang w:val="en-IN"/>
+        </w:rPr>
+      </w:pPr>
+    </w:p>
+    <w:p>
+      <w:pPr>
+        <w:pStyle w:val="ListParagraph"/>
+        <w:numPr>
+          <w:ilvl w:val="0"/>
+          <w:numId w:val="37"/>
+        </w:numPr>
+        <w:rPr>
+          <w:lang w:val="en-IN"/>
+        </w:rPr>
+      </w:pPr>
+      <w:r>
+        <w:rPr>
+          <w:lang w:val="en-IN"/>
+        </w:rPr>
+        <w:t>Once the documentation setup is complete, you can access the full technical documentation, including architecture and test scenarios, at:</w:t>
+      </w:r>
+    </w:p>
+    <w:p>
+      <w:pPr>
+        <w:pStyle w:val="ListParagraph"/>
+        <w:numPr>
+          <w:ilvl w:val="0"/>
+          <w:numId w:val="38"/>
+        </w:numPr>
+        <w:rPr>
+          <w:b/>
+          <w:bCs/>
+          <w:lang w:val="en-IN"/>
+        </w:rPr>
+      </w:pPr>
+      <w:r>
+        <w:rPr>
+          <w:b/>
+          <w:bCs/>
+          <w:lang w:val="en-IN"/>
+        </w:rPr>
+        <w:t>&lt;CTAM_REPO_PATH&gt;/</w:t>
+      </w:r>
+      <w:proofErr w:type="spellStart"/>
+      <w:r>
+        <w:rPr>
+          <w:b/>
+          <w:bCs/>
+          <w:lang w:val="en-IN"/>
+        </w:rPr>
+        <w:t>ocp-diag-ctam</w:t>
+      </w:r>
+      <w:proofErr w:type="spellEnd"/>
+      <w:r>
+        <w:rPr>
+          <w:b/>
+          <w:bCs/>
+          <w:lang w:val="en-IN"/>
+        </w:rPr>
+        <w:t>/docs/build/html/index.html</w:t>
+      </w:r>
     </w:p>
     <w:sectPr>
       <w:footerReference w:type="default" r:id="rId14"/>
@@ -9237,7 +9623,7 @@
 </file>
 
 <file path=word/endnotes.xml><?xml version="1.0" encoding="utf-8"?>
-<w:endnotes xmlns:wpc="http://schemas.microsoft.com/office/word/2010/wordprocessingCanvas" xmlns:cx="http://schemas.microsoft.com/office/drawing/2014/chartex" xmlns:cx1="http://schemas.microsoft.com/office/drawing/2015/9/8/chartex" xmlns:cx2="http://schemas.microsoft.com/office/drawing/2015/10/21/chartex" xmlns:cx3="http://schemas.microsoft.com/office/drawing/2016/5/9/chartex" xmlns:cx4="http://schemas.microsoft.com/office/drawing/2016/5/10/chartex" xmlns:cx5="http://schemas.microsoft.com/office/drawing/2016/5/11/chartex" xmlns:cx6="http://schemas.microsoft.com/office/drawing/2016/5/12/chartex" xmlns:cx7="http://schemas.microsoft.com/office/drawing/2016/5/13/chartex" xmlns:cx8="http://schemas.microsoft.com/office/drawing/2016/5/14/chartex" xmlns:mc="http://schemas.openxmlformats.org/markup-compatibility/2006" xmlns:aink="http://schemas.microsoft.com/office/drawing/2016/ink" xmlns:am3d="http://schemas.microsoft.com/office/drawing/2017/model3d" xmlns:o="urn:schemas-microsoft-com:office:office" xmlns:oel="http://schemas.microsoft.com/office/2019/extlst" xmlns:r="http://schemas.openxmlformats.org/officeDocument/2006/relationships" xmlns:m="http://schemas.openxmlformats.org/officeDocument/2006/math" xmlns:v="urn:schemas-microsoft-com:vml" xmlns:wp14="http://schemas.microsoft.com/office/word/2010/wordprocessingDrawing" xmlns:wp="http://schemas.openxmlformats.org/drawingml/2006/wordprocessingDrawing" xmlns:w10="urn:schemas-microsoft-com:office:word" xmlns:w="http://schemas.openxmlformats.org/wordprocessingml/2006/main" xmlns:w14="http://schemas.microsoft.com/office/word/2010/wordml" xmlns:w15="http://schemas.microsoft.com/office/word/2012/wordml" xmlns:w16cex="http://schemas.microsoft.com/office/word/2018/wordml/cex" xmlns:w16cid="http://schemas.microsoft.com/office/word/2016/wordml/cid" xmlns:w16="http://schemas.microsoft.com/office/word/2018/wordml" xmlns:w16sdtdh="http://schemas.microsoft.com/office/word/2020/wordml/sdtdatahash" xmlns:w16se="http://schemas.microsoft.com/office/word/2015/wordml/symex" xmlns:wpg="http://schemas.microsoft.com/office/word/2010/wordprocessingGroup" xmlns:wpi="http://schemas.microsoft.com/office/word/2010/wordprocessingInk" xmlns:wne="http://schemas.microsoft.com/office/word/2006/wordml" xmlns:wps="http://schemas.microsoft.com/office/word/2010/wordprocessingShape" mc:Ignorable="w14 w15 w16se w16cid w16 w16cex w16sdtdh wp14">
+<w:endnotes xmlns:wpc="http://schemas.microsoft.com/office/word/2010/wordprocessingCanvas" xmlns:cx="http://schemas.microsoft.com/office/drawing/2014/chartex" xmlns:cx1="http://schemas.microsoft.com/office/drawing/2015/9/8/chartex" xmlns:cx2="http://schemas.microsoft.com/office/drawing/2015/10/21/chartex" xmlns:cx3="http://schemas.microsoft.com/office/drawing/2016/5/9/chartex" xmlns:cx4="http://schemas.microsoft.com/office/drawing/2016/5/10/chartex" xmlns:cx5="http://schemas.microsoft.com/office/drawing/2016/5/11/chartex" xmlns:cx6="http://schemas.microsoft.com/office/drawing/2016/5/12/chartex" xmlns:cx7="http://schemas.microsoft.com/office/drawing/2016/5/13/chartex" xmlns:cx8="http://schemas.microsoft.com/office/drawing/2016/5/14/chartex" xmlns:mc="http://schemas.openxmlformats.org/markup-compatibility/2006" xmlns:aink="http://schemas.microsoft.com/office/drawing/2016/ink" xmlns:am3d="http://schemas.microsoft.com/office/drawing/2017/model3d" xmlns:o="urn:schemas-microsoft-com:office:office" xmlns:oel="http://schemas.microsoft.com/office/2019/extlst" xmlns:r="http://schemas.openxmlformats.org/officeDocument/2006/relationships" xmlns:m="http://schemas.openxmlformats.org/officeDocument/2006/math" xmlns:v="urn:schemas-microsoft-com:vml" xmlns:wp14="http://schemas.microsoft.com/office/word/2010/wordprocessingDrawing" xmlns:wp="http://schemas.openxmlformats.org/drawingml/2006/wordprocessingDrawing" xmlns:w10="urn:schemas-microsoft-com:office:word" xmlns:w="http://schemas.openxmlformats.org/wordprocessingml/2006/main" xmlns:w14="http://schemas.microsoft.com/office/word/2010/wordml" xmlns:w15="http://schemas.microsoft.com/office/word/2012/wordml" xmlns:w16cex="http://schemas.microsoft.com/office/word/2018/wordml/cex" xmlns:w16cid="http://schemas.microsoft.com/office/word/2016/wordml/cid" xmlns:w16="http://schemas.microsoft.com/office/word/2018/wordml" xmlns:w16du="http://schemas.microsoft.com/office/word/2023/wordml/word16du" xmlns:w16sdtdh="http://schemas.microsoft.com/office/word/2020/wordml/sdtdatahash" xmlns:w16sdtfl="http://schemas.microsoft.com/office/word/2024/wordml/sdtformatlock" xmlns:w16se="http://schemas.microsoft.com/office/word/2015/wordml/symex" xmlns:wpg="http://schemas.microsoft.com/office/word/2010/wordprocessingGroup" xmlns:wpi="http://schemas.microsoft.com/office/word/2010/wordprocessingInk" xmlns:wne="http://schemas.microsoft.com/office/word/2006/wordml" xmlns:wps="http://schemas.microsoft.com/office/word/2010/wordprocessingShape" mc:Ignorable="w14 w15 w16se w16cid w16 w16cex w16sdtdh w16sdtfl w16du wp14">
   <w:endnote w:type="separator" w:id="-1">
     <w:p>
       <w:pPr>
@@ -9262,7 +9648,7 @@
 </file>
 
 <file path=word/footer1.xml><?xml version="1.0" encoding="utf-8"?>
-<w:ftr xmlns:wpc="http://schemas.microsoft.com/office/word/2010/wordprocessingCanvas" xmlns:cx="http://schemas.microsoft.com/office/drawing/2014/chartex" xmlns:cx1="http://schemas.microsoft.com/office/drawing/2015/9/8/chartex" xmlns:cx2="http://schemas.microsoft.com/office/drawing/2015/10/21/chartex" xmlns:cx3="http://schemas.microsoft.com/office/drawing/2016/5/9/chartex" xmlns:cx4="http://schemas.microsoft.com/office/drawing/2016/5/10/chartex" xmlns:cx5="http://schemas.microsoft.com/office/drawing/2016/5/11/chartex" xmlns:cx6="http://schemas.microsoft.com/office/drawing/2016/5/12/chartex" xmlns:cx7="http://schemas.microsoft.com/office/drawing/2016/5/13/chartex" xmlns:cx8="http://schemas.microsoft.com/office/drawing/2016/5/14/chartex" xmlns:mc="http://schemas.openxmlformats.org/markup-compatibility/2006" xmlns:aink="http://schemas.microsoft.com/office/drawing/2016/ink" xmlns:am3d="http://schemas.microsoft.com/office/drawing/2017/model3d" xmlns:o="urn:schemas-microsoft-com:office:office" xmlns:oel="http://schemas.microsoft.com/office/2019/extlst" xmlns:r="http://schemas.openxmlformats.org/officeDocument/2006/relationships" xmlns:m="http://schemas.openxmlformats.org/officeDocument/2006/math" xmlns:v="urn:schemas-microsoft-com:vml" xmlns:wp14="http://schemas.microsoft.com/office/word/2010/wordprocessingDrawing" xmlns:wp="http://schemas.openxmlformats.org/drawingml/2006/wordprocessingDrawing" xmlns:w10="urn:schemas-microsoft-com:office:word" xmlns:w="http://schemas.openxmlformats.org/wordprocessingml/2006/main" xmlns:w14="http://schemas.microsoft.com/office/word/2010/wordml" xmlns:w15="http://schemas.microsoft.com/office/word/2012/wordml" xmlns:w16cex="http://schemas.microsoft.com/office/word/2018/wordml/cex" xmlns:w16cid="http://schemas.microsoft.com/office/word/2016/wordml/cid" xmlns:w16="http://schemas.microsoft.com/office/word/2018/wordml" xmlns:w16sdtdh="http://schemas.microsoft.com/office/word/2020/wordml/sdtdatahash" xmlns:w16se="http://schemas.microsoft.com/office/word/2015/wordml/symex" xmlns:wpg="http://schemas.microsoft.com/office/word/2010/wordprocessingGroup" xmlns:wpi="http://schemas.microsoft.com/office/word/2010/wordprocessingInk" xmlns:wne="http://schemas.microsoft.com/office/word/2006/wordml" xmlns:wps="http://schemas.microsoft.com/office/word/2010/wordprocessingShape" mc:Ignorable="w14 w15 w16se w16cid w16 w16cex w16sdtdh wp14">
+<w:ftr xmlns:wpc="http://schemas.microsoft.com/office/word/2010/wordprocessingCanvas" xmlns:cx="http://schemas.microsoft.com/office/drawing/2014/chartex" xmlns:cx1="http://schemas.microsoft.com/office/drawing/2015/9/8/chartex" xmlns:cx2="http://schemas.microsoft.com/office/drawing/2015/10/21/chartex" xmlns:cx3="http://schemas.microsoft.com/office/drawing/2016/5/9/chartex" xmlns:cx4="http://schemas.microsoft.com/office/drawing/2016/5/10/chartex" xmlns:cx5="http://schemas.microsoft.com/office/drawing/2016/5/11/chartex" xmlns:cx6="http://schemas.microsoft.com/office/drawing/2016/5/12/chartex" xmlns:cx7="http://schemas.microsoft.com/office/drawing/2016/5/13/chartex" xmlns:cx8="http://schemas.microsoft.com/office/drawing/2016/5/14/chartex" xmlns:mc="http://schemas.openxmlformats.org/markup-compatibility/2006" xmlns:aink="http://schemas.microsoft.com/office/drawing/2016/ink" xmlns:am3d="http://schemas.microsoft.com/office/drawing/2017/model3d" xmlns:o="urn:schemas-microsoft-com:office:office" xmlns:oel="http://schemas.microsoft.com/office/2019/extlst" xmlns:r="http://schemas.openxmlformats.org/officeDocument/2006/relationships" xmlns:m="http://schemas.openxmlformats.org/officeDocument/2006/math" xmlns:v="urn:schemas-microsoft-com:vml" xmlns:wp14="http://schemas.microsoft.com/office/word/2010/wordprocessingDrawing" xmlns:wp="http://schemas.openxmlformats.org/drawingml/2006/wordprocessingDrawing" xmlns:w10="urn:schemas-microsoft-com:office:word" xmlns:w="http://schemas.openxmlformats.org/wordprocessingml/2006/main" xmlns:w14="http://schemas.microsoft.com/office/word/2010/wordml" xmlns:w15="http://schemas.microsoft.com/office/word/2012/wordml" xmlns:w16cex="http://schemas.microsoft.com/office/word/2018/wordml/cex" xmlns:w16cid="http://schemas.microsoft.com/office/word/2016/wordml/cid" xmlns:w16="http://schemas.microsoft.com/office/word/2018/wordml" xmlns:w16du="http://schemas.microsoft.com/office/word/2023/wordml/word16du" xmlns:w16sdtdh="http://schemas.microsoft.com/office/word/2020/wordml/sdtdatahash" xmlns:w16sdtfl="http://schemas.microsoft.com/office/word/2024/wordml/sdtformatlock" xmlns:w16se="http://schemas.microsoft.com/office/word/2015/wordml/symex" xmlns:wpg="http://schemas.microsoft.com/office/word/2010/wordprocessingGroup" xmlns:wpi="http://schemas.microsoft.com/office/word/2010/wordprocessingInk" xmlns:wne="http://schemas.microsoft.com/office/word/2006/wordml" xmlns:wps="http://schemas.microsoft.com/office/word/2010/wordprocessingShape" mc:Ignorable="w14 w15 w16se w16cid w16 w16cex w16sdtdh w16sdtfl w16du wp14">
   <w:sdt>
     <w:sdtPr>
       <w:id w:val="968781475"/>
@@ -9329,7 +9715,7 @@
 </file>
 
 <file path=word/footnotes.xml><?xml version="1.0" encoding="utf-8"?>
-<w:footnotes xmlns:wpc="http://schemas.microsoft.com/office/word/2010/wordprocessingCanvas" xmlns:cx="http://schemas.microsoft.com/office/drawing/2014/chartex" xmlns:cx1="http://schemas.microsoft.com/office/drawing/2015/9/8/chartex" xmlns:cx2="http://schemas.microsoft.com/office/drawing/2015/10/21/chartex" xmlns:cx3="http://schemas.microsoft.com/office/drawing/2016/5/9/chartex" xmlns:cx4="http://schemas.microsoft.com/office/drawing/2016/5/10/chartex" xmlns:cx5="http://schemas.microsoft.com/office/drawing/2016/5/11/chartex" xmlns:cx6="http://schemas.microsoft.com/office/drawing/2016/5/12/chartex" xmlns:cx7="http://schemas.microsoft.com/office/drawing/2016/5/13/chartex" xmlns:cx8="http://schemas.microsoft.com/office/drawing/2016/5/14/chartex" xmlns:mc="http://schemas.openxmlformats.org/markup-compatibility/2006" xmlns:aink="http://schemas.microsoft.com/office/drawing/2016/ink" xmlns:am3d="http://schemas.microsoft.com/office/drawing/2017/model3d" xmlns:o="urn:schemas-microsoft-com:office:office" xmlns:oel="http://schemas.microsoft.com/office/2019/extlst" xmlns:r="http://schemas.openxmlformats.org/officeDocument/2006/relationships" xmlns:m="http://schemas.openxmlformats.org/officeDocument/2006/math" xmlns:v="urn:schemas-microsoft-com:vml" xmlns:wp14="http://schemas.microsoft.com/office/word/2010/wordprocessingDrawing" xmlns:wp="http://schemas.openxmlformats.org/drawingml/2006/wordprocessingDrawing" xmlns:w10="urn:schemas-microsoft-com:office:word" xmlns:w="http://schemas.openxmlformats.org/wordprocessingml/2006/main" xmlns:w14="http://schemas.microsoft.com/office/word/2010/wordml" xmlns:w15="http://schemas.microsoft.com/office/word/2012/wordml" xmlns:w16cex="http://schemas.microsoft.com/office/word/2018/wordml/cex" xmlns:w16cid="http://schemas.microsoft.com/office/word/2016/wordml/cid" xmlns:w16="http://schemas.microsoft.com/office/word/2018/wordml" xmlns:w16sdtdh="http://schemas.microsoft.com/office/word/2020/wordml/sdtdatahash" xmlns:w16se="http://schemas.microsoft.com/office/word/2015/wordml/symex" xmlns:wpg="http://schemas.microsoft.com/office/word/2010/wordprocessingGroup" xmlns:wpi="http://schemas.microsoft.com/office/word/2010/wordprocessingInk" xmlns:wne="http://schemas.microsoft.com/office/word/2006/wordml" xmlns:wps="http://schemas.microsoft.com/office/word/2010/wordprocessingShape" mc:Ignorable="w14 w15 w16se w16cid w16 w16cex w16sdtdh wp14">
+<w:footnotes xmlns:wpc="http://schemas.microsoft.com/office/word/2010/wordprocessingCanvas" xmlns:cx="http://schemas.microsoft.com/office/drawing/2014/chartex" xmlns:cx1="http://schemas.microsoft.com/office/drawing/2015/9/8/chartex" xmlns:cx2="http://schemas.microsoft.com/office/drawing/2015/10/21/chartex" xmlns:cx3="http://schemas.microsoft.com/office/drawing/2016/5/9/chartex" xmlns:cx4="http://schemas.microsoft.com/office/drawing/2016/5/10/chartex" xmlns:cx5="http://schemas.microsoft.com/office/drawing/2016/5/11/chartex" xmlns:cx6="http://schemas.microsoft.com/office/drawing/2016/5/12/chartex" xmlns:cx7="http://schemas.microsoft.com/office/drawing/2016/5/13/chartex" xmlns:cx8="http://schemas.microsoft.com/office/drawing/2016/5/14/chartex" xmlns:mc="http://schemas.openxmlformats.org/markup-compatibility/2006" xmlns:aink="http://schemas.microsoft.com/office/drawing/2016/ink" xmlns:am3d="http://schemas.microsoft.com/office/drawing/2017/model3d" xmlns:o="urn:schemas-microsoft-com:office:office" xmlns:oel="http://schemas.microsoft.com/office/2019/extlst" xmlns:r="http://schemas.openxmlformats.org/officeDocument/2006/relationships" xmlns:m="http://schemas.openxmlformats.org/officeDocument/2006/math" xmlns:v="urn:schemas-microsoft-com:vml" xmlns:wp14="http://schemas.microsoft.com/office/word/2010/wordprocessingDrawing" xmlns:wp="http://schemas.openxmlformats.org/drawingml/2006/wordprocessingDrawing" xmlns:w10="urn:schemas-microsoft-com:office:word" xmlns:w="http://schemas.openxmlformats.org/wordprocessingml/2006/main" xmlns:w14="http://schemas.microsoft.com/office/word/2010/wordml" xmlns:w15="http://schemas.microsoft.com/office/word/2012/wordml" xmlns:w16cex="http://schemas.microsoft.com/office/word/2018/wordml/cex" xmlns:w16cid="http://schemas.microsoft.com/office/word/2016/wordml/cid" xmlns:w16="http://schemas.microsoft.com/office/word/2018/wordml" xmlns:w16du="http://schemas.microsoft.com/office/word/2023/wordml/word16du" xmlns:w16sdtdh="http://schemas.microsoft.com/office/word/2020/wordml/sdtdatahash" xmlns:w16sdtfl="http://schemas.microsoft.com/office/word/2024/wordml/sdtformatlock" xmlns:w16se="http://schemas.microsoft.com/office/word/2015/wordml/symex" xmlns:wpg="http://schemas.microsoft.com/office/word/2010/wordprocessingGroup" xmlns:wpi="http://schemas.microsoft.com/office/word/2010/wordprocessingInk" xmlns:wne="http://schemas.microsoft.com/office/word/2006/wordml" xmlns:wps="http://schemas.microsoft.com/office/word/2010/wordprocessingShape" mc:Ignorable="w14 w15 w16se w16cid w16 w16cex w16sdtdh w16sdtfl w16du wp14">
   <w:footnote w:type="separator" w:id="-1">
     <w:p>
       <w:pPr>
@@ -9354,7 +9740,7 @@
 </file>
 
 <file path=word/numbering.xml><?xml version="1.0" encoding="utf-8"?>
-<w:numbering xmlns:wpc="http://schemas.microsoft.com/office/word/2010/wordprocessingCanvas" xmlns:cx="http://schemas.microsoft.com/office/drawing/2014/chartex" xmlns:cx1="http://schemas.microsoft.com/office/drawing/2015/9/8/chartex" xmlns:cx2="http://schemas.microsoft.com/office/drawing/2015/10/21/chartex" xmlns:cx3="http://schemas.microsoft.com/office/drawing/2016/5/9/chartex" xmlns:cx4="http://schemas.microsoft.com/office/drawing/2016/5/10/chartex" xmlns:cx5="http://schemas.microsoft.com/office/drawing/2016/5/11/chartex" xmlns:cx6="http://schemas.microsoft.com/office/drawing/2016/5/12/chartex" xmlns:cx7="http://schemas.microsoft.com/office/drawing/2016/5/13/chartex" xmlns:cx8="http://schemas.microsoft.com/office/drawing/2016/5/14/chartex" xmlns:mc="http://schemas.openxmlformats.org/markup-compatibility/2006" xmlns:aink="http://schemas.microsoft.com/office/drawing/2016/ink" xmlns:am3d="http://schemas.microsoft.com/office/drawing/2017/model3d" xmlns:o="urn:schemas-microsoft-com:office:office" xmlns:oel="http://schemas.microsoft.com/office/2019/extlst" xmlns:r="http://schemas.openxmlformats.org/officeDocument/2006/relationships" xmlns:m="http://schemas.openxmlformats.org/officeDocument/2006/math" xmlns:v="urn:schemas-microsoft-com:vml" xmlns:wp14="http://schemas.microsoft.com/office/word/2010/wordprocessingDrawing" xmlns:wp="http://schemas.openxmlformats.org/drawingml/2006/wordprocessingDrawing" xmlns:w10="urn:schemas-microsoft-com:office:word" xmlns:w="http://schemas.openxmlformats.org/wordprocessingml/2006/main" xmlns:w14="http://schemas.microsoft.com/office/word/2010/wordml" xmlns:w15="http://schemas.microsoft.com/office/word/2012/wordml" xmlns:w16cex="http://schemas.microsoft.com/office/word/2018/wordml/cex" xmlns:w16cid="http://schemas.microsoft.com/office/word/2016/wordml/cid" xmlns:w16="http://schemas.microsoft.com/office/word/2018/wordml" xmlns:w16sdtdh="http://schemas.microsoft.com/office/word/2020/wordml/sdtdatahash" xmlns:w16se="http://schemas.microsoft.com/office/word/2015/wordml/symex" xmlns:wpg="http://schemas.microsoft.com/office/word/2010/wordprocessingGroup" xmlns:wpi="http://schemas.microsoft.com/office/word/2010/wordprocessingInk" xmlns:wne="http://schemas.microsoft.com/office/word/2006/wordml" xmlns:wps="http://schemas.microsoft.com/office/word/2010/wordprocessingShape" mc:Ignorable="w14 w15 w16se w16cid w16 w16cex w16sdtdh wp14">
+<w:numbering xmlns:wpc="http://schemas.microsoft.com/office/word/2010/wordprocessingCanvas" xmlns:cx="http://schemas.microsoft.com/office/drawing/2014/chartex" xmlns:cx1="http://schemas.microsoft.com/office/drawing/2015/9/8/chartex" xmlns:cx2="http://schemas.microsoft.com/office/drawing/2015/10/21/chartex" xmlns:cx3="http://schemas.microsoft.com/office/drawing/2016/5/9/chartex" xmlns:cx4="http://schemas.microsoft.com/office/drawing/2016/5/10/chartex" xmlns:cx5="http://schemas.microsoft.com/office/drawing/2016/5/11/chartex" xmlns:cx6="http://schemas.microsoft.com/office/drawing/2016/5/12/chartex" xmlns:cx7="http://schemas.microsoft.com/office/drawing/2016/5/13/chartex" xmlns:cx8="http://schemas.microsoft.com/office/drawing/2016/5/14/chartex" xmlns:mc="http://schemas.openxmlformats.org/markup-compatibility/2006" xmlns:aink="http://schemas.microsoft.com/office/drawing/2016/ink" xmlns:am3d="http://schemas.microsoft.com/office/drawing/2017/model3d" xmlns:o="urn:schemas-microsoft-com:office:office" xmlns:oel="http://schemas.microsoft.com/office/2019/extlst" xmlns:r="http://schemas.openxmlformats.org/officeDocument/2006/relationships" xmlns:m="http://schemas.openxmlformats.org/officeDocument/2006/math" xmlns:v="urn:schemas-microsoft-com:vml" xmlns:wp14="http://schemas.microsoft.com/office/word/2010/wordprocessingDrawing" xmlns:wp="http://schemas.openxmlformats.org/drawingml/2006/wordprocessingDrawing" xmlns:w10="urn:schemas-microsoft-com:office:word" xmlns:w="http://schemas.openxmlformats.org/wordprocessingml/2006/main" xmlns:w14="http://schemas.microsoft.com/office/word/2010/wordml" xmlns:w15="http://schemas.microsoft.com/office/word/2012/wordml" xmlns:w16cex="http://schemas.microsoft.com/office/word/2018/wordml/cex" xmlns:w16cid="http://schemas.microsoft.com/office/word/2016/wordml/cid" xmlns:w16="http://schemas.microsoft.com/office/word/2018/wordml" xmlns:w16du="http://schemas.microsoft.com/office/word/2023/wordml/word16du" xmlns:w16sdtdh="http://schemas.microsoft.com/office/word/2020/wordml/sdtdatahash" xmlns:w16sdtfl="http://schemas.microsoft.com/office/word/2024/wordml/sdtformatlock" xmlns:w16se="http://schemas.microsoft.com/office/word/2015/wordml/symex" xmlns:wpg="http://schemas.microsoft.com/office/word/2010/wordprocessingGroup" xmlns:wpi="http://schemas.microsoft.com/office/word/2010/wordprocessingInk" xmlns:wne="http://schemas.microsoft.com/office/word/2006/wordml" xmlns:wps="http://schemas.microsoft.com/office/word/2010/wordprocessingShape" mc:Ignorable="w14 w15 w16se w16cid w16 w16cex w16sdtdh w16sdtfl w16du wp14">
   <w:abstractNum w:abstractNumId="0" w15:restartNumberingAfterBreak="0">
     <w:nsid w:val="04432C32"/>
     <w:multiLevelType w:val="hybridMultilevel"/>
@@ -9731,6 +10117,119 @@
     </w:lvl>
   </w:abstractNum>
   <w:abstractNum w:abstractNumId="3" w15:restartNumberingAfterBreak="0">
+    <w:nsid w:val="087B1037"/>
+    <w:multiLevelType w:val="hybridMultilevel"/>
+    <w:tmpl w:val="CA361908"/>
+    <w:lvl w:ilvl="0" w:tplc="40090001">
+      <w:start w:val="1"/>
+      <w:numFmt w:val="bullet"/>
+      <w:lvlText w:val=""/>
+      <w:lvlJc w:val="left"/>
+      <w:pPr>
+        <w:ind w:left="720" w:hanging="360"/>
+      </w:pPr>
+      <w:rPr>
+        <w:rFonts w:ascii="Symbol" w:hAnsi="Symbol" w:hint="default"/>
+      </w:rPr>
+    </w:lvl>
+    <w:lvl w:ilvl="1" w:tplc="40090003" w:tentative="1">
+      <w:start w:val="1"/>
+      <w:numFmt w:val="bullet"/>
+      <w:lvlText w:val="o"/>
+      <w:lvlJc w:val="left"/>
+      <w:pPr>
+        <w:ind w:left="1440" w:hanging="360"/>
+      </w:pPr>
+      <w:rPr>
+        <w:rFonts w:ascii="Courier New" w:hAnsi="Courier New" w:cs="Courier New" w:hint="default"/>
+      </w:rPr>
+    </w:lvl>
+    <w:lvl w:ilvl="2" w:tplc="40090005" w:tentative="1">
+      <w:start w:val="1"/>
+      <w:numFmt w:val="bullet"/>
+      <w:lvlText w:val=""/>
+      <w:lvlJc w:val="left"/>
+      <w:pPr>
+        <w:ind w:left="2160" w:hanging="360"/>
+      </w:pPr>
+      <w:rPr>
+        <w:rFonts w:ascii="Wingdings" w:hAnsi="Wingdings" w:hint="default"/>
+      </w:rPr>
+    </w:lvl>
+    <w:lvl w:ilvl="3" w:tplc="40090001" w:tentative="1">
+      <w:start w:val="1"/>
+      <w:numFmt w:val="bullet"/>
+      <w:lvlText w:val=""/>
+      <w:lvlJc w:val="left"/>
+      <w:pPr>
+        <w:ind w:left="2880" w:hanging="360"/>
+      </w:pPr>
+      <w:rPr>
+        <w:rFonts w:ascii="Symbol" w:hAnsi="Symbol" w:hint="default"/>
+      </w:rPr>
+    </w:lvl>
+    <w:lvl w:ilvl="4" w:tplc="40090003" w:tentative="1">
+      <w:start w:val="1"/>
+      <w:numFmt w:val="bullet"/>
+      <w:lvlText w:val="o"/>
+      <w:lvlJc w:val="left"/>
+      <w:pPr>
+        <w:ind w:left="3600" w:hanging="360"/>
+      </w:pPr>
+      <w:rPr>
+        <w:rFonts w:ascii="Courier New" w:hAnsi="Courier New" w:cs="Courier New" w:hint="default"/>
+      </w:rPr>
+    </w:lvl>
+    <w:lvl w:ilvl="5" w:tplc="40090005" w:tentative="1">
+      <w:start w:val="1"/>
+      <w:numFmt w:val="bullet"/>
+      <w:lvlText w:val=""/>
+      <w:lvlJc w:val="left"/>
+      <w:pPr>
+        <w:ind w:left="4320" w:hanging="360"/>
+      </w:pPr>
+      <w:rPr>
+        <w:rFonts w:ascii="Wingdings" w:hAnsi="Wingdings" w:hint="default"/>
+      </w:rPr>
+    </w:lvl>
+    <w:lvl w:ilvl="6" w:tplc="40090001" w:tentative="1">
+      <w:start w:val="1"/>
+      <w:numFmt w:val="bullet"/>
+      <w:lvlText w:val=""/>
+      <w:lvlJc w:val="left"/>
+      <w:pPr>
+        <w:ind w:left="5040" w:hanging="360"/>
+      </w:pPr>
+      <w:rPr>
+        <w:rFonts w:ascii="Symbol" w:hAnsi="Symbol" w:hint="default"/>
+      </w:rPr>
+    </w:lvl>
+    <w:lvl w:ilvl="7" w:tplc="40090003" w:tentative="1">
+      <w:start w:val="1"/>
+      <w:numFmt w:val="bullet"/>
+      <w:lvlText w:val="o"/>
+      <w:lvlJc w:val="left"/>
+      <w:pPr>
+        <w:ind w:left="5760" w:hanging="360"/>
+      </w:pPr>
+      <w:rPr>
+        <w:rFonts w:ascii="Courier New" w:hAnsi="Courier New" w:cs="Courier New" w:hint="default"/>
+      </w:rPr>
+    </w:lvl>
+    <w:lvl w:ilvl="8" w:tplc="40090005" w:tentative="1">
+      <w:start w:val="1"/>
+      <w:numFmt w:val="bullet"/>
+      <w:lvlText w:val=""/>
+      <w:lvlJc w:val="left"/>
+      <w:pPr>
+        <w:ind w:left="6480" w:hanging="360"/>
+      </w:pPr>
+      <w:rPr>
+        <w:rFonts w:ascii="Wingdings" w:hAnsi="Wingdings" w:hint="default"/>
+      </w:rPr>
+    </w:lvl>
+  </w:abstractNum>
+  <w:abstractNum w:abstractNumId="4" w15:restartNumberingAfterBreak="0">
     <w:nsid w:val="0BB004F9"/>
     <w:multiLevelType w:val="multilevel"/>
     <w:tmpl w:val="0414CAC4"/>
@@ -9879,7 +10378,7 @@
       </w:rPr>
     </w:lvl>
   </w:abstractNum>
-  <w:abstractNum w:abstractNumId="4" w15:restartNumberingAfterBreak="0">
+  <w:abstractNum w:abstractNumId="5" w15:restartNumberingAfterBreak="0">
     <w:nsid w:val="0DA76EC4"/>
     <w:multiLevelType w:val="hybridMultilevel"/>
     <w:tmpl w:val="2BFCC90A"/>
@@ -9992,7 +10491,7 @@
       </w:rPr>
     </w:lvl>
   </w:abstractNum>
-  <w:abstractNum w:abstractNumId="5" w15:restartNumberingAfterBreak="0">
+  <w:abstractNum w:abstractNumId="6" w15:restartNumberingAfterBreak="0">
     <w:nsid w:val="0EE17A24"/>
     <w:multiLevelType w:val="hybridMultilevel"/>
     <w:tmpl w:val="F6026932"/>
@@ -10105,7 +10604,7 @@
       </w:rPr>
     </w:lvl>
   </w:abstractNum>
-  <w:abstractNum w:abstractNumId="6" w15:restartNumberingAfterBreak="0">
+  <w:abstractNum w:abstractNumId="7" w15:restartNumberingAfterBreak="0">
     <w:nsid w:val="0F2B2441"/>
     <w:multiLevelType w:val="hybridMultilevel"/>
     <w:tmpl w:val="19A08612"/>
@@ -10218,7 +10717,7 @@
       </w:rPr>
     </w:lvl>
   </w:abstractNum>
-  <w:abstractNum w:abstractNumId="7" w15:restartNumberingAfterBreak="0">
+  <w:abstractNum w:abstractNumId="8" w15:restartNumberingAfterBreak="0">
     <w:nsid w:val="145F2E52"/>
     <w:multiLevelType w:val="hybridMultilevel"/>
     <w:tmpl w:val="92E8670C"/>
@@ -10331,7 +10830,7 @@
       </w:rPr>
     </w:lvl>
   </w:abstractNum>
-  <w:abstractNum w:abstractNumId="8" w15:restartNumberingAfterBreak="0">
+  <w:abstractNum w:abstractNumId="9" w15:restartNumberingAfterBreak="0">
     <w:nsid w:val="146E6FB2"/>
     <w:multiLevelType w:val="hybridMultilevel"/>
     <w:tmpl w:val="337C7D80"/>
@@ -10444,7 +10943,7 @@
       </w:rPr>
     </w:lvl>
   </w:abstractNum>
-  <w:abstractNum w:abstractNumId="9" w15:restartNumberingAfterBreak="0">
+  <w:abstractNum w:abstractNumId="10" w15:restartNumberingAfterBreak="0">
     <w:nsid w:val="1AE9241E"/>
     <w:multiLevelType w:val="hybridMultilevel"/>
     <w:tmpl w:val="AB882408"/>
@@ -10557,7 +11056,7 @@
       </w:rPr>
     </w:lvl>
   </w:abstractNum>
-  <w:abstractNum w:abstractNumId="10" w15:restartNumberingAfterBreak="0">
+  <w:abstractNum w:abstractNumId="11" w15:restartNumberingAfterBreak="0">
     <w:nsid w:val="1B9A230C"/>
     <w:multiLevelType w:val="hybridMultilevel"/>
     <w:tmpl w:val="75DC1000"/>
@@ -10670,7 +11169,7 @@
       </w:rPr>
     </w:lvl>
   </w:abstractNum>
-  <w:abstractNum w:abstractNumId="11" w15:restartNumberingAfterBreak="0">
+  <w:abstractNum w:abstractNumId="12" w15:restartNumberingAfterBreak="0">
     <w:nsid w:val="1FAE09F0"/>
     <w:multiLevelType w:val="multilevel"/>
     <w:tmpl w:val="D5EEA086"/>
@@ -10819,7 +11318,7 @@
       </w:rPr>
     </w:lvl>
   </w:abstractNum>
-  <w:abstractNum w:abstractNumId="12" w15:restartNumberingAfterBreak="0">
+  <w:abstractNum w:abstractNumId="13" w15:restartNumberingAfterBreak="0">
     <w:nsid w:val="220427E4"/>
     <w:multiLevelType w:val="hybridMultilevel"/>
     <w:tmpl w:val="BDCA8448"/>
@@ -10908,7 +11407,7 @@
       </w:pPr>
     </w:lvl>
   </w:abstractNum>
-  <w:abstractNum w:abstractNumId="13" w15:restartNumberingAfterBreak="0">
+  <w:abstractNum w:abstractNumId="14" w15:restartNumberingAfterBreak="0">
     <w:nsid w:val="229A2E9D"/>
     <w:multiLevelType w:val="hybridMultilevel"/>
     <w:tmpl w:val="4BB247A4"/>
@@ -11000,7 +11499,7 @@
       </w:pPr>
     </w:lvl>
   </w:abstractNum>
-  <w:abstractNum w:abstractNumId="14" w15:restartNumberingAfterBreak="0">
+  <w:abstractNum w:abstractNumId="15" w15:restartNumberingAfterBreak="0">
     <w:nsid w:val="26083786"/>
     <w:multiLevelType w:val="hybridMultilevel"/>
     <w:tmpl w:val="AC967D72"/>
@@ -11113,7 +11612,7 @@
       </w:rPr>
     </w:lvl>
   </w:abstractNum>
-  <w:abstractNum w:abstractNumId="15" w15:restartNumberingAfterBreak="0">
+  <w:abstractNum w:abstractNumId="16" w15:restartNumberingAfterBreak="0">
     <w:nsid w:val="273267DB"/>
     <w:multiLevelType w:val="hybridMultilevel"/>
     <w:tmpl w:val="15BE7576"/>
@@ -11226,7 +11725,7 @@
       </w:rPr>
     </w:lvl>
   </w:abstractNum>
-  <w:abstractNum w:abstractNumId="16" w15:restartNumberingAfterBreak="0">
+  <w:abstractNum w:abstractNumId="17" w15:restartNumberingAfterBreak="0">
     <w:nsid w:val="2C43513B"/>
     <w:multiLevelType w:val="multilevel"/>
     <w:tmpl w:val="0296A074"/>
@@ -11375,7 +11874,7 @@
       </w:rPr>
     </w:lvl>
   </w:abstractNum>
-  <w:abstractNum w:abstractNumId="17" w15:restartNumberingAfterBreak="0">
+  <w:abstractNum w:abstractNumId="18" w15:restartNumberingAfterBreak="0">
     <w:nsid w:val="317800EA"/>
     <w:multiLevelType w:val="hybridMultilevel"/>
     <w:tmpl w:val="61FA1A7E"/>
@@ -11488,7 +11987,7 @@
       </w:rPr>
     </w:lvl>
   </w:abstractNum>
-  <w:abstractNum w:abstractNumId="18" w15:restartNumberingAfterBreak="0">
+  <w:abstractNum w:abstractNumId="19" w15:restartNumberingAfterBreak="0">
     <w:nsid w:val="36575EBA"/>
     <w:multiLevelType w:val="multilevel"/>
     <w:tmpl w:val="A3F2FEE2"/>
@@ -11637,7 +12136,7 @@
       </w:rPr>
     </w:lvl>
   </w:abstractNum>
-  <w:abstractNum w:abstractNumId="19" w15:restartNumberingAfterBreak="0">
+  <w:abstractNum w:abstractNumId="20" w15:restartNumberingAfterBreak="0">
     <w:nsid w:val="395A03D9"/>
     <w:multiLevelType w:val="hybridMultilevel"/>
     <w:tmpl w:val="B15C8266"/>
@@ -11723,7 +12222,7 @@
       </w:pPr>
     </w:lvl>
   </w:abstractNum>
-  <w:abstractNum w:abstractNumId="20" w15:restartNumberingAfterBreak="0">
+  <w:abstractNum w:abstractNumId="21" w15:restartNumberingAfterBreak="0">
     <w:nsid w:val="3A28556D"/>
     <w:multiLevelType w:val="multilevel"/>
     <w:tmpl w:val="E94ED27A"/>
@@ -11872,7 +12371,7 @@
       </w:rPr>
     </w:lvl>
   </w:abstractNum>
-  <w:abstractNum w:abstractNumId="21" w15:restartNumberingAfterBreak="0">
+  <w:abstractNum w:abstractNumId="22" w15:restartNumberingAfterBreak="0">
     <w:nsid w:val="45127D7C"/>
     <w:multiLevelType w:val="hybridMultilevel"/>
     <w:tmpl w:val="B1824946"/>
@@ -11985,7 +12484,7 @@
       </w:rPr>
     </w:lvl>
   </w:abstractNum>
-  <w:abstractNum w:abstractNumId="22" w15:restartNumberingAfterBreak="0">
+  <w:abstractNum w:abstractNumId="23" w15:restartNumberingAfterBreak="0">
     <w:nsid w:val="4EDF0A52"/>
     <w:multiLevelType w:val="hybridMultilevel"/>
     <w:tmpl w:val="39CCC5D0"/>
@@ -12098,7 +12597,7 @@
       </w:rPr>
     </w:lvl>
   </w:abstractNum>
-  <w:abstractNum w:abstractNumId="23" w15:restartNumberingAfterBreak="0">
+  <w:abstractNum w:abstractNumId="24" w15:restartNumberingAfterBreak="0">
     <w:nsid w:val="4F99727E"/>
     <w:multiLevelType w:val="hybridMultilevel"/>
     <w:tmpl w:val="5204B6DA"/>
@@ -12211,7 +12710,7 @@
       </w:rPr>
     </w:lvl>
   </w:abstractNum>
-  <w:abstractNum w:abstractNumId="24" w15:restartNumberingAfterBreak="0">
+  <w:abstractNum w:abstractNumId="25" w15:restartNumberingAfterBreak="0">
     <w:nsid w:val="6099287D"/>
     <w:multiLevelType w:val="hybridMultilevel"/>
     <w:tmpl w:val="E5FA6B5E"/>
@@ -12324,7 +12823,7 @@
       </w:rPr>
     </w:lvl>
   </w:abstractNum>
-  <w:abstractNum w:abstractNumId="25" w15:restartNumberingAfterBreak="0">
+  <w:abstractNum w:abstractNumId="26" w15:restartNumberingAfterBreak="0">
     <w:nsid w:val="635D27EB"/>
     <w:multiLevelType w:val="hybridMultilevel"/>
     <w:tmpl w:val="CF3A5BF2"/>
@@ -12413,7 +12912,7 @@
       </w:pPr>
     </w:lvl>
   </w:abstractNum>
-  <w:abstractNum w:abstractNumId="26" w15:restartNumberingAfterBreak="0">
+  <w:abstractNum w:abstractNumId="27" w15:restartNumberingAfterBreak="0">
     <w:nsid w:val="68D21616"/>
     <w:multiLevelType w:val="multilevel"/>
     <w:tmpl w:val="E6644EEE"/>
@@ -12562,7 +13061,7 @@
       </w:rPr>
     </w:lvl>
   </w:abstractNum>
-  <w:abstractNum w:abstractNumId="27" w15:restartNumberingAfterBreak="0">
+  <w:abstractNum w:abstractNumId="28" w15:restartNumberingAfterBreak="0">
     <w:nsid w:val="69C85B05"/>
     <w:multiLevelType w:val="hybridMultilevel"/>
     <w:tmpl w:val="37783E10"/>
@@ -12675,7 +13174,120 @@
       </w:rPr>
     </w:lvl>
   </w:abstractNum>
-  <w:abstractNum w:abstractNumId="28" w15:restartNumberingAfterBreak="0">
+  <w:abstractNum w:abstractNumId="29" w15:restartNumberingAfterBreak="0">
+    <w:nsid w:val="6EA04BAA"/>
+    <w:multiLevelType w:val="hybridMultilevel"/>
+    <w:tmpl w:val="01240CBA"/>
+    <w:lvl w:ilvl="0" w:tplc="40090003">
+      <w:start w:val="1"/>
+      <w:numFmt w:val="bullet"/>
+      <w:lvlText w:val="o"/>
+      <w:lvlJc w:val="left"/>
+      <w:pPr>
+        <w:ind w:left="1440" w:hanging="360"/>
+      </w:pPr>
+      <w:rPr>
+        <w:rFonts w:ascii="Courier New" w:hAnsi="Courier New" w:cs="Courier New" w:hint="default"/>
+      </w:rPr>
+    </w:lvl>
+    <w:lvl w:ilvl="1" w:tplc="40090003" w:tentative="1">
+      <w:start w:val="1"/>
+      <w:numFmt w:val="bullet"/>
+      <w:lvlText w:val="o"/>
+      <w:lvlJc w:val="left"/>
+      <w:pPr>
+        <w:ind w:left="2160" w:hanging="360"/>
+      </w:pPr>
+      <w:rPr>
+        <w:rFonts w:ascii="Courier New" w:hAnsi="Courier New" w:cs="Courier New" w:hint="default"/>
+      </w:rPr>
+    </w:lvl>
+    <w:lvl w:ilvl="2" w:tplc="40090005" w:tentative="1">
+      <w:start w:val="1"/>
+      <w:numFmt w:val="bullet"/>
+      <w:lvlText w:val=""/>
+      <w:lvlJc w:val="left"/>
+      <w:pPr>
+        <w:ind w:left="2880" w:hanging="360"/>
+      </w:pPr>
+      <w:rPr>
+        <w:rFonts w:ascii="Wingdings" w:hAnsi="Wingdings" w:hint="default"/>
+      </w:rPr>
+    </w:lvl>
+    <w:lvl w:ilvl="3" w:tplc="40090001" w:tentative="1">
+      <w:start w:val="1"/>
+      <w:numFmt w:val="bullet"/>
+      <w:lvlText w:val=""/>
+      <w:lvlJc w:val="left"/>
+      <w:pPr>
+        <w:ind w:left="3600" w:hanging="360"/>
+      </w:pPr>
+      <w:rPr>
+        <w:rFonts w:ascii="Symbol" w:hAnsi="Symbol" w:hint="default"/>
+      </w:rPr>
+    </w:lvl>
+    <w:lvl w:ilvl="4" w:tplc="40090003" w:tentative="1">
+      <w:start w:val="1"/>
+      <w:numFmt w:val="bullet"/>
+      <w:lvlText w:val="o"/>
+      <w:lvlJc w:val="left"/>
+      <w:pPr>
+        <w:ind w:left="4320" w:hanging="360"/>
+      </w:pPr>
+      <w:rPr>
+        <w:rFonts w:ascii="Courier New" w:hAnsi="Courier New" w:cs="Courier New" w:hint="default"/>
+      </w:rPr>
+    </w:lvl>
+    <w:lvl w:ilvl="5" w:tplc="40090005" w:tentative="1">
+      <w:start w:val="1"/>
+      <w:numFmt w:val="bullet"/>
+      <w:lvlText w:val=""/>
+      <w:lvlJc w:val="left"/>
+      <w:pPr>
+        <w:ind w:left="5040" w:hanging="360"/>
+      </w:pPr>
+      <w:rPr>
+        <w:rFonts w:ascii="Wingdings" w:hAnsi="Wingdings" w:hint="default"/>
+      </w:rPr>
+    </w:lvl>
+    <w:lvl w:ilvl="6" w:tplc="40090001" w:tentative="1">
+      <w:start w:val="1"/>
+      <w:numFmt w:val="bullet"/>
+      <w:lvlText w:val=""/>
+      <w:lvlJc w:val="left"/>
+      <w:pPr>
+        <w:ind w:left="5760" w:hanging="360"/>
+      </w:pPr>
+      <w:rPr>
+        <w:rFonts w:ascii="Symbol" w:hAnsi="Symbol" w:hint="default"/>
+      </w:rPr>
+    </w:lvl>
+    <w:lvl w:ilvl="7" w:tplc="40090003" w:tentative="1">
+      <w:start w:val="1"/>
+      <w:numFmt w:val="bullet"/>
+      <w:lvlText w:val="o"/>
+      <w:lvlJc w:val="left"/>
+      <w:pPr>
+        <w:ind w:left="6480" w:hanging="360"/>
+      </w:pPr>
+      <w:rPr>
+        <w:rFonts w:ascii="Courier New" w:hAnsi="Courier New" w:cs="Courier New" w:hint="default"/>
+      </w:rPr>
+    </w:lvl>
+    <w:lvl w:ilvl="8" w:tplc="40090005" w:tentative="1">
+      <w:start w:val="1"/>
+      <w:numFmt w:val="bullet"/>
+      <w:lvlText w:val=""/>
+      <w:lvlJc w:val="left"/>
+      <w:pPr>
+        <w:ind w:left="7200" w:hanging="360"/>
+      </w:pPr>
+      <w:rPr>
+        <w:rFonts w:ascii="Wingdings" w:hAnsi="Wingdings" w:hint="default"/>
+      </w:rPr>
+    </w:lvl>
+  </w:abstractNum>
+  <w:abstractNum w:abstractNumId="30" w15:restartNumberingAfterBreak="0">
     <w:nsid w:val="73682DC8"/>
     <w:multiLevelType w:val="multilevel"/>
     <w:tmpl w:val="087CE96E"/>
@@ -12824,7 +13436,7 @@
       </w:rPr>
     </w:lvl>
   </w:abstractNum>
-  <w:abstractNum w:abstractNumId="29" w15:restartNumberingAfterBreak="0">
+  <w:abstractNum w:abstractNumId="31" w15:restartNumberingAfterBreak="0">
     <w:nsid w:val="736C53A0"/>
     <w:multiLevelType w:val="hybridMultilevel"/>
     <w:tmpl w:val="5B5C4D10"/>
@@ -12937,7 +13549,7 @@
       </w:rPr>
     </w:lvl>
   </w:abstractNum>
-  <w:abstractNum w:abstractNumId="30" w15:restartNumberingAfterBreak="0">
+  <w:abstractNum w:abstractNumId="32" w15:restartNumberingAfterBreak="0">
     <w:nsid w:val="73C23052"/>
     <w:multiLevelType w:val="hybridMultilevel"/>
     <w:tmpl w:val="D690FECA"/>
@@ -13050,7 +13662,7 @@
       </w:rPr>
     </w:lvl>
   </w:abstractNum>
-  <w:abstractNum w:abstractNumId="31" w15:restartNumberingAfterBreak="0">
+  <w:abstractNum w:abstractNumId="33" w15:restartNumberingAfterBreak="0">
     <w:nsid w:val="74984525"/>
     <w:multiLevelType w:val="hybridMultilevel"/>
     <w:tmpl w:val="B92AF58C"/>
@@ -13163,7 +13775,7 @@
       </w:rPr>
     </w:lvl>
   </w:abstractNum>
-  <w:abstractNum w:abstractNumId="32" w15:restartNumberingAfterBreak="0">
+  <w:abstractNum w:abstractNumId="34" w15:restartNumberingAfterBreak="0">
     <w:nsid w:val="75A2131D"/>
     <w:multiLevelType w:val="multilevel"/>
     <w:tmpl w:val="E3E68A84"/>
@@ -13312,7 +13924,7 @@
       </w:rPr>
     </w:lvl>
   </w:abstractNum>
-  <w:abstractNum w:abstractNumId="33" w15:restartNumberingAfterBreak="0">
+  <w:abstractNum w:abstractNumId="35" w15:restartNumberingAfterBreak="0">
     <w:nsid w:val="797E21D2"/>
     <w:multiLevelType w:val="multilevel"/>
     <w:tmpl w:val="6C0A5A54"/>
@@ -13461,7 +14073,7 @@
       </w:rPr>
     </w:lvl>
   </w:abstractNum>
-  <w:abstractNum w:abstractNumId="34" w15:restartNumberingAfterBreak="0">
+  <w:abstractNum w:abstractNumId="36" w15:restartNumberingAfterBreak="0">
     <w:nsid w:val="7C6B7663"/>
     <w:multiLevelType w:val="hybridMultilevel"/>
     <w:tmpl w:val="4FF6193C"/>
@@ -13550,7 +14162,7 @@
       </w:pPr>
     </w:lvl>
   </w:abstractNum>
-  <w:abstractNum w:abstractNumId="35" w15:restartNumberingAfterBreak="0">
+  <w:abstractNum w:abstractNumId="37" w15:restartNumberingAfterBreak="0">
     <w:nsid w:val="7F860919"/>
     <w:multiLevelType w:val="hybridMultilevel"/>
     <w:tmpl w:val="450A1098"/>
@@ -13643,118 +14255,124 @@
     </w:lvl>
   </w:abstractNum>
   <w:num w:numId="1" w16cid:durableId="1068459917">
-    <w:abstractNumId w:val="12"/>
+    <w:abstractNumId w:val="13"/>
   </w:num>
   <w:num w:numId="2" w16cid:durableId="1850634775">
-    <w:abstractNumId w:val="19"/>
+    <w:abstractNumId w:val="20"/>
   </w:num>
   <w:num w:numId="3" w16cid:durableId="657225218">
-    <w:abstractNumId w:val="20"/>
+    <w:abstractNumId w:val="21"/>
   </w:num>
   <w:num w:numId="4" w16cid:durableId="1516962698">
-    <w:abstractNumId w:val="30"/>
+    <w:abstractNumId w:val="32"/>
   </w:num>
   <w:num w:numId="5" w16cid:durableId="1868324600">
-    <w:abstractNumId w:val="6"/>
+    <w:abstractNumId w:val="7"/>
   </w:num>
   <w:num w:numId="6" w16cid:durableId="163278471">
     <w:abstractNumId w:val="0"/>
   </w:num>
   <w:num w:numId="7" w16cid:durableId="1648783324">
-    <w:abstractNumId w:val="18"/>
+    <w:abstractNumId w:val="19"/>
   </w:num>
   <w:num w:numId="8" w16cid:durableId="861626321">
-    <w:abstractNumId w:val="4"/>
+    <w:abstractNumId w:val="5"/>
   </w:num>
   <w:num w:numId="9" w16cid:durableId="883980836">
-    <w:abstractNumId w:val="7"/>
+    <w:abstractNumId w:val="8"/>
   </w:num>
   <w:num w:numId="10" w16cid:durableId="886142108">
-    <w:abstractNumId w:val="24"/>
+    <w:abstractNumId w:val="25"/>
   </w:num>
   <w:num w:numId="11" w16cid:durableId="1563323906">
-    <w:abstractNumId w:val="10"/>
+    <w:abstractNumId w:val="11"/>
   </w:num>
   <w:num w:numId="12" w16cid:durableId="1507281334">
-    <w:abstractNumId w:val="11"/>
+    <w:abstractNumId w:val="12"/>
   </w:num>
   <w:num w:numId="13" w16cid:durableId="1547596144">
+    <w:abstractNumId w:val="30"/>
+  </w:num>
+  <w:num w:numId="14" w16cid:durableId="494346921">
     <w:abstractNumId w:val="28"/>
   </w:num>
-  <w:num w:numId="14" w16cid:durableId="494346921">
-    <w:abstractNumId w:val="27"/>
-  </w:num>
   <w:num w:numId="15" w16cid:durableId="170723990">
-    <w:abstractNumId w:val="22"/>
+    <w:abstractNumId w:val="23"/>
   </w:num>
   <w:num w:numId="16" w16cid:durableId="531649451">
-    <w:abstractNumId w:val="5"/>
+    <w:abstractNumId w:val="6"/>
   </w:num>
   <w:num w:numId="17" w16cid:durableId="254680269">
-    <w:abstractNumId w:val="14"/>
+    <w:abstractNumId w:val="15"/>
   </w:num>
   <w:num w:numId="18" w16cid:durableId="43876029">
-    <w:abstractNumId w:val="31"/>
+    <w:abstractNumId w:val="33"/>
   </w:num>
   <w:num w:numId="19" w16cid:durableId="866063410">
     <w:abstractNumId w:val="2"/>
   </w:num>
   <w:num w:numId="20" w16cid:durableId="1264606595">
-    <w:abstractNumId w:val="17"/>
+    <w:abstractNumId w:val="18"/>
   </w:num>
   <w:num w:numId="21" w16cid:durableId="682978570">
-    <w:abstractNumId w:val="32"/>
+    <w:abstractNumId w:val="34"/>
   </w:num>
   <w:num w:numId="22" w16cid:durableId="54202293">
-    <w:abstractNumId w:val="21"/>
+    <w:abstractNumId w:val="22"/>
   </w:num>
   <w:num w:numId="23" w16cid:durableId="611089396">
-    <w:abstractNumId w:val="3"/>
+    <w:abstractNumId w:val="4"/>
   </w:num>
   <w:num w:numId="24" w16cid:durableId="55668285">
-    <w:abstractNumId w:val="29"/>
+    <w:abstractNumId w:val="31"/>
   </w:num>
   <w:num w:numId="25" w16cid:durableId="445080443">
-    <w:abstractNumId w:val="15"/>
+    <w:abstractNumId w:val="16"/>
   </w:num>
   <w:num w:numId="26" w16cid:durableId="1060055889">
     <w:abstractNumId w:val="1"/>
   </w:num>
   <w:num w:numId="27" w16cid:durableId="2132242381">
-    <w:abstractNumId w:val="16"/>
+    <w:abstractNumId w:val="17"/>
   </w:num>
   <w:num w:numId="28" w16cid:durableId="1643922697">
+    <w:abstractNumId w:val="10"/>
+  </w:num>
+  <w:num w:numId="29" w16cid:durableId="699818087">
+    <w:abstractNumId w:val="27"/>
+  </w:num>
+  <w:num w:numId="30" w16cid:durableId="2037731468">
+    <w:abstractNumId w:val="36"/>
+  </w:num>
+  <w:num w:numId="31" w16cid:durableId="2102876044">
+    <w:abstractNumId w:val="24"/>
+  </w:num>
+  <w:num w:numId="32" w16cid:durableId="528033152">
+    <w:abstractNumId w:val="26"/>
+  </w:num>
+  <w:num w:numId="33" w16cid:durableId="756635604">
+    <w:abstractNumId w:val="37"/>
+  </w:num>
+  <w:num w:numId="34" w16cid:durableId="1955012707">
+    <w:abstractNumId w:val="14"/>
+  </w:num>
+  <w:num w:numId="35" w16cid:durableId="355078805">
     <w:abstractNumId w:val="9"/>
   </w:num>
-  <w:num w:numId="29" w16cid:durableId="699818087">
-    <w:abstractNumId w:val="26"/>
-  </w:num>
-  <w:num w:numId="30" w16cid:durableId="2037731468">
-    <w:abstractNumId w:val="34"/>
-  </w:num>
-  <w:num w:numId="31" w16cid:durableId="2102876044">
-    <w:abstractNumId w:val="23"/>
-  </w:num>
-  <w:num w:numId="32" w16cid:durableId="528033152">
-    <w:abstractNumId w:val="25"/>
-  </w:num>
-  <w:num w:numId="33" w16cid:durableId="756635604">
+  <w:num w:numId="36" w16cid:durableId="1421946264">
     <w:abstractNumId w:val="35"/>
   </w:num>
-  <w:num w:numId="34" w16cid:durableId="1955012707">
-    <w:abstractNumId w:val="13"/>
+  <w:num w:numId="37" w16cid:durableId="1901288590">
+    <w:abstractNumId w:val="3"/>
   </w:num>
-  <w:num w:numId="35" w16cid:durableId="355078805">
-    <w:abstractNumId w:val="8"/>
-  </w:num>
-  <w:num w:numId="36" w16cid:durableId="1421946264">
-    <w:abstractNumId w:val="33"/>
+  <w:num w:numId="38" w16cid:durableId="1902520508">
+    <w:abstractNumId w:val="29"/>
   </w:num>
 </w:numbering>
 </file>
 
 <file path=word/styles.xml><?xml version="1.0" encoding="utf-8"?>
-<w:styles xmlns:mc="http://schemas.openxmlformats.org/markup-compatibility/2006" xmlns:r="http://schemas.openxmlformats.org/officeDocument/2006/relationships" xmlns:w="http://schemas.openxmlformats.org/wordprocessingml/2006/main" xmlns:w14="http://schemas.microsoft.com/office/word/2010/wordml" xmlns:w15="http://schemas.microsoft.com/office/word/2012/wordml" xmlns:w16cex="http://schemas.microsoft.com/office/word/2018/wordml/cex" xmlns:w16cid="http://schemas.microsoft.com/office/word/2016/wordml/cid" xmlns:w16="http://schemas.microsoft.com/office/word/2018/wordml" xmlns:w16sdtdh="http://schemas.microsoft.com/office/word/2020/wordml/sdtdatahash" xmlns:w16se="http://schemas.microsoft.com/office/word/2015/wordml/symex" mc:Ignorable="w14 w15 w16se w16cid w16 w16cex w16sdtdh">
+<w:styles xmlns:mc="http://schemas.openxmlformats.org/markup-compatibility/2006" xmlns:r="http://schemas.openxmlformats.org/officeDocument/2006/relationships" xmlns:w="http://schemas.openxmlformats.org/wordprocessingml/2006/main" xmlns:w14="http://schemas.microsoft.com/office/word/2010/wordml" xmlns:w15="http://schemas.microsoft.com/office/word/2012/wordml" xmlns:w16cex="http://schemas.microsoft.com/office/word/2018/wordml/cex" xmlns:w16cid="http://schemas.microsoft.com/office/word/2016/wordml/cid" xmlns:w16="http://schemas.microsoft.com/office/word/2018/wordml" xmlns:w16du="http://schemas.microsoft.com/office/word/2023/wordml/word16du" xmlns:w16sdtdh="http://schemas.microsoft.com/office/word/2020/wordml/sdtdatahash" xmlns:w16sdtfl="http://schemas.microsoft.com/office/word/2024/wordml/sdtformatlock" xmlns:w16se="http://schemas.microsoft.com/office/word/2015/wordml/symex" mc:Ignorable="w14 w15 w16se w16cid w16 w16cex w16sdtdh w16sdtfl w16du">
   <w:docDefaults>
     <w:rPrDefault>
       <w:rPr>
@@ -15108,6 +15726,20 @@
 </file>
 
 <file path=customXml/item2.xml><?xml version="1.0" encoding="utf-8"?>
+<b:Sources xmlns:b="http://schemas.openxmlformats.org/officeDocument/2006/bibliography" xmlns="http://schemas.openxmlformats.org/officeDocument/2006/bibliography" SelectedStyle="\APASixthEditionOfficeOnline.xsl" StyleName="APA" Version="6"/>
+</file>
+
+<file path=customXml/item3.xml><?xml version="1.0" encoding="utf-8"?>
+<p:properties xmlns:p="http://schemas.microsoft.com/office/2006/metadata/properties" xmlns:xsi="http://www.w3.org/2001/XMLSchema-instance" xmlns:pc="http://schemas.microsoft.com/office/infopath/2007/PartnerControls">
+  <documentManagement>
+    <_ip_UnifiedCompliancePolicyUIAction xmlns="http://schemas.microsoft.com/sharepoint/v3" xsi:nil="true"/>
+    <_ip_UnifiedCompliancePolicyProperties xmlns="http://schemas.microsoft.com/sharepoint/v3" xsi:nil="true"/>
+    <_activity xmlns="aaca710f-348c-473b-8ae4-cd608da168de" xsi:nil="true"/>
+  </documentManagement>
+</p:properties>
+</file>
+
+<file path=customXml/item4.xml><?xml version="1.0" encoding="utf-8"?>
 <ct:contentTypeSchema xmlns:ct="http://schemas.microsoft.com/office/2006/metadata/contentType" xmlns:ma="http://schemas.microsoft.com/office/2006/metadata/properties/metaAttributes" ct:_="" ma:_="" ma:contentTypeName="Document" ma:contentTypeID="0x010100C336F416DF3F824CA9A4C1C67E34FBBB" ma:contentTypeVersion="14" ma:contentTypeDescription="Create a new document." ma:contentTypeScope="" ma:versionID="5059ec3067dde87c811a8b238dd611c1">
   <xsd:schema xmlns:xsd="http://www.w3.org/2001/XMLSchema" xmlns:xs="http://www.w3.org/2001/XMLSchema" xmlns:p="http://schemas.microsoft.com/office/2006/metadata/properties" xmlns:ns1="http://schemas.microsoft.com/sharepoint/v3" xmlns:ns3="aaca710f-348c-473b-8ae4-cd608da168de" xmlns:ns4="65e4c885-d6cb-48f4-9cc3-54623770e5d1" targetNamespace="http://schemas.microsoft.com/office/2006/metadata/properties" ma:root="true" ma:fieldsID="c6816017bbc987569658c4d308e897f1" ns1:_="" ns3:_="" ns4:_="">
     <xsd:import namespace="http://schemas.microsoft.com/sharepoint/v3"/>
@@ -15339,20 +15971,6 @@
 </ct:contentTypeSchema>
 </file>
 
-<file path=customXml/item3.xml><?xml version="1.0" encoding="utf-8"?>
-<p:properties xmlns:p="http://schemas.microsoft.com/office/2006/metadata/properties" xmlns:xsi="http://www.w3.org/2001/XMLSchema-instance" xmlns:pc="http://schemas.microsoft.com/office/infopath/2007/PartnerControls">
-  <documentManagement>
-    <_ip_UnifiedCompliancePolicyUIAction xmlns="http://schemas.microsoft.com/sharepoint/v3" xsi:nil="true"/>
-    <_ip_UnifiedCompliancePolicyProperties xmlns="http://schemas.microsoft.com/sharepoint/v3" xsi:nil="true"/>
-    <_activity xmlns="aaca710f-348c-473b-8ae4-cd608da168de" xsi:nil="true"/>
-  </documentManagement>
-</p:properties>
-</file>
-
-<file path=customXml/item4.xml><?xml version="1.0" encoding="utf-8"?>
-<b:Sources xmlns:b="http://schemas.openxmlformats.org/officeDocument/2006/bibliography" xmlns="http://schemas.openxmlformats.org/officeDocument/2006/bibliography" SelectedStyle="\APASixthEditionOfficeOnline.xsl" StyleName="APA" Version="6"/>
-</file>
-
 <file path=customXml/itemProps1.xml><?xml version="1.0" encoding="utf-8"?>
 <ds:datastoreItem xmlns:ds="http://schemas.openxmlformats.org/officeDocument/2006/customXml" ds:itemID="{DC69FB58-C24C-408F-A3A8-92FAB5FC24B3}">
   <ds:schemaRefs>
@@ -15362,6 +15980,25 @@
 </file>
 
 <file path=customXml/itemProps2.xml><?xml version="1.0" encoding="utf-8"?>
+<ds:datastoreItem xmlns:ds="http://schemas.openxmlformats.org/officeDocument/2006/customXml" ds:itemID="{087CF143-FA9E-4375-967F-C2A3DAB39323}">
+  <ds:schemaRefs>
+    <ds:schemaRef ds:uri="http://schemas.openxmlformats.org/officeDocument/2006/bibliography"/>
+  </ds:schemaRefs>
+</ds:datastoreItem>
+</file>
+
+<file path=customXml/itemProps3.xml><?xml version="1.0" encoding="utf-8"?>
+<ds:datastoreItem xmlns:ds="http://schemas.openxmlformats.org/officeDocument/2006/customXml" ds:itemID="{8DDCC28F-0174-4A9E-9BC4-6160A553800D}">
+  <ds:schemaRefs>
+    <ds:schemaRef ds:uri="http://schemas.microsoft.com/office/2006/metadata/properties"/>
+    <ds:schemaRef ds:uri="http://schemas.microsoft.com/office/infopath/2007/PartnerControls"/>
+    <ds:schemaRef ds:uri="http://schemas.microsoft.com/sharepoint/v3"/>
+    <ds:schemaRef ds:uri="aaca710f-348c-473b-8ae4-cd608da168de"/>
+  </ds:schemaRefs>
+</ds:datastoreItem>
+</file>
+
+<file path=customXml/itemProps4.xml><?xml version="1.0" encoding="utf-8"?>
 <ds:datastoreItem xmlns:ds="http://schemas.openxmlformats.org/officeDocument/2006/customXml" ds:itemID="{CE71A7BB-02E0-4AE3-8432-2F01B35274E9}">
   <ds:schemaRefs>
     <ds:schemaRef ds:uri="http://schemas.microsoft.com/office/2006/metadata/contentType"/>
@@ -15381,25 +16018,6 @@
 </ds:datastoreItem>
 </file>
 
-<file path=customXml/itemProps3.xml><?xml version="1.0" encoding="utf-8"?>
-<ds:datastoreItem xmlns:ds="http://schemas.openxmlformats.org/officeDocument/2006/customXml" ds:itemID="{8DDCC28F-0174-4A9E-9BC4-6160A553800D}">
-  <ds:schemaRefs>
-    <ds:schemaRef ds:uri="http://schemas.microsoft.com/office/2006/metadata/properties"/>
-    <ds:schemaRef ds:uri="http://schemas.microsoft.com/office/infopath/2007/PartnerControls"/>
-    <ds:schemaRef ds:uri="http://schemas.microsoft.com/sharepoint/v3"/>
-    <ds:schemaRef ds:uri="aaca710f-348c-473b-8ae4-cd608da168de"/>
-  </ds:schemaRefs>
-</ds:datastoreItem>
-</file>
-
-<file path=customXml/itemProps4.xml><?xml version="1.0" encoding="utf-8"?>
-<ds:datastoreItem xmlns:ds="http://schemas.openxmlformats.org/officeDocument/2006/customXml" ds:itemID="{087CF143-FA9E-4375-967F-C2A3DAB39323}">
-  <ds:schemaRefs>
-    <ds:schemaRef ds:uri="http://schemas.openxmlformats.org/officeDocument/2006/bibliography"/>
-  </ds:schemaRefs>
-</ds:datastoreItem>
-</file>
-
 <file path=docMetadata/LabelInfo.xml><?xml version="1.0" encoding="utf-8"?>
 <clbl:labelList xmlns:clbl="http://schemas.microsoft.com/office/2020/mipLabelMetadata">
   <clbl:label id="{f42aa342-8706-4288-bd11-ebb85995028c}" enabled="1" method="Standard" siteId="{72f988bf-86f1-41af-91ab-2d7cd011db47}" removed="0"/>

</xml_diff>

<commit_message>
Update NodeACReset function with try exception block to handle exception
  - Update NodeACReset function with try exception block to handle exception
  - Add SingleShotPowerCycleTimeOut duration parameter in the dut_info.json
  - Update ctam_fw_update_verify to add a verification to check the components
    Status.Health and Status.State as "OK" and "Enabled" along with the component's
    version check as part of f/w update verification.
  - Update the following sections in OnBoarding Document:
    - Enable & Verify AC Cycle Test Case
    - Add Firmware Update pre-requisites section
</commit_message>
<xml_diff>
--- a/docs/CTAM - OnBoarding Document.docx
+++ b/docs/CTAM - OnBoarding Document.docx
@@ -21,7 +21,7 @@
       <w:pPr>
         <w:pStyle w:val="Heading1"/>
       </w:pPr>
-      <w:bookmarkStart w:id="0" w:name="_Toc193706965"/>
+      <w:bookmarkStart w:id="0" w:name="_Toc219207855"/>
       <w:r>
         <w:t>Table Of Contents</w:t>
       </w:r>
@@ -70,7 +70,6 @@
               <w:noProof/>
               <w:sz w:val="24"/>
               <w:szCs w:val="24"/>
-              <w:lang w:val="en-IN" w:eastAsia="en-IN"/>
             </w:rPr>
           </w:pPr>
           <w:r>
@@ -82,7 +81,7 @@
           <w:r>
             <w:fldChar w:fldCharType="separate"/>
           </w:r>
-          <w:hyperlink w:anchor="_Toc193706965" w:history="1">
+          <w:hyperlink w:anchor="_Toc219207855" w:history="1">
             <w:r>
               <w:rPr>
                 <w:rStyle w:val="Hyperlink"/>
@@ -109,7 +108,7 @@
                 <w:noProof/>
                 <w:webHidden/>
               </w:rPr>
-              <w:instrText xml:space="preserve"> PAGEREF _Toc193706965 \h </w:instrText>
+              <w:instrText xml:space="preserve"> PAGEREF _Toc219207855 \h </w:instrText>
             </w:r>
             <w:r>
               <w:rPr>
@@ -151,10 +150,9 @@
               <w:noProof/>
               <w:sz w:val="24"/>
               <w:szCs w:val="24"/>
-              <w:lang w:val="en-IN" w:eastAsia="en-IN"/>
             </w:rPr>
           </w:pPr>
-          <w:hyperlink w:anchor="_Toc193706966" w:history="1">
+          <w:hyperlink w:anchor="_Toc219207856" w:history="1">
             <w:r>
               <w:rPr>
                 <w:rStyle w:val="Hyperlink"/>
@@ -182,7 +180,7 @@
                 <w:noProof/>
                 <w:webHidden/>
               </w:rPr>
-              <w:instrText xml:space="preserve"> PAGEREF _Toc193706966 \h </w:instrText>
+              <w:instrText xml:space="preserve"> PAGEREF _Toc219207856 \h </w:instrText>
             </w:r>
             <w:r>
               <w:rPr>
@@ -224,10 +222,9 @@
               <w:noProof/>
               <w:sz w:val="24"/>
               <w:szCs w:val="24"/>
-              <w:lang w:val="en-IN" w:eastAsia="en-IN"/>
             </w:rPr>
           </w:pPr>
-          <w:hyperlink w:anchor="_Toc193706967" w:history="1">
+          <w:hyperlink w:anchor="_Toc219207857" w:history="1">
             <w:r>
               <w:rPr>
                 <w:rStyle w:val="Hyperlink"/>
@@ -255,7 +252,7 @@
                 <w:noProof/>
                 <w:webHidden/>
               </w:rPr>
-              <w:instrText xml:space="preserve"> PAGEREF _Toc193706967 \h </w:instrText>
+              <w:instrText xml:space="preserve"> PAGEREF _Toc219207857 \h </w:instrText>
             </w:r>
             <w:r>
               <w:rPr>
@@ -298,10 +295,9 @@
               <w:noProof/>
               <w:sz w:val="24"/>
               <w:szCs w:val="24"/>
-              <w:lang w:val="en-IN" w:eastAsia="en-IN"/>
             </w:rPr>
           </w:pPr>
-          <w:hyperlink w:anchor="_Toc193706968" w:history="1">
+          <w:hyperlink w:anchor="_Toc219207858" w:history="1">
             <w:r>
               <w:rPr>
                 <w:rStyle w:val="Hyperlink"/>
@@ -316,7 +312,6 @@
                 <w:noProof/>
                 <w:sz w:val="24"/>
                 <w:szCs w:val="24"/>
-                <w:lang w:val="en-IN" w:eastAsia="en-IN"/>
               </w:rPr>
               <w:tab/>
             </w:r>
@@ -347,7 +342,7 @@
                 <w:noProof/>
                 <w:webHidden/>
               </w:rPr>
-              <w:instrText xml:space="preserve"> PAGEREF _Toc193706968 \h </w:instrText>
+              <w:instrText xml:space="preserve"> PAGEREF _Toc219207858 \h </w:instrText>
             </w:r>
             <w:r>
               <w:rPr>
@@ -390,10 +385,9 @@
               <w:noProof/>
               <w:sz w:val="24"/>
               <w:szCs w:val="24"/>
-              <w:lang w:val="en-IN" w:eastAsia="en-IN"/>
             </w:rPr>
           </w:pPr>
-          <w:hyperlink w:anchor="_Toc193706969" w:history="1">
+          <w:hyperlink w:anchor="_Toc219207859" w:history="1">
             <w:r>
               <w:rPr>
                 <w:rStyle w:val="Hyperlink"/>
@@ -408,7 +402,6 @@
                 <w:noProof/>
                 <w:sz w:val="24"/>
                 <w:szCs w:val="24"/>
-                <w:lang w:val="en-IN" w:eastAsia="en-IN"/>
               </w:rPr>
               <w:tab/>
             </w:r>
@@ -439,7 +432,7 @@
                 <w:noProof/>
                 <w:webHidden/>
               </w:rPr>
-              <w:instrText xml:space="preserve"> PAGEREF _Toc193706969 \h </w:instrText>
+              <w:instrText xml:space="preserve"> PAGEREF _Toc219207859 \h </w:instrText>
             </w:r>
             <w:r>
               <w:rPr>
@@ -482,10 +475,9 @@
               <w:noProof/>
               <w:sz w:val="24"/>
               <w:szCs w:val="24"/>
-              <w:lang w:val="en-IN" w:eastAsia="en-IN"/>
             </w:rPr>
           </w:pPr>
-          <w:hyperlink w:anchor="_Toc193706970" w:history="1">
+          <w:hyperlink w:anchor="_Toc219207860" w:history="1">
             <w:r>
               <w:rPr>
                 <w:rStyle w:val="Hyperlink"/>
@@ -499,7 +491,6 @@
                 <w:noProof/>
                 <w:sz w:val="24"/>
                 <w:szCs w:val="24"/>
-                <w:lang w:val="en-IN" w:eastAsia="en-IN"/>
               </w:rPr>
               <w:tab/>
             </w:r>
@@ -529,7 +520,7 @@
                 <w:noProof/>
                 <w:webHidden/>
               </w:rPr>
-              <w:instrText xml:space="preserve"> PAGEREF _Toc193706970 \h </w:instrText>
+              <w:instrText xml:space="preserve"> PAGEREF _Toc219207860 \h </w:instrText>
             </w:r>
             <w:r>
               <w:rPr>
@@ -572,10 +563,9 @@
               <w:noProof/>
               <w:sz w:val="24"/>
               <w:szCs w:val="24"/>
-              <w:lang w:val="en-IN" w:eastAsia="en-IN"/>
             </w:rPr>
           </w:pPr>
-          <w:hyperlink w:anchor="_Toc193706971" w:history="1">
+          <w:hyperlink w:anchor="_Toc219207861" w:history="1">
             <w:r>
               <w:rPr>
                 <w:rStyle w:val="Hyperlink"/>
@@ -590,7 +580,6 @@
                 <w:noProof/>
                 <w:sz w:val="24"/>
                 <w:szCs w:val="24"/>
-                <w:lang w:val="en-IN" w:eastAsia="en-IN"/>
               </w:rPr>
               <w:tab/>
             </w:r>
@@ -621,7 +610,7 @@
                 <w:noProof/>
                 <w:webHidden/>
               </w:rPr>
-              <w:instrText xml:space="preserve"> PAGEREF _Toc193706971 \h </w:instrText>
+              <w:instrText xml:space="preserve"> PAGEREF _Toc219207861 \h </w:instrText>
             </w:r>
             <w:r>
               <w:rPr>
@@ -664,10 +653,9 @@
               <w:noProof/>
               <w:sz w:val="24"/>
               <w:szCs w:val="24"/>
-              <w:lang w:val="en-IN" w:eastAsia="en-IN"/>
             </w:rPr>
           </w:pPr>
-          <w:hyperlink w:anchor="_Toc193706972" w:history="1">
+          <w:hyperlink w:anchor="_Toc219207862" w:history="1">
             <w:r>
               <w:rPr>
                 <w:rStyle w:val="Hyperlink"/>
@@ -681,7 +669,6 @@
                 <w:noProof/>
                 <w:sz w:val="24"/>
                 <w:szCs w:val="24"/>
-                <w:lang w:val="en-IN" w:eastAsia="en-IN"/>
               </w:rPr>
               <w:tab/>
             </w:r>
@@ -711,7 +698,7 @@
                 <w:noProof/>
                 <w:webHidden/>
               </w:rPr>
-              <w:instrText xml:space="preserve"> PAGEREF _Toc193706972 \h </w:instrText>
+              <w:instrText xml:space="preserve"> PAGEREF _Toc219207862 \h </w:instrText>
             </w:r>
             <w:r>
               <w:rPr>
@@ -753,10 +740,9 @@
               <w:noProof/>
               <w:sz w:val="24"/>
               <w:szCs w:val="24"/>
-              <w:lang w:val="en-IN" w:eastAsia="en-IN"/>
             </w:rPr>
           </w:pPr>
-          <w:hyperlink w:anchor="_Toc193706973" w:history="1">
+          <w:hyperlink w:anchor="_Toc219207863" w:history="1">
             <w:r>
               <w:rPr>
                 <w:rStyle w:val="Hyperlink"/>
@@ -783,7 +769,7 @@
                 <w:noProof/>
                 <w:webHidden/>
               </w:rPr>
-              <w:instrText xml:space="preserve"> PAGEREF _Toc193706973 \h </w:instrText>
+              <w:instrText xml:space="preserve"> PAGEREF _Toc219207863 \h </w:instrText>
             </w:r>
             <w:r>
               <w:rPr>
@@ -825,10 +811,9 @@
               <w:noProof/>
               <w:sz w:val="24"/>
               <w:szCs w:val="24"/>
-              <w:lang w:val="en-IN" w:eastAsia="en-IN"/>
             </w:rPr>
           </w:pPr>
-          <w:hyperlink w:anchor="_Toc193706974" w:history="1">
+          <w:hyperlink w:anchor="_Toc219207864" w:history="1">
             <w:r>
               <w:rPr>
                 <w:rStyle w:val="Hyperlink"/>
@@ -855,7 +840,7 @@
                 <w:noProof/>
                 <w:webHidden/>
               </w:rPr>
-              <w:instrText xml:space="preserve"> PAGEREF _Toc193706974 \h </w:instrText>
+              <w:instrText xml:space="preserve"> PAGEREF _Toc219207864 \h </w:instrText>
             </w:r>
             <w:r>
               <w:rPr>
@@ -897,16 +882,15 @@
               <w:noProof/>
               <w:sz w:val="24"/>
               <w:szCs w:val="24"/>
-              <w:lang w:val="en-IN" w:eastAsia="en-IN"/>
             </w:rPr>
           </w:pPr>
-          <w:hyperlink w:anchor="_Toc193706975" w:history="1">
+          <w:hyperlink w:anchor="_Toc219207865" w:history="1">
             <w:r>
               <w:rPr>
                 <w:rStyle w:val="Hyperlink"/>
                 <w:noProof/>
               </w:rPr>
-              <w:t>Full FW Update Flow</w:t>
+              <w:t>FW Update Pre-requisites:</w:t>
             </w:r>
             <w:r>
               <w:rPr>
@@ -927,7 +911,7 @@
                 <w:noProof/>
                 <w:webHidden/>
               </w:rPr>
-              <w:instrText xml:space="preserve"> PAGEREF _Toc193706975 \h </w:instrText>
+              <w:instrText xml:space="preserve"> PAGEREF _Toc219207865 \h </w:instrText>
             </w:r>
             <w:r>
               <w:rPr>
@@ -969,16 +953,15 @@
               <w:noProof/>
               <w:sz w:val="24"/>
               <w:szCs w:val="24"/>
-              <w:lang w:val="en-IN" w:eastAsia="en-IN"/>
             </w:rPr>
           </w:pPr>
-          <w:hyperlink w:anchor="_Toc193706976" w:history="1">
+          <w:hyperlink w:anchor="_Toc219207866" w:history="1">
             <w:r>
               <w:rPr>
                 <w:rStyle w:val="Hyperlink"/>
                 <w:noProof/>
               </w:rPr>
-              <w:t>Full FW Rollback Flow</w:t>
+              <w:t>Full FW Update Flow</w:t>
             </w:r>
             <w:r>
               <w:rPr>
@@ -999,79 +982,7 @@
                 <w:noProof/>
                 <w:webHidden/>
               </w:rPr>
-              <w:instrText xml:space="preserve"> PAGEREF _Toc193706976 \h </w:instrText>
-            </w:r>
-            <w:r>
-              <w:rPr>
-                <w:noProof/>
-                <w:webHidden/>
-              </w:rPr>
-            </w:r>
-            <w:r>
-              <w:rPr>
-                <w:noProof/>
-                <w:webHidden/>
-              </w:rPr>
-              <w:fldChar w:fldCharType="separate"/>
-            </w:r>
-            <w:r>
-              <w:rPr>
-                <w:noProof/>
-                <w:webHidden/>
-              </w:rPr>
-              <w:t>5</w:t>
-            </w:r>
-            <w:r>
-              <w:rPr>
-                <w:noProof/>
-                <w:webHidden/>
-              </w:rPr>
-              <w:fldChar w:fldCharType="end"/>
-            </w:r>
-          </w:hyperlink>
-        </w:p>
-        <w:p>
-          <w:pPr>
-            <w:pStyle w:val="TOC1"/>
-            <w:tabs>
-              <w:tab w:val="right" w:leader="dot" w:pos="9350"/>
-            </w:tabs>
-            <w:rPr>
-              <w:rFonts w:eastAsiaTheme="minorEastAsia"/>
-              <w:noProof/>
-              <w:sz w:val="24"/>
-              <w:szCs w:val="24"/>
-              <w:lang w:val="en-IN" w:eastAsia="en-IN"/>
-            </w:rPr>
-          </w:pPr>
-          <w:hyperlink w:anchor="_Toc193706977" w:history="1">
-            <w:r>
-              <w:rPr>
-                <w:rStyle w:val="Hyperlink"/>
-                <w:noProof/>
-              </w:rPr>
-              <w:t>CTAM Documentation Guide</w:t>
-            </w:r>
-            <w:r>
-              <w:rPr>
-                <w:noProof/>
-                <w:webHidden/>
-              </w:rPr>
-              <w:tab/>
-            </w:r>
-            <w:r>
-              <w:rPr>
-                <w:noProof/>
-                <w:webHidden/>
-              </w:rPr>
-              <w:fldChar w:fldCharType="begin"/>
-            </w:r>
-            <w:r>
-              <w:rPr>
-                <w:noProof/>
-                <w:webHidden/>
-              </w:rPr>
-              <w:instrText xml:space="preserve"> PAGEREF _Toc193706977 \h </w:instrText>
+              <w:instrText xml:space="preserve"> PAGEREF _Toc219207866 \h </w:instrText>
             </w:r>
             <w:r>
               <w:rPr>
@@ -1103,6 +1014,148 @@
           </w:hyperlink>
         </w:p>
         <w:p>
+          <w:pPr>
+            <w:pStyle w:val="TOC1"/>
+            <w:tabs>
+              <w:tab w:val="right" w:leader="dot" w:pos="9350"/>
+            </w:tabs>
+            <w:rPr>
+              <w:rFonts w:eastAsiaTheme="minorEastAsia"/>
+              <w:noProof/>
+              <w:sz w:val="24"/>
+              <w:szCs w:val="24"/>
+            </w:rPr>
+          </w:pPr>
+          <w:hyperlink w:anchor="_Toc219207867" w:history="1">
+            <w:r>
+              <w:rPr>
+                <w:rStyle w:val="Hyperlink"/>
+                <w:noProof/>
+              </w:rPr>
+              <w:t>Full FW Rollback Flow</w:t>
+            </w:r>
+            <w:r>
+              <w:rPr>
+                <w:noProof/>
+                <w:webHidden/>
+              </w:rPr>
+              <w:tab/>
+            </w:r>
+            <w:r>
+              <w:rPr>
+                <w:noProof/>
+                <w:webHidden/>
+              </w:rPr>
+              <w:fldChar w:fldCharType="begin"/>
+            </w:r>
+            <w:r>
+              <w:rPr>
+                <w:noProof/>
+                <w:webHidden/>
+              </w:rPr>
+              <w:instrText xml:space="preserve"> PAGEREF _Toc219207867 \h </w:instrText>
+            </w:r>
+            <w:r>
+              <w:rPr>
+                <w:noProof/>
+                <w:webHidden/>
+              </w:rPr>
+            </w:r>
+            <w:r>
+              <w:rPr>
+                <w:noProof/>
+                <w:webHidden/>
+              </w:rPr>
+              <w:fldChar w:fldCharType="separate"/>
+            </w:r>
+            <w:r>
+              <w:rPr>
+                <w:noProof/>
+                <w:webHidden/>
+              </w:rPr>
+              <w:t>6</w:t>
+            </w:r>
+            <w:r>
+              <w:rPr>
+                <w:noProof/>
+                <w:webHidden/>
+              </w:rPr>
+              <w:fldChar w:fldCharType="end"/>
+            </w:r>
+          </w:hyperlink>
+        </w:p>
+        <w:p>
+          <w:pPr>
+            <w:pStyle w:val="TOC1"/>
+            <w:tabs>
+              <w:tab w:val="right" w:leader="dot" w:pos="9350"/>
+            </w:tabs>
+            <w:rPr>
+              <w:rFonts w:eastAsiaTheme="minorEastAsia"/>
+              <w:noProof/>
+              <w:sz w:val="24"/>
+              <w:szCs w:val="24"/>
+            </w:rPr>
+          </w:pPr>
+          <w:hyperlink w:anchor="_Toc219207868" w:history="1">
+            <w:r>
+              <w:rPr>
+                <w:rStyle w:val="Hyperlink"/>
+                <w:noProof/>
+              </w:rPr>
+              <w:t>CTAM Documentation Guide</w:t>
+            </w:r>
+            <w:r>
+              <w:rPr>
+                <w:noProof/>
+                <w:webHidden/>
+              </w:rPr>
+              <w:tab/>
+            </w:r>
+            <w:r>
+              <w:rPr>
+                <w:noProof/>
+                <w:webHidden/>
+              </w:rPr>
+              <w:fldChar w:fldCharType="begin"/>
+            </w:r>
+            <w:r>
+              <w:rPr>
+                <w:noProof/>
+                <w:webHidden/>
+              </w:rPr>
+              <w:instrText xml:space="preserve"> PAGEREF _Toc219207868 \h </w:instrText>
+            </w:r>
+            <w:r>
+              <w:rPr>
+                <w:noProof/>
+                <w:webHidden/>
+              </w:rPr>
+            </w:r>
+            <w:r>
+              <w:rPr>
+                <w:noProof/>
+                <w:webHidden/>
+              </w:rPr>
+              <w:fldChar w:fldCharType="separate"/>
+            </w:r>
+            <w:r>
+              <w:rPr>
+                <w:noProof/>
+                <w:webHidden/>
+              </w:rPr>
+              <w:t>7</w:t>
+            </w:r>
+            <w:r>
+              <w:rPr>
+                <w:noProof/>
+                <w:webHidden/>
+              </w:rPr>
+              <w:fldChar w:fldCharType="end"/>
+            </w:r>
+          </w:hyperlink>
+        </w:p>
+        <w:p>
           <w:r>
             <w:rPr>
               <w:b/>
@@ -1162,7 +1215,7 @@
           <w:rFonts w:ascii="Calibri" w:hAnsi="Calibri" w:cs="Calibri"/>
         </w:rPr>
       </w:pPr>
-      <w:bookmarkStart w:id="1" w:name="_Toc193706966"/>
+      <w:bookmarkStart w:id="1" w:name="_Toc219207856"/>
       <w:r>
         <w:rPr>
           <w:rFonts w:ascii="Calibri" w:hAnsi="Calibri" w:cs="Calibri"/>
@@ -1371,7 +1424,7 @@
           <w:rFonts w:ascii="Calibri" w:hAnsi="Calibri" w:cs="Calibri"/>
         </w:rPr>
       </w:pPr>
-      <w:bookmarkStart w:id="2" w:name="_Toc193706967"/>
+      <w:bookmarkStart w:id="2" w:name="_Toc219207857"/>
       <w:r>
         <w:rPr>
           <w:rFonts w:ascii="Calibri" w:hAnsi="Calibri" w:cs="Calibri"/>
@@ -1391,7 +1444,7 @@
           <w:rFonts w:ascii="Calibri" w:hAnsi="Calibri" w:cs="Calibri"/>
         </w:rPr>
       </w:pPr>
-      <w:bookmarkStart w:id="3" w:name="_Toc193706968"/>
+      <w:bookmarkStart w:id="3" w:name="_Toc219207858"/>
       <w:r>
         <w:rPr>
           <w:rFonts w:ascii="Calibri" w:hAnsi="Calibri" w:cs="Calibri"/>
@@ -1518,7 +1571,7 @@
           <w:rFonts w:ascii="Calibri" w:hAnsi="Calibri" w:cs="Calibri"/>
         </w:rPr>
       </w:pPr>
-      <w:bookmarkStart w:id="4" w:name="_Toc193706969"/>
+      <w:bookmarkStart w:id="4" w:name="_Toc219207859"/>
       <w:r>
         <w:rPr>
           <w:rFonts w:ascii="Calibri" w:hAnsi="Calibri" w:cs="Calibri"/>
@@ -1879,7 +1932,7 @@
           <w:numId w:val="2"/>
         </w:numPr>
       </w:pPr>
-      <w:bookmarkStart w:id="5" w:name="_Toc193706970"/>
+      <w:bookmarkStart w:id="5" w:name="_Toc219207860"/>
       <w:r>
         <w:lastRenderedPageBreak/>
         <w:t>Discover Test Cases</w:t>
@@ -2779,7 +2832,7 @@
           <w:rFonts w:eastAsia="Times New Roman"/>
         </w:rPr>
       </w:pPr>
-      <w:bookmarkStart w:id="6" w:name="_Toc193706971"/>
+      <w:bookmarkStart w:id="6" w:name="_Toc219207861"/>
       <w:r>
         <w:rPr>
           <w:rFonts w:eastAsia="Times New Roman"/>
@@ -2839,43 +2892,7 @@
           <w:sz w:val="22"/>
           <w:szCs w:val="22"/>
         </w:rPr>
-        <w:t xml:space="preserve">To run </w:t>
-      </w:r>
-      <w:proofErr w:type="gramStart"/>
-      <w:r>
-        <w:rPr>
-          <w:rFonts w:ascii="Calibri" w:hAnsi="Calibri" w:cs="Calibri"/>
-          <w:sz w:val="22"/>
-          <w:szCs w:val="22"/>
-        </w:rPr>
-        <w:t>anything</w:t>
-      </w:r>
-      <w:proofErr w:type="gramEnd"/>
-      <w:r>
-        <w:rPr>
-          <w:rFonts w:ascii="Calibri" w:hAnsi="Calibri" w:cs="Calibri"/>
-          <w:sz w:val="22"/>
-          <w:szCs w:val="22"/>
-        </w:rPr>
-        <w:t xml:space="preserve"> we need </w:t>
-      </w:r>
-      <w:proofErr w:type="gramStart"/>
-      <w:r>
-        <w:rPr>
-          <w:rFonts w:ascii="Calibri" w:hAnsi="Calibri" w:cs="Calibri"/>
-          <w:sz w:val="22"/>
-          <w:szCs w:val="22"/>
-        </w:rPr>
-        <w:t>this properties</w:t>
-      </w:r>
-      <w:proofErr w:type="gramEnd"/>
-      <w:r>
-        <w:rPr>
-          <w:rFonts w:ascii="Calibri" w:hAnsi="Calibri" w:cs="Calibri"/>
-          <w:sz w:val="22"/>
-          <w:szCs w:val="22"/>
-        </w:rPr>
-        <w:t xml:space="preserve"> in </w:t>
+        <w:t xml:space="preserve">To run anything we need this properties in </w:t>
       </w:r>
       <w:proofErr w:type="spellStart"/>
       <w:r>
@@ -2919,9 +2936,8 @@
           <w:sz w:val="22"/>
           <w:szCs w:val="22"/>
         </w:rPr>
-        <w:t xml:space="preserve"> </w:t>
-      </w:r>
-      <w:proofErr w:type="gramStart"/>
+        <w:t xml:space="preserve"> and</w:t>
+      </w:r>
       <w:r>
         <w:rPr>
           <w:rFonts w:ascii="Calibri" w:hAnsi="Calibri" w:cs="Calibri"/>
@@ -2930,8 +2946,9 @@
           <w:sz w:val="22"/>
           <w:szCs w:val="22"/>
         </w:rPr>
-        <w:t>and</w:t>
-      </w:r>
+        <w:t xml:space="preserve"> .</w:t>
+      </w:r>
+      <w:proofErr w:type="spellStart"/>
       <w:r>
         <w:rPr>
           <w:rFonts w:ascii="Calibri" w:hAnsi="Calibri" w:cs="Calibri"/>
@@ -2940,21 +2957,9 @@
           <w:sz w:val="22"/>
           <w:szCs w:val="22"/>
         </w:rPr>
-        <w:t xml:space="preserve"> .</w:t>
-      </w:r>
-      <w:proofErr w:type="spellStart"/>
-      <w:r>
-        <w:rPr>
-          <w:rFonts w:ascii="Calibri" w:hAnsi="Calibri" w:cs="Calibri"/>
-          <w:b/>
-          <w:bCs/>
-          <w:sz w:val="22"/>
-          <w:szCs w:val="22"/>
-        </w:rPr>
         <w:t>netrc</w:t>
       </w:r>
       <w:proofErr w:type="spellEnd"/>
-      <w:proofErr w:type="gramEnd"/>
       <w:r>
         <w:rPr>
           <w:rFonts w:ascii="Calibri" w:hAnsi="Calibri" w:cs="Calibri"/>
@@ -3021,21 +3026,9 @@
           <w:kern w:val="0"/>
           <w14:ligatures w14:val="none"/>
         </w:rPr>
-        <w:t>ut_</w:t>
-      </w:r>
-      <w:proofErr w:type="gramStart"/>
-      <w:r>
-        <w:rPr>
-          <w:rFonts w:ascii="Calibri" w:eastAsia="Times New Roman" w:hAnsi="Calibri" w:cs="Calibri"/>
-          <w:b/>
-          <w:bCs/>
-          <w:kern w:val="0"/>
-          <w14:ligatures w14:val="none"/>
-        </w:rPr>
-        <w:t>info.json</w:t>
+        <w:t>ut_info.json</w:t>
       </w:r>
       <w:proofErr w:type="spellEnd"/>
-      <w:proofErr w:type="gramEnd"/>
     </w:p>
     <w:p>
       <w:pPr>
@@ -3090,9 +3083,65 @@
           <w:szCs w:val="21"/>
           <w14:ligatures w14:val="none"/>
         </w:rPr>
-        <w:t>"properties</w:t>
-      </w:r>
-      <w:proofErr w:type="gramStart"/>
+        <w:t>"properties"</w:t>
+      </w:r>
+      <w:r>
+        <w:rPr>
+          <w:rFonts w:ascii="Consolas" w:eastAsia="Times New Roman" w:hAnsi="Consolas" w:cs="Calibri"/>
+          <w:color w:val="3B3B3B"/>
+          <w:kern w:val="0"/>
+          <w:sz w:val="21"/>
+          <w:szCs w:val="21"/>
+          <w14:ligatures w14:val="none"/>
+        </w:rPr>
+        <w:t>: {</w:t>
+      </w:r>
+    </w:p>
+    <w:p>
+      <w:pPr>
+        <w:spacing w:after="0" w:line="240" w:lineRule="auto"/>
+        <w:rPr>
+          <w:rFonts w:ascii="Consolas" w:eastAsia="Times New Roman" w:hAnsi="Consolas" w:cs="Calibri"/>
+          <w:kern w:val="0"/>
+          <w:sz w:val="21"/>
+          <w:szCs w:val="21"/>
+          <w14:ligatures w14:val="none"/>
+        </w:rPr>
+      </w:pPr>
+      <w:r>
+        <w:rPr>
+          <w:rFonts w:ascii="Consolas" w:eastAsia="Times New Roman" w:hAnsi="Consolas" w:cs="Calibri"/>
+          <w:color w:val="3B3B3B"/>
+          <w:kern w:val="0"/>
+          <w:sz w:val="21"/>
+          <w:szCs w:val="21"/>
+          <w14:ligatures w14:val="none"/>
+        </w:rPr>
+        <w:t xml:space="preserve">    </w:t>
+      </w:r>
+      <w:r>
+        <w:rPr>
+          <w:rFonts w:ascii="Consolas" w:eastAsia="Times New Roman" w:hAnsi="Consolas" w:cs="Calibri"/>
+          <w:color w:val="3B3B3B"/>
+          <w:kern w:val="0"/>
+          <w:sz w:val="21"/>
+          <w:szCs w:val="21"/>
+          <w14:ligatures w14:val="none"/>
+        </w:rPr>
+        <w:tab/>
+      </w:r>
+      <w:r>
+        <w:rPr>
+          <w:rFonts w:ascii="Consolas" w:eastAsia="Times New Roman" w:hAnsi="Consolas" w:cs="Calibri"/>
+          <w:color w:val="3B3B3B"/>
+          <w:kern w:val="0"/>
+          <w:sz w:val="21"/>
+          <w:szCs w:val="21"/>
+          <w14:ligatures w14:val="none"/>
+        </w:rPr>
+        <w:tab/>
+        <w:t xml:space="preserve">    </w:t>
+      </w:r>
       <w:r>
         <w:rPr>
           <w:rFonts w:ascii="Consolas" w:eastAsia="Times New Roman" w:hAnsi="Consolas" w:cs="Calibri"/>
@@ -3104,6 +3153,30 @@
         </w:rPr>
         <w:t>"</w:t>
       </w:r>
+      <w:proofErr w:type="spellStart"/>
+      <w:r>
+        <w:rPr>
+          <w:rFonts w:ascii="Consolas" w:eastAsia="Times New Roman" w:hAnsi="Consolas" w:cs="Calibri"/>
+          <w:color w:val="0451A5"/>
+          <w:kern w:val="0"/>
+          <w:sz w:val="21"/>
+          <w:szCs w:val="21"/>
+          <w14:ligatures w14:val="none"/>
+        </w:rPr>
+        <w:t>ConnectionIPAddress</w:t>
+      </w:r>
+      <w:proofErr w:type="spellEnd"/>
+      <w:r>
+        <w:rPr>
+          <w:rFonts w:ascii="Consolas" w:eastAsia="Times New Roman" w:hAnsi="Consolas" w:cs="Calibri"/>
+          <w:color w:val="0451A5"/>
+          <w:kern w:val="0"/>
+          <w:sz w:val="21"/>
+          <w:szCs w:val="21"/>
+          <w14:ligatures w14:val="none"/>
+        </w:rPr>
+        <w:t>"</w:t>
+      </w:r>
       <w:r>
         <w:rPr>
           <w:rFonts w:ascii="Consolas" w:eastAsia="Times New Roman" w:hAnsi="Consolas" w:cs="Calibri"/>
@@ -3115,7 +3188,6 @@
         </w:rPr>
         <w:t>: {</w:t>
       </w:r>
-      <w:proofErr w:type="gramEnd"/>
     </w:p>
     <w:p>
       <w:pPr>
@@ -3137,7 +3209,7 @@
           <w:szCs w:val="21"/>
           <w14:ligatures w14:val="none"/>
         </w:rPr>
-        <w:t xml:space="preserve">    </w:t>
+        <w:t xml:space="preserve">        </w:t>
       </w:r>
       <w:r>
         <w:rPr>
@@ -3149,6 +3221,7 @@
           <w14:ligatures w14:val="none"/>
         </w:rPr>
         <w:tab/>
+        <w:t xml:space="preserve">    </w:t>
       </w:r>
       <w:r>
         <w:rPr>
@@ -3159,21 +3232,98 @@
           <w:szCs w:val="21"/>
           <w14:ligatures w14:val="none"/>
         </w:rPr>
+        <w:t xml:space="preserve">    </w:t>
+      </w:r>
+      <w:r>
+        <w:rPr>
+          <w:rFonts w:ascii="Consolas" w:eastAsia="Times New Roman" w:hAnsi="Consolas" w:cs="Calibri"/>
+          <w:color w:val="0451A5"/>
+          <w:kern w:val="0"/>
+          <w:sz w:val="21"/>
+          <w:szCs w:val="21"/>
+          <w14:ligatures w14:val="none"/>
+        </w:rPr>
+        <w:t>"description"</w:t>
+      </w:r>
+      <w:r>
+        <w:rPr>
+          <w:rFonts w:ascii="Consolas" w:eastAsia="Times New Roman" w:hAnsi="Consolas" w:cs="Calibri"/>
+          <w:color w:val="3B3B3B"/>
+          <w:kern w:val="0"/>
+          <w:sz w:val="21"/>
+          <w:szCs w:val="21"/>
+          <w14:ligatures w14:val="none"/>
+        </w:rPr>
+        <w:t xml:space="preserve">: </w:t>
+      </w:r>
+      <w:r>
+        <w:rPr>
+          <w:rFonts w:ascii="Consolas" w:eastAsia="Times New Roman" w:hAnsi="Consolas" w:cs="Calibri"/>
+          <w:color w:val="A31515"/>
+          <w:kern w:val="0"/>
+          <w:sz w:val="21"/>
+          <w:szCs w:val="21"/>
+          <w14:ligatures w14:val="none"/>
+        </w:rPr>
+        <w:t>"Default prefix for connecting to redfish"</w:t>
+      </w:r>
+      <w:r>
+        <w:rPr>
+          <w:rFonts w:ascii="Consolas" w:eastAsia="Times New Roman" w:hAnsi="Consolas" w:cs="Calibri"/>
+          <w:color w:val="3B3B3B"/>
+          <w:kern w:val="0"/>
+          <w:sz w:val="21"/>
+          <w:szCs w:val="21"/>
+          <w14:ligatures w14:val="none"/>
+        </w:rPr>
+        <w:t>,</w:t>
+      </w:r>
+    </w:p>
+    <w:p>
+      <w:pPr>
+        <w:spacing w:after="0" w:line="240" w:lineRule="auto"/>
+        <w:rPr>
+          <w:rFonts w:ascii="Consolas" w:eastAsia="Times New Roman" w:hAnsi="Consolas" w:cs="Calibri"/>
+          <w:kern w:val="0"/>
+          <w:sz w:val="21"/>
+          <w:szCs w:val="21"/>
+          <w14:ligatures w14:val="none"/>
+        </w:rPr>
+      </w:pPr>
+      <w:r>
+        <w:rPr>
+          <w:rFonts w:ascii="Consolas" w:eastAsia="Times New Roman" w:hAnsi="Consolas" w:cs="Calibri"/>
+          <w:color w:val="3B3B3B"/>
+          <w:kern w:val="0"/>
+          <w:sz w:val="21"/>
+          <w:szCs w:val="21"/>
+          <w14:ligatures w14:val="none"/>
+        </w:rPr>
+        <w:t xml:space="preserve">        </w:t>
+      </w:r>
+      <w:r>
+        <w:rPr>
+          <w:rFonts w:ascii="Consolas" w:eastAsia="Times New Roman" w:hAnsi="Consolas" w:cs="Calibri"/>
+          <w:color w:val="3B3B3B"/>
+          <w:kern w:val="0"/>
+          <w:sz w:val="21"/>
+          <w:szCs w:val="21"/>
+          <w14:ligatures w14:val="none"/>
+        </w:rPr>
         <w:tab/>
         <w:t xml:space="preserve">    </w:t>
       </w:r>
       <w:r>
         <w:rPr>
           <w:rFonts w:ascii="Consolas" w:eastAsia="Times New Roman" w:hAnsi="Consolas" w:cs="Calibri"/>
-          <w:color w:val="0451A5"/>
-          <w:kern w:val="0"/>
-          <w:sz w:val="21"/>
-          <w:szCs w:val="21"/>
-          <w14:ligatures w14:val="none"/>
-        </w:rPr>
-        <w:t>"</w:t>
-      </w:r>
-      <w:proofErr w:type="spellStart"/>
+          <w:color w:val="3B3B3B"/>
+          <w:kern w:val="0"/>
+          <w:sz w:val="21"/>
+          <w:szCs w:val="21"/>
+          <w14:ligatures w14:val="none"/>
+        </w:rPr>
+        <w:t xml:space="preserve">    </w:t>
+      </w:r>
       <w:r>
         <w:rPr>
           <w:rFonts w:ascii="Consolas" w:eastAsia="Times New Roman" w:hAnsi="Consolas" w:cs="Calibri"/>
@@ -3183,9 +3333,87 @@
           <w:szCs w:val="21"/>
           <w14:ligatures w14:val="none"/>
         </w:rPr>
-        <w:t>ConnectionIPAddress</w:t>
-      </w:r>
-      <w:proofErr w:type="spellEnd"/>
+        <w:t>"type"</w:t>
+      </w:r>
+      <w:r>
+        <w:rPr>
+          <w:rFonts w:ascii="Consolas" w:eastAsia="Times New Roman" w:hAnsi="Consolas" w:cs="Calibri"/>
+          <w:color w:val="3B3B3B"/>
+          <w:kern w:val="0"/>
+          <w:sz w:val="21"/>
+          <w:szCs w:val="21"/>
+          <w14:ligatures w14:val="none"/>
+        </w:rPr>
+        <w:t xml:space="preserve">: </w:t>
+      </w:r>
+      <w:r>
+        <w:rPr>
+          <w:rFonts w:ascii="Consolas" w:eastAsia="Times New Roman" w:hAnsi="Consolas" w:cs="Calibri"/>
+          <w:color w:val="A31515"/>
+          <w:kern w:val="0"/>
+          <w:sz w:val="21"/>
+          <w:szCs w:val="21"/>
+          <w14:ligatures w14:val="none"/>
+        </w:rPr>
+        <w:t>"string"</w:t>
+      </w:r>
+      <w:r>
+        <w:rPr>
+          <w:rFonts w:ascii="Consolas" w:eastAsia="Times New Roman" w:hAnsi="Consolas" w:cs="Calibri"/>
+          <w:color w:val="3B3B3B"/>
+          <w:kern w:val="0"/>
+          <w:sz w:val="21"/>
+          <w:szCs w:val="21"/>
+          <w14:ligatures w14:val="none"/>
+        </w:rPr>
+        <w:t>,</w:t>
+      </w:r>
+    </w:p>
+    <w:p>
+      <w:pPr>
+        <w:spacing w:after="0" w:line="240" w:lineRule="auto"/>
+        <w:rPr>
+          <w:rFonts w:ascii="Consolas" w:eastAsia="Times New Roman" w:hAnsi="Consolas" w:cs="Calibri"/>
+          <w:kern w:val="0"/>
+          <w:sz w:val="21"/>
+          <w:szCs w:val="21"/>
+          <w14:ligatures w14:val="none"/>
+        </w:rPr>
+      </w:pPr>
+      <w:r>
+        <w:rPr>
+          <w:rFonts w:ascii="Consolas" w:eastAsia="Times New Roman" w:hAnsi="Consolas" w:cs="Calibri"/>
+          <w:color w:val="3B3B3B"/>
+          <w:kern w:val="0"/>
+          <w:sz w:val="21"/>
+          <w:szCs w:val="21"/>
+          <w14:ligatures w14:val="none"/>
+        </w:rPr>
+        <w:t xml:space="preserve">        </w:t>
+      </w:r>
+      <w:r>
+        <w:rPr>
+          <w:rFonts w:ascii="Consolas" w:eastAsia="Times New Roman" w:hAnsi="Consolas" w:cs="Calibri"/>
+          <w:color w:val="3B3B3B"/>
+          <w:kern w:val="0"/>
+          <w:sz w:val="21"/>
+          <w:szCs w:val="21"/>
+          <w14:ligatures w14:val="none"/>
+        </w:rPr>
+        <w:tab/>
+        <w:t xml:space="preserve">    </w:t>
+      </w:r>
+      <w:r>
+        <w:rPr>
+          <w:rFonts w:ascii="Consolas" w:eastAsia="Times New Roman" w:hAnsi="Consolas" w:cs="Calibri"/>
+          <w:color w:val="3B3B3B"/>
+          <w:kern w:val="0"/>
+          <w:sz w:val="21"/>
+          <w:szCs w:val="21"/>
+          <w14:ligatures w14:val="none"/>
+        </w:rPr>
+        <w:t xml:space="preserve">    </w:t>
+      </w:r>
       <w:r>
         <w:rPr>
           <w:rFonts w:ascii="Consolas" w:eastAsia="Times New Roman" w:hAnsi="Consolas" w:cs="Calibri"/>
@@ -3195,7 +3423,7 @@
           <w:szCs w:val="21"/>
           <w14:ligatures w14:val="none"/>
         </w:rPr>
-        <w:t>"</w:t>
+        <w:t>"value"</w:t>
       </w:r>
       <w:r>
         <w:rPr>
@@ -3206,21 +3434,23 @@
           <w:szCs w:val="21"/>
           <w14:ligatures w14:val="none"/>
         </w:rPr>
-        <w:t>: {</w:t>
+        <w:t xml:space="preserve">: </w:t>
+      </w:r>
+      <w:r>
+        <w:rPr>
+          <w:rFonts w:ascii="Consolas" w:eastAsia="Times New Roman" w:hAnsi="Consolas" w:cs="Calibri"/>
+          <w:color w:val="A31515"/>
+          <w:kern w:val="0"/>
+          <w:sz w:val="21"/>
+          <w:szCs w:val="21"/>
+          <w14:ligatures w14:val="none"/>
+        </w:rPr>
+        <w:t>"&lt;&gt;"</w:t>
       </w:r>
     </w:p>
     <w:p>
       <w:pPr>
         <w:spacing w:after="0" w:line="240" w:lineRule="auto"/>
-        <w:rPr>
-          <w:rFonts w:ascii="Consolas" w:eastAsia="Times New Roman" w:hAnsi="Consolas" w:cs="Calibri"/>
-          <w:kern w:val="0"/>
-          <w:sz w:val="21"/>
-          <w:szCs w:val="21"/>
-          <w14:ligatures w14:val="none"/>
-        </w:rPr>
-      </w:pPr>
-      <w:r>
         <w:rPr>
           <w:rFonts w:ascii="Consolas" w:eastAsia="Times New Roman" w:hAnsi="Consolas" w:cs="Calibri"/>
           <w:color w:val="3B3B3B"/>
@@ -3229,8 +3459,7 @@
           <w:szCs w:val="21"/>
           <w14:ligatures w14:val="none"/>
         </w:rPr>
-        <w:t xml:space="preserve">        </w:t>
-      </w:r>
+      </w:pPr>
       <w:r>
         <w:rPr>
           <w:rFonts w:ascii="Consolas" w:eastAsia="Times New Roman" w:hAnsi="Consolas" w:cs="Calibri"/>
@@ -3240,8 +3469,7 @@
           <w:szCs w:val="21"/>
           <w14:ligatures w14:val="none"/>
         </w:rPr>
-        <w:tab/>
-        <w:t xml:space="preserve">    </w:t>
+        <w:t xml:space="preserve">    </w:t>
       </w:r>
       <w:r>
         <w:rPr>
@@ -3252,6 +3480,95 @@
           <w:szCs w:val="21"/>
           <w14:ligatures w14:val="none"/>
         </w:rPr>
+        <w:tab/>
+      </w:r>
+      <w:r>
+        <w:rPr>
+          <w:rFonts w:ascii="Consolas" w:eastAsia="Times New Roman" w:hAnsi="Consolas" w:cs="Calibri"/>
+          <w:color w:val="3B3B3B"/>
+          <w:kern w:val="0"/>
+          <w:sz w:val="21"/>
+          <w:szCs w:val="21"/>
+          <w14:ligatures w14:val="none"/>
+        </w:rPr>
+        <w:tab/>
+      </w:r>
+      <w:r>
+        <w:rPr>
+          <w:rFonts w:ascii="Consolas" w:eastAsia="Times New Roman" w:hAnsi="Consolas" w:cs="Calibri"/>
+          <w:color w:val="3B3B3B"/>
+          <w:kern w:val="0"/>
+          <w:sz w:val="21"/>
+          <w:szCs w:val="21"/>
+          <w14:ligatures w14:val="none"/>
+        </w:rPr>
+        <w:t xml:space="preserve">    </w:t>
+      </w:r>
+      <w:r>
+        <w:rPr>
+          <w:rFonts w:ascii="Consolas" w:eastAsia="Times New Roman" w:hAnsi="Consolas" w:cs="Calibri"/>
+          <w:color w:val="3B3B3B"/>
+          <w:kern w:val="0"/>
+          <w:sz w:val="21"/>
+          <w:szCs w:val="21"/>
+          <w14:ligatures w14:val="none"/>
+        </w:rPr>
+        <w:t>},</w:t>
+      </w:r>
+    </w:p>
+    <w:p>
+      <w:pPr>
+        <w:spacing w:after="0" w:line="240" w:lineRule="auto"/>
+        <w:rPr>
+          <w:rFonts w:ascii="Consolas" w:eastAsia="Times New Roman" w:hAnsi="Consolas" w:cs="Calibri"/>
+          <w:kern w:val="0"/>
+          <w:sz w:val="21"/>
+          <w:szCs w:val="21"/>
+          <w14:ligatures w14:val="none"/>
+        </w:rPr>
+      </w:pPr>
+      <w:r>
+        <w:rPr>
+          <w:rFonts w:ascii="Consolas" w:eastAsia="Times New Roman" w:hAnsi="Consolas" w:cs="Calibri"/>
+          <w:color w:val="3B3B3B"/>
+          <w:kern w:val="0"/>
+          <w:sz w:val="21"/>
+          <w:szCs w:val="21"/>
+          <w14:ligatures w14:val="none"/>
+        </w:rPr>
+        <w:t xml:space="preserve">    </w:t>
+      </w:r>
+      <w:r>
+        <w:rPr>
+          <w:rFonts w:ascii="Consolas" w:eastAsia="Times New Roman" w:hAnsi="Consolas" w:cs="Calibri"/>
+          <w:color w:val="3B3B3B"/>
+          <w:kern w:val="0"/>
+          <w:sz w:val="21"/>
+          <w:szCs w:val="21"/>
+          <w14:ligatures w14:val="none"/>
+        </w:rPr>
+        <w:tab/>
+      </w:r>
+      <w:r>
+        <w:rPr>
+          <w:rFonts w:ascii="Consolas" w:eastAsia="Times New Roman" w:hAnsi="Consolas" w:cs="Calibri"/>
+          <w:color w:val="3B3B3B"/>
+          <w:kern w:val="0"/>
+          <w:sz w:val="21"/>
+          <w:szCs w:val="21"/>
+          <w14:ligatures w14:val="none"/>
+        </w:rPr>
+        <w:tab/>
+      </w:r>
+      <w:r>
+        <w:rPr>
+          <w:rFonts w:ascii="Consolas" w:eastAsia="Times New Roman" w:hAnsi="Consolas" w:cs="Calibri"/>
+          <w:color w:val="3B3B3B"/>
+          <w:kern w:val="0"/>
+          <w:sz w:val="21"/>
+          <w:szCs w:val="21"/>
+          <w14:ligatures w14:val="none"/>
+        </w:rPr>
         <w:t xml:space="preserve">    </w:t>
       </w:r>
       <w:r>
@@ -3263,7 +3580,31 @@
           <w:szCs w:val="21"/>
           <w14:ligatures w14:val="none"/>
         </w:rPr>
-        <w:t>"description"</w:t>
+        <w:t>"</w:t>
+      </w:r>
+      <w:proofErr w:type="spellStart"/>
+      <w:r>
+        <w:rPr>
+          <w:rFonts w:ascii="Consolas" w:eastAsia="Times New Roman" w:hAnsi="Consolas" w:cs="Calibri"/>
+          <w:color w:val="0451A5"/>
+          <w:kern w:val="0"/>
+          <w:sz w:val="21"/>
+          <w:szCs w:val="21"/>
+          <w14:ligatures w14:val="none"/>
+        </w:rPr>
+        <w:t>DefaultPrefix</w:t>
+      </w:r>
+      <w:proofErr w:type="spellEnd"/>
+      <w:r>
+        <w:rPr>
+          <w:rFonts w:ascii="Consolas" w:eastAsia="Times New Roman" w:hAnsi="Consolas" w:cs="Calibri"/>
+          <w:color w:val="0451A5"/>
+          <w:kern w:val="0"/>
+          <w:sz w:val="21"/>
+          <w:szCs w:val="21"/>
+          <w14:ligatures w14:val="none"/>
+        </w:rPr>
+        <w:t>"</w:t>
       </w:r>
       <w:r>
         <w:rPr>
@@ -3274,371 +3615,8 @@
           <w:szCs w:val="21"/>
           <w14:ligatures w14:val="none"/>
         </w:rPr>
-        <w:t xml:space="preserve">: </w:t>
-      </w:r>
-      <w:r>
-        <w:rPr>
-          <w:rFonts w:ascii="Consolas" w:eastAsia="Times New Roman" w:hAnsi="Consolas" w:cs="Calibri"/>
-          <w:color w:val="A31515"/>
-          <w:kern w:val="0"/>
-          <w:sz w:val="21"/>
-          <w:szCs w:val="21"/>
-          <w14:ligatures w14:val="none"/>
-        </w:rPr>
-        <w:t>"Default prefix for connecting to redfish"</w:t>
-      </w:r>
-      <w:r>
-        <w:rPr>
-          <w:rFonts w:ascii="Consolas" w:eastAsia="Times New Roman" w:hAnsi="Consolas" w:cs="Calibri"/>
-          <w:color w:val="3B3B3B"/>
-          <w:kern w:val="0"/>
-          <w:sz w:val="21"/>
-          <w:szCs w:val="21"/>
-          <w14:ligatures w14:val="none"/>
-        </w:rPr>
-        <w:t>,</w:t>
-      </w:r>
-    </w:p>
-    <w:p>
-      <w:pPr>
-        <w:spacing w:after="0" w:line="240" w:lineRule="auto"/>
-        <w:rPr>
-          <w:rFonts w:ascii="Consolas" w:eastAsia="Times New Roman" w:hAnsi="Consolas" w:cs="Calibri"/>
-          <w:kern w:val="0"/>
-          <w:sz w:val="21"/>
-          <w:szCs w:val="21"/>
-          <w14:ligatures w14:val="none"/>
-        </w:rPr>
-      </w:pPr>
-      <w:r>
-        <w:rPr>
-          <w:rFonts w:ascii="Consolas" w:eastAsia="Times New Roman" w:hAnsi="Consolas" w:cs="Calibri"/>
-          <w:color w:val="3B3B3B"/>
-          <w:kern w:val="0"/>
-          <w:sz w:val="21"/>
-          <w:szCs w:val="21"/>
-          <w14:ligatures w14:val="none"/>
-        </w:rPr>
-        <w:t xml:space="preserve">        </w:t>
-      </w:r>
-      <w:r>
-        <w:rPr>
-          <w:rFonts w:ascii="Consolas" w:eastAsia="Times New Roman" w:hAnsi="Consolas" w:cs="Calibri"/>
-          <w:color w:val="3B3B3B"/>
-          <w:kern w:val="0"/>
-          <w:sz w:val="21"/>
-          <w:szCs w:val="21"/>
-          <w14:ligatures w14:val="none"/>
-        </w:rPr>
-        <w:tab/>
-        <w:t xml:space="preserve">    </w:t>
-      </w:r>
-      <w:r>
-        <w:rPr>
-          <w:rFonts w:ascii="Consolas" w:eastAsia="Times New Roman" w:hAnsi="Consolas" w:cs="Calibri"/>
-          <w:color w:val="3B3B3B"/>
-          <w:kern w:val="0"/>
-          <w:sz w:val="21"/>
-          <w:szCs w:val="21"/>
-          <w14:ligatures w14:val="none"/>
-        </w:rPr>
-        <w:t xml:space="preserve">    </w:t>
-      </w:r>
-      <w:r>
-        <w:rPr>
-          <w:rFonts w:ascii="Consolas" w:eastAsia="Times New Roman" w:hAnsi="Consolas" w:cs="Calibri"/>
-          <w:color w:val="0451A5"/>
-          <w:kern w:val="0"/>
-          <w:sz w:val="21"/>
-          <w:szCs w:val="21"/>
-          <w14:ligatures w14:val="none"/>
-        </w:rPr>
-        <w:t>"type"</w:t>
-      </w:r>
-      <w:r>
-        <w:rPr>
-          <w:rFonts w:ascii="Consolas" w:eastAsia="Times New Roman" w:hAnsi="Consolas" w:cs="Calibri"/>
-          <w:color w:val="3B3B3B"/>
-          <w:kern w:val="0"/>
-          <w:sz w:val="21"/>
-          <w:szCs w:val="21"/>
-          <w14:ligatures w14:val="none"/>
-        </w:rPr>
-        <w:t xml:space="preserve">: </w:t>
-      </w:r>
-      <w:r>
-        <w:rPr>
-          <w:rFonts w:ascii="Consolas" w:eastAsia="Times New Roman" w:hAnsi="Consolas" w:cs="Calibri"/>
-          <w:color w:val="A31515"/>
-          <w:kern w:val="0"/>
-          <w:sz w:val="21"/>
-          <w:szCs w:val="21"/>
-          <w14:ligatures w14:val="none"/>
-        </w:rPr>
-        <w:t>"string"</w:t>
-      </w:r>
-      <w:r>
-        <w:rPr>
-          <w:rFonts w:ascii="Consolas" w:eastAsia="Times New Roman" w:hAnsi="Consolas" w:cs="Calibri"/>
-          <w:color w:val="3B3B3B"/>
-          <w:kern w:val="0"/>
-          <w:sz w:val="21"/>
-          <w:szCs w:val="21"/>
-          <w14:ligatures w14:val="none"/>
-        </w:rPr>
-        <w:t>,</w:t>
-      </w:r>
-    </w:p>
-    <w:p>
-      <w:pPr>
-        <w:spacing w:after="0" w:line="240" w:lineRule="auto"/>
-        <w:rPr>
-          <w:rFonts w:ascii="Consolas" w:eastAsia="Times New Roman" w:hAnsi="Consolas" w:cs="Calibri"/>
-          <w:kern w:val="0"/>
-          <w:sz w:val="21"/>
-          <w:szCs w:val="21"/>
-          <w14:ligatures w14:val="none"/>
-        </w:rPr>
-      </w:pPr>
-      <w:r>
-        <w:rPr>
-          <w:rFonts w:ascii="Consolas" w:eastAsia="Times New Roman" w:hAnsi="Consolas" w:cs="Calibri"/>
-          <w:color w:val="3B3B3B"/>
-          <w:kern w:val="0"/>
-          <w:sz w:val="21"/>
-          <w:szCs w:val="21"/>
-          <w14:ligatures w14:val="none"/>
-        </w:rPr>
-        <w:t xml:space="preserve">        </w:t>
-      </w:r>
-      <w:r>
-        <w:rPr>
-          <w:rFonts w:ascii="Consolas" w:eastAsia="Times New Roman" w:hAnsi="Consolas" w:cs="Calibri"/>
-          <w:color w:val="3B3B3B"/>
-          <w:kern w:val="0"/>
-          <w:sz w:val="21"/>
-          <w:szCs w:val="21"/>
-          <w14:ligatures w14:val="none"/>
-        </w:rPr>
-        <w:tab/>
-        <w:t xml:space="preserve">    </w:t>
-      </w:r>
-      <w:r>
-        <w:rPr>
-          <w:rFonts w:ascii="Consolas" w:eastAsia="Times New Roman" w:hAnsi="Consolas" w:cs="Calibri"/>
-          <w:color w:val="3B3B3B"/>
-          <w:kern w:val="0"/>
-          <w:sz w:val="21"/>
-          <w:szCs w:val="21"/>
-          <w14:ligatures w14:val="none"/>
-        </w:rPr>
-        <w:t xml:space="preserve">    </w:t>
-      </w:r>
-      <w:r>
-        <w:rPr>
-          <w:rFonts w:ascii="Consolas" w:eastAsia="Times New Roman" w:hAnsi="Consolas" w:cs="Calibri"/>
-          <w:color w:val="0451A5"/>
-          <w:kern w:val="0"/>
-          <w:sz w:val="21"/>
-          <w:szCs w:val="21"/>
-          <w14:ligatures w14:val="none"/>
-        </w:rPr>
-        <w:t>"value"</w:t>
-      </w:r>
-      <w:r>
-        <w:rPr>
-          <w:rFonts w:ascii="Consolas" w:eastAsia="Times New Roman" w:hAnsi="Consolas" w:cs="Calibri"/>
-          <w:color w:val="3B3B3B"/>
-          <w:kern w:val="0"/>
-          <w:sz w:val="21"/>
-          <w:szCs w:val="21"/>
-          <w14:ligatures w14:val="none"/>
-        </w:rPr>
-        <w:t xml:space="preserve">: </w:t>
-      </w:r>
-      <w:r>
-        <w:rPr>
-          <w:rFonts w:ascii="Consolas" w:eastAsia="Times New Roman" w:hAnsi="Consolas" w:cs="Calibri"/>
-          <w:color w:val="A31515"/>
-          <w:kern w:val="0"/>
-          <w:sz w:val="21"/>
-          <w:szCs w:val="21"/>
-          <w14:ligatures w14:val="none"/>
-        </w:rPr>
-        <w:t>"&lt;&gt;"</w:t>
-      </w:r>
-    </w:p>
-    <w:p>
-      <w:pPr>
-        <w:spacing w:after="0" w:line="240" w:lineRule="auto"/>
-        <w:rPr>
-          <w:rFonts w:ascii="Consolas" w:eastAsia="Times New Roman" w:hAnsi="Consolas" w:cs="Calibri"/>
-          <w:color w:val="3B3B3B"/>
-          <w:kern w:val="0"/>
-          <w:sz w:val="21"/>
-          <w:szCs w:val="21"/>
-          <w14:ligatures w14:val="none"/>
-        </w:rPr>
-      </w:pPr>
-      <w:r>
-        <w:rPr>
-          <w:rFonts w:ascii="Consolas" w:eastAsia="Times New Roman" w:hAnsi="Consolas" w:cs="Calibri"/>
-          <w:color w:val="3B3B3B"/>
-          <w:kern w:val="0"/>
-          <w:sz w:val="21"/>
-          <w:szCs w:val="21"/>
-          <w14:ligatures w14:val="none"/>
-        </w:rPr>
-        <w:t xml:space="preserve">    </w:t>
-      </w:r>
-      <w:r>
-        <w:rPr>
-          <w:rFonts w:ascii="Consolas" w:eastAsia="Times New Roman" w:hAnsi="Consolas" w:cs="Calibri"/>
-          <w:color w:val="3B3B3B"/>
-          <w:kern w:val="0"/>
-          <w:sz w:val="21"/>
-          <w:szCs w:val="21"/>
-          <w14:ligatures w14:val="none"/>
-        </w:rPr>
-        <w:tab/>
-      </w:r>
-      <w:r>
-        <w:rPr>
-          <w:rFonts w:ascii="Consolas" w:eastAsia="Times New Roman" w:hAnsi="Consolas" w:cs="Calibri"/>
-          <w:color w:val="3B3B3B"/>
-          <w:kern w:val="0"/>
-          <w:sz w:val="21"/>
-          <w:szCs w:val="21"/>
-          <w14:ligatures w14:val="none"/>
-        </w:rPr>
-        <w:tab/>
-      </w:r>
-      <w:r>
-        <w:rPr>
-          <w:rFonts w:ascii="Consolas" w:eastAsia="Times New Roman" w:hAnsi="Consolas" w:cs="Calibri"/>
-          <w:color w:val="3B3B3B"/>
-          <w:kern w:val="0"/>
-          <w:sz w:val="21"/>
-          <w:szCs w:val="21"/>
-          <w14:ligatures w14:val="none"/>
-        </w:rPr>
-        <w:t xml:space="preserve">    </w:t>
-      </w:r>
-      <w:r>
-        <w:rPr>
-          <w:rFonts w:ascii="Consolas" w:eastAsia="Times New Roman" w:hAnsi="Consolas" w:cs="Calibri"/>
-          <w:color w:val="3B3B3B"/>
-          <w:kern w:val="0"/>
-          <w:sz w:val="21"/>
-          <w:szCs w:val="21"/>
-          <w14:ligatures w14:val="none"/>
-        </w:rPr>
-        <w:t>},</w:t>
-      </w:r>
-    </w:p>
-    <w:p>
-      <w:pPr>
-        <w:spacing w:after="0" w:line="240" w:lineRule="auto"/>
-        <w:rPr>
-          <w:rFonts w:ascii="Consolas" w:eastAsia="Times New Roman" w:hAnsi="Consolas" w:cs="Calibri"/>
-          <w:kern w:val="0"/>
-          <w:sz w:val="21"/>
-          <w:szCs w:val="21"/>
-          <w14:ligatures w14:val="none"/>
-        </w:rPr>
-      </w:pPr>
-      <w:r>
-        <w:rPr>
-          <w:rFonts w:ascii="Consolas" w:eastAsia="Times New Roman" w:hAnsi="Consolas" w:cs="Calibri"/>
-          <w:color w:val="3B3B3B"/>
-          <w:kern w:val="0"/>
-          <w:sz w:val="21"/>
-          <w:szCs w:val="21"/>
-          <w14:ligatures w14:val="none"/>
-        </w:rPr>
-        <w:t xml:space="preserve">    </w:t>
-      </w:r>
-      <w:r>
-        <w:rPr>
-          <w:rFonts w:ascii="Consolas" w:eastAsia="Times New Roman" w:hAnsi="Consolas" w:cs="Calibri"/>
-          <w:color w:val="3B3B3B"/>
-          <w:kern w:val="0"/>
-          <w:sz w:val="21"/>
-          <w:szCs w:val="21"/>
-          <w14:ligatures w14:val="none"/>
-        </w:rPr>
-        <w:tab/>
-      </w:r>
-      <w:r>
-        <w:rPr>
-          <w:rFonts w:ascii="Consolas" w:eastAsia="Times New Roman" w:hAnsi="Consolas" w:cs="Calibri"/>
-          <w:color w:val="3B3B3B"/>
-          <w:kern w:val="0"/>
-          <w:sz w:val="21"/>
-          <w:szCs w:val="21"/>
-          <w14:ligatures w14:val="none"/>
-        </w:rPr>
-        <w:tab/>
-      </w:r>
-      <w:r>
-        <w:rPr>
-          <w:rFonts w:ascii="Consolas" w:eastAsia="Times New Roman" w:hAnsi="Consolas" w:cs="Calibri"/>
-          <w:color w:val="3B3B3B"/>
-          <w:kern w:val="0"/>
-          <w:sz w:val="21"/>
-          <w:szCs w:val="21"/>
-          <w14:ligatures w14:val="none"/>
-        </w:rPr>
-        <w:t xml:space="preserve">    </w:t>
-      </w:r>
-      <w:r>
-        <w:rPr>
-          <w:rFonts w:ascii="Consolas" w:eastAsia="Times New Roman" w:hAnsi="Consolas" w:cs="Calibri"/>
-          <w:color w:val="0451A5"/>
-          <w:kern w:val="0"/>
-          <w:sz w:val="21"/>
-          <w:szCs w:val="21"/>
-          <w14:ligatures w14:val="none"/>
-        </w:rPr>
-        <w:t>"</w:t>
-      </w:r>
-      <w:proofErr w:type="spellStart"/>
-      <w:proofErr w:type="gramStart"/>
-      <w:r>
-        <w:rPr>
-          <w:rFonts w:ascii="Consolas" w:eastAsia="Times New Roman" w:hAnsi="Consolas" w:cs="Calibri"/>
-          <w:color w:val="0451A5"/>
-          <w:kern w:val="0"/>
-          <w:sz w:val="21"/>
-          <w:szCs w:val="21"/>
-          <w14:ligatures w14:val="none"/>
-        </w:rPr>
-        <w:t>DefaultPrefix</w:t>
-      </w:r>
-      <w:proofErr w:type="spellEnd"/>
-      <w:r>
-        <w:rPr>
-          <w:rFonts w:ascii="Consolas" w:eastAsia="Times New Roman" w:hAnsi="Consolas" w:cs="Calibri"/>
-          <w:color w:val="0451A5"/>
-          <w:kern w:val="0"/>
-          <w:sz w:val="21"/>
-          <w:szCs w:val="21"/>
-          <w14:ligatures w14:val="none"/>
-        </w:rPr>
-        <w:t>"</w:t>
-      </w:r>
-      <w:r>
-        <w:rPr>
-          <w:rFonts w:ascii="Consolas" w:eastAsia="Times New Roman" w:hAnsi="Consolas" w:cs="Calibri"/>
-          <w:color w:val="3B3B3B"/>
-          <w:kern w:val="0"/>
-          <w:sz w:val="21"/>
-          <w:szCs w:val="21"/>
-          <w14:ligatures w14:val="none"/>
-        </w:rPr>
         <w:t>: {</w:t>
       </w:r>
-      <w:proofErr w:type="gramEnd"/>
     </w:p>
     <w:p>
       <w:pPr>
@@ -4098,21 +4076,9 @@
           <w:kern w:val="0"/>
           <w14:ligatures w14:val="none"/>
         </w:rPr>
-        <w:t>Redfish_config_</w:t>
-      </w:r>
-      <w:proofErr w:type="gramStart"/>
-      <w:r>
-        <w:rPr>
-          <w:rFonts w:ascii="Calibri" w:eastAsia="Times New Roman" w:hAnsi="Calibri" w:cs="Calibri"/>
-          <w:b/>
-          <w:bCs/>
-          <w:kern w:val="0"/>
-          <w14:ligatures w14:val="none"/>
-        </w:rPr>
-        <w:t>uri.json</w:t>
+        <w:t>Redfish_config_uri.json</w:t>
       </w:r>
       <w:proofErr w:type="spellEnd"/>
-      <w:proofErr w:type="gramEnd"/>
     </w:p>
     <w:p>
       <w:pPr>
@@ -4165,19 +4131,7 @@
           <w:szCs w:val="21"/>
           <w14:ligatures w14:val="none"/>
         </w:rPr>
-        <w:t>"GPU</w:t>
-      </w:r>
-      <w:proofErr w:type="gramStart"/>
-      <w:r>
-        <w:rPr>
-          <w:rFonts w:ascii="Consolas" w:eastAsia="Times New Roman" w:hAnsi="Consolas" w:cs="Calibri"/>
-          <w:color w:val="0451A5"/>
-          <w:kern w:val="0"/>
-          <w:sz w:val="21"/>
-          <w:szCs w:val="21"/>
-          <w14:ligatures w14:val="none"/>
-        </w:rPr>
-        <w:t>"</w:t>
+        <w:t>"GPU"</w:t>
       </w:r>
       <w:r>
         <w:rPr>
@@ -4190,7 +4144,6 @@
         </w:rPr>
         <w:t>:{</w:t>
       </w:r>
-      <w:proofErr w:type="gramEnd"/>
     </w:p>
     <w:p>
       <w:pPr>
@@ -4428,7 +4381,6 @@
           <w14:ligatures w14:val="none"/>
         </w:rPr>
       </w:pPr>
-      <w:proofErr w:type="gramStart"/>
       <w:r>
         <w:rPr>
           <w:rFonts w:ascii="Calibri" w:eastAsia="Times New Roman" w:hAnsi="Calibri" w:cs="Calibri"/>
@@ -4455,7 +4407,6 @@
         <w:t>netrc</w:t>
       </w:r>
       <w:proofErr w:type="spellEnd"/>
-      <w:proofErr w:type="gramEnd"/>
       <w:r>
         <w:rPr>
           <w:rFonts w:ascii="Calibri" w:eastAsia="Times New Roman" w:hAnsi="Calibri" w:cs="Calibri"/>
@@ -4817,7 +4768,7 @@
           <w:numId w:val="2"/>
         </w:numPr>
       </w:pPr>
-      <w:bookmarkStart w:id="7" w:name="_Toc193706972"/>
+      <w:bookmarkStart w:id="7" w:name="_Toc219207862"/>
       <w:r>
         <w:t>Basic Test Cases</w:t>
       </w:r>
@@ -5772,7 +5723,7 @@
       <w:pPr>
         <w:pStyle w:val="Heading1"/>
       </w:pPr>
-      <w:bookmarkStart w:id="8" w:name="_Toc193706973"/>
+      <w:bookmarkStart w:id="8" w:name="_Toc219207863"/>
       <w:r>
         <w:t>Enable &amp; Verify AC Cycle Test Case</w:t>
       </w:r>
@@ -5817,108 +5768,62 @@
           <w:sz w:val="22"/>
           <w:szCs w:val="22"/>
         </w:rPr>
-        <w:t xml:space="preserve">To run the below test </w:t>
-      </w:r>
-      <w:proofErr w:type="gramStart"/>
+        <w:t xml:space="preserve">To run the below test case we need this properties in </w:t>
+      </w:r>
+      <w:proofErr w:type="spellStart"/>
       <w:r>
         <w:rPr>
           <w:rFonts w:ascii="Calibri" w:hAnsi="Calibri" w:cs="Calibri"/>
           <w:sz w:val="22"/>
           <w:szCs w:val="22"/>
         </w:rPr>
-        <w:t>case</w:t>
-      </w:r>
-      <w:proofErr w:type="gramEnd"/>
+        <w:t>dut</w:t>
+      </w:r>
+      <w:proofErr w:type="spellEnd"/>
       <w:r>
         <w:rPr>
           <w:rFonts w:ascii="Calibri" w:hAnsi="Calibri" w:cs="Calibri"/>
           <w:sz w:val="22"/>
           <w:szCs w:val="22"/>
         </w:rPr>
-        <w:t xml:space="preserve"> we need </w:t>
-      </w:r>
-      <w:proofErr w:type="gramStart"/>
+        <w:t xml:space="preserve"> info, redfish config </w:t>
+      </w:r>
+      <w:proofErr w:type="spellStart"/>
       <w:r>
         <w:rPr>
           <w:rFonts w:ascii="Calibri" w:hAnsi="Calibri" w:cs="Calibri"/>
           <w:sz w:val="22"/>
           <w:szCs w:val="22"/>
         </w:rPr>
-        <w:t>this properties</w:t>
-      </w:r>
-      <w:proofErr w:type="gramEnd"/>
+        <w:t>uri</w:t>
+      </w:r>
+      <w:proofErr w:type="spellEnd"/>
       <w:r>
         <w:rPr>
           <w:rFonts w:ascii="Calibri" w:hAnsi="Calibri" w:cs="Calibri"/>
           <w:sz w:val="22"/>
           <w:szCs w:val="22"/>
         </w:rPr>
-        <w:t xml:space="preserve"> in </w:t>
-      </w:r>
-      <w:proofErr w:type="spellStart"/>
+        <w:t xml:space="preserve"> and</w:t>
+      </w:r>
       <w:r>
         <w:rPr>
           <w:rFonts w:ascii="Calibri" w:hAnsi="Calibri" w:cs="Calibri"/>
           <w:sz w:val="22"/>
           <w:szCs w:val="22"/>
         </w:rPr>
-        <w:t>dut</w:t>
-      </w:r>
-      <w:proofErr w:type="spellEnd"/>
+        <w:t xml:space="preserve"> .</w:t>
+      </w:r>
+      <w:proofErr w:type="spellStart"/>
       <w:r>
         <w:rPr>
           <w:rFonts w:ascii="Calibri" w:hAnsi="Calibri" w:cs="Calibri"/>
           <w:sz w:val="22"/>
           <w:szCs w:val="22"/>
         </w:rPr>
-        <w:t xml:space="preserve"> info, redfish config </w:t>
-      </w:r>
-      <w:proofErr w:type="spellStart"/>
-      <w:r>
-        <w:rPr>
-          <w:rFonts w:ascii="Calibri" w:hAnsi="Calibri" w:cs="Calibri"/>
-          <w:sz w:val="22"/>
-          <w:szCs w:val="22"/>
-        </w:rPr>
-        <w:t>uri</w:t>
+        <w:t>netrc</w:t>
       </w:r>
       <w:proofErr w:type="spellEnd"/>
-      <w:r>
-        <w:rPr>
-          <w:rFonts w:ascii="Calibri" w:hAnsi="Calibri" w:cs="Calibri"/>
-          <w:sz w:val="22"/>
-          <w:szCs w:val="22"/>
-        </w:rPr>
-        <w:t xml:space="preserve"> </w:t>
-      </w:r>
-      <w:proofErr w:type="gramStart"/>
-      <w:r>
-        <w:rPr>
-          <w:rFonts w:ascii="Calibri" w:hAnsi="Calibri" w:cs="Calibri"/>
-          <w:sz w:val="22"/>
-          <w:szCs w:val="22"/>
-        </w:rPr>
-        <w:t>and</w:t>
-      </w:r>
-      <w:r>
-        <w:rPr>
-          <w:rFonts w:ascii="Calibri" w:hAnsi="Calibri" w:cs="Calibri"/>
-          <w:sz w:val="22"/>
-          <w:szCs w:val="22"/>
-        </w:rPr>
-        <w:t xml:space="preserve"> .</w:t>
-      </w:r>
-      <w:proofErr w:type="spellStart"/>
-      <w:r>
-        <w:rPr>
-          <w:rFonts w:ascii="Calibri" w:hAnsi="Calibri" w:cs="Calibri"/>
-          <w:sz w:val="22"/>
-          <w:szCs w:val="22"/>
-        </w:rPr>
-        <w:t>netrc</w:t>
-      </w:r>
-      <w:proofErr w:type="spellEnd"/>
-      <w:proofErr w:type="gramEnd"/>
       <w:r>
         <w:rPr>
           <w:rFonts w:ascii="Calibri" w:hAnsi="Calibri" w:cs="Calibri"/>
@@ -5956,6 +5861,197 @@
           <w:sz w:val="22"/>
           <w:szCs w:val="22"/>
         </w:rPr>
+        <w:t>One of the following power cycle configurations are required</w:t>
+      </w:r>
+      <w:r>
+        <w:rPr>
+          <w:rFonts w:ascii="Calibri" w:hAnsi="Calibri" w:cs="Calibri"/>
+          <w:sz w:val="22"/>
+          <w:szCs w:val="22"/>
+        </w:rPr>
+        <w:t xml:space="preserve"> in </w:t>
+      </w:r>
+      <w:proofErr w:type="spellStart"/>
+      <w:r>
+        <w:rPr>
+          <w:rFonts w:ascii="Calibri" w:hAnsi="Calibri" w:cs="Calibri"/>
+          <w:sz w:val="22"/>
+          <w:szCs w:val="22"/>
+        </w:rPr>
+        <w:t>dut_info.json</w:t>
+      </w:r>
+      <w:proofErr w:type="spellEnd"/>
+    </w:p>
+    <w:p>
+      <w:pPr>
+        <w:pStyle w:val="NormalWeb"/>
+        <w:numPr>
+          <w:ilvl w:val="1"/>
+          <w:numId w:val="28"/>
+        </w:numPr>
+        <w:spacing w:before="0" w:beforeAutospacing="0" w:after="0" w:afterAutospacing="0"/>
+        <w:rPr>
+          <w:rFonts w:ascii="Calibri" w:hAnsi="Calibri" w:cs="Calibri"/>
+          <w:sz w:val="22"/>
+          <w:szCs w:val="22"/>
+        </w:rPr>
+      </w:pPr>
+      <w:r>
+        <w:rPr>
+          <w:rFonts w:ascii="Calibri" w:hAnsi="Calibri" w:cs="Calibri"/>
+          <w:sz w:val="22"/>
+          <w:szCs w:val="22"/>
+        </w:rPr>
+        <w:t xml:space="preserve">Define </w:t>
+      </w:r>
+      <w:r>
+        <w:rPr>
+          <w:rFonts w:ascii="Calibri" w:hAnsi="Calibri" w:cs="Calibri"/>
+          <w:sz w:val="22"/>
+          <w:szCs w:val="22"/>
+        </w:rPr>
+        <w:t>PowerOffCommand, PowerOnCommand</w:t>
+      </w:r>
+      <w:r>
+        <w:rPr>
+          <w:rFonts w:ascii="Calibri" w:hAnsi="Calibri" w:cs="Calibri"/>
+          <w:sz w:val="22"/>
+          <w:szCs w:val="22"/>
+        </w:rPr>
+        <w:t xml:space="preserve">,  PowerOffWaitTime, </w:t>
+      </w:r>
+      <w:proofErr w:type="spellStart"/>
+      <w:r>
+        <w:rPr>
+          <w:rFonts w:ascii="Calibri" w:hAnsi="Calibri" w:cs="Calibri"/>
+          <w:sz w:val="22"/>
+          <w:szCs w:val="22"/>
+        </w:rPr>
+        <w:t>PowerOnWaitTime</w:t>
+      </w:r>
+      <w:proofErr w:type="spellEnd"/>
+    </w:p>
+    <w:p>
+      <w:pPr>
+        <w:pStyle w:val="NormalWeb"/>
+        <w:spacing w:before="0" w:beforeAutospacing="0" w:after="0" w:afterAutospacing="0"/>
+        <w:ind w:left="2160"/>
+        <w:rPr>
+          <w:rFonts w:ascii="Calibri" w:hAnsi="Calibri" w:cs="Calibri"/>
+          <w:sz w:val="22"/>
+          <w:szCs w:val="22"/>
+        </w:rPr>
+      </w:pPr>
+      <w:r>
+        <w:rPr>
+          <w:rFonts w:ascii="Calibri" w:hAnsi="Calibri" w:cs="Calibri"/>
+          <w:sz w:val="22"/>
+          <w:szCs w:val="22"/>
+        </w:rPr>
+        <w:t>Or</w:t>
+      </w:r>
+    </w:p>
+    <w:p>
+      <w:pPr>
+        <w:pStyle w:val="NormalWeb"/>
+        <w:numPr>
+          <w:ilvl w:val="1"/>
+          <w:numId w:val="28"/>
+        </w:numPr>
+        <w:spacing w:before="0" w:beforeAutospacing="0" w:after="0" w:afterAutospacing="0"/>
+        <w:rPr>
+          <w:rFonts w:ascii="Calibri" w:hAnsi="Calibri" w:cs="Calibri"/>
+          <w:sz w:val="22"/>
+          <w:szCs w:val="22"/>
+        </w:rPr>
+      </w:pPr>
+      <w:r>
+        <w:rPr>
+          <w:rFonts w:ascii="Calibri" w:hAnsi="Calibri" w:cs="Calibri"/>
+          <w:sz w:val="22"/>
+          <w:szCs w:val="22"/>
+        </w:rPr>
+        <w:t xml:space="preserve">Set </w:t>
+      </w:r>
+      <w:proofErr w:type="spellStart"/>
+      <w:r>
+        <w:rPr>
+          <w:rFonts w:ascii="Calibri" w:hAnsi="Calibri" w:cs="Calibri"/>
+          <w:sz w:val="22"/>
+          <w:szCs w:val="22"/>
+        </w:rPr>
+        <w:t>SingleShotPowerCycle</w:t>
+      </w:r>
+      <w:proofErr w:type="spellEnd"/>
+      <w:r>
+        <w:rPr>
+          <w:rFonts w:ascii="Calibri" w:hAnsi="Calibri" w:cs="Calibri"/>
+          <w:sz w:val="22"/>
+          <w:szCs w:val="22"/>
+        </w:rPr>
+        <w:t xml:space="preserve"> to true and define </w:t>
+      </w:r>
+      <w:proofErr w:type="spellStart"/>
+      <w:r>
+        <w:rPr>
+          <w:rFonts w:ascii="Calibri" w:hAnsi="Calibri" w:cs="Calibri"/>
+          <w:sz w:val="22"/>
+          <w:szCs w:val="22"/>
+        </w:rPr>
+        <w:t>SingleShotPowerCycleCommand</w:t>
+      </w:r>
+      <w:proofErr w:type="spellEnd"/>
+      <w:r>
+        <w:rPr>
+          <w:rFonts w:ascii="Calibri" w:hAnsi="Calibri" w:cs="Calibri"/>
+          <w:sz w:val="22"/>
+          <w:szCs w:val="22"/>
+        </w:rPr>
+        <w:t xml:space="preserve">, </w:t>
+      </w:r>
+      <w:proofErr w:type="spellStart"/>
+      <w:r>
+        <w:rPr>
+          <w:rFonts w:ascii="Calibri" w:hAnsi="Calibri" w:cs="Calibri"/>
+          <w:sz w:val="22"/>
+          <w:szCs w:val="22"/>
+        </w:rPr>
+        <w:t>SingleShotPowerCycleTimeOut</w:t>
+      </w:r>
+      <w:proofErr w:type="spellEnd"/>
+    </w:p>
+    <w:p>
+      <w:pPr>
+        <w:pStyle w:val="NormalWeb"/>
+        <w:spacing w:before="0" w:beforeAutospacing="0" w:after="0" w:afterAutospacing="0"/>
+        <w:ind w:left="2160"/>
+        <w:rPr>
+          <w:rFonts w:ascii="Calibri" w:hAnsi="Calibri" w:cs="Calibri"/>
+          <w:sz w:val="22"/>
+          <w:szCs w:val="22"/>
+        </w:rPr>
+      </w:pPr>
+    </w:p>
+    <w:p>
+      <w:pPr>
+        <w:pStyle w:val="NormalWeb"/>
+        <w:numPr>
+          <w:ilvl w:val="0"/>
+          <w:numId w:val="28"/>
+        </w:numPr>
+        <w:spacing w:before="0" w:beforeAutospacing="0" w:after="0" w:afterAutospacing="0"/>
+        <w:rPr>
+          <w:rFonts w:ascii="Calibri" w:hAnsi="Calibri" w:cs="Calibri"/>
+          <w:sz w:val="22"/>
+          <w:szCs w:val="22"/>
+        </w:rPr>
+      </w:pPr>
+      <w:r>
+        <w:rPr>
+          <w:rFonts w:ascii="Calibri" w:hAnsi="Calibri" w:cs="Calibri"/>
+          <w:sz w:val="22"/>
+          <w:szCs w:val="22"/>
+        </w:rPr>
         <w:t xml:space="preserve">Make sure we have the required default configuration files in </w:t>
       </w:r>
       <w:r>
@@ -6007,6 +6103,7 @@
           <w:kern w:val="0"/>
           <w14:ligatures w14:val="none"/>
         </w:rPr>
+        <w:lastRenderedPageBreak/>
         <w:t>p</w:t>
       </w:r>
       <w:r>
@@ -6313,9 +6410,8 @@
       <w:pPr>
         <w:pStyle w:val="Heading1"/>
       </w:pPr>
-      <w:bookmarkStart w:id="9" w:name="_Toc193706974"/>
-      <w:r>
-        <w:lastRenderedPageBreak/>
+      <w:bookmarkStart w:id="9" w:name="_Toc219207864"/>
+      <w:r>
         <w:t>Execute Service Validator</w:t>
       </w:r>
       <w:bookmarkEnd w:id="9"/>
@@ -6735,37 +6831,21 @@
           <w:b/>
           <w:bCs/>
         </w:rPr>
-        <w:t xml:space="preserve">Note: </w:t>
-      </w:r>
-      <w:proofErr w:type="gramStart"/>
+        <w:t>Note: -</w:t>
+      </w:r>
       <w:r>
         <w:rPr>
           <w:rFonts w:ascii="Calibri" w:hAnsi="Calibri" w:cs="Calibri"/>
           <w:b/>
           <w:bCs/>
         </w:rPr>
-        <w:t>-</w:t>
-      </w:r>
-      <w:r>
-        <w:rPr>
-          <w:rFonts w:ascii="Calibri" w:hAnsi="Calibri" w:cs="Calibri"/>
-          <w:b/>
-          <w:bCs/>
-        </w:rPr>
         <w:t xml:space="preserve">  </w:t>
       </w:r>
       <w:r>
         <w:rPr>
           <w:rFonts w:ascii="Calibri" w:hAnsi="Calibri" w:cs="Calibri"/>
         </w:rPr>
-        <w:t>We</w:t>
-      </w:r>
-      <w:proofErr w:type="gramEnd"/>
-      <w:r>
-        <w:rPr>
-          <w:rFonts w:ascii="Calibri" w:hAnsi="Calibri" w:cs="Calibri"/>
-        </w:rPr>
-        <w:t xml:space="preserve"> need to mention in our test case which URI we are going to validate. For further information please </w:t>
+        <w:t xml:space="preserve">We need to mention in our test case which URI we are going to validate. For further information please </w:t>
       </w:r>
       <w:r>
         <w:rPr>
@@ -6793,11 +6873,700 @@
       <w:pPr>
         <w:pStyle w:val="Heading1"/>
       </w:pPr>
-      <w:bookmarkStart w:id="10" w:name="_Toc193706975"/>
+      <w:bookmarkStart w:id="10" w:name="_Toc219207865"/>
+      <w:r>
+        <w:t>FW Update Pre-requisites:</w:t>
+      </w:r>
+      <w:bookmarkEnd w:id="10"/>
+    </w:p>
+    <w:p>
+      <w:pPr>
+        <w:pStyle w:val="ListParagraph"/>
+        <w:numPr>
+          <w:ilvl w:val="0"/>
+          <w:numId w:val="41"/>
+        </w:numPr>
+        <w:rPr>
+          <w:rFonts w:ascii="Calibri" w:hAnsi="Calibri" w:cs="Calibri"/>
+        </w:rPr>
+      </w:pPr>
+      <w:r>
+        <w:rPr>
+          <w:rFonts w:ascii="Calibri" w:hAnsi="Calibri" w:cs="Calibri"/>
+        </w:rPr>
+        <w:t xml:space="preserve">The following </w:t>
+      </w:r>
+      <w:r>
+        <w:rPr>
+          <w:rFonts w:ascii="Calibri" w:hAnsi="Calibri" w:cs="Calibri"/>
+        </w:rPr>
+        <w:t xml:space="preserve">additional </w:t>
+      </w:r>
+      <w:r>
+        <w:rPr>
+          <w:rFonts w:ascii="Calibri" w:hAnsi="Calibri" w:cs="Calibri"/>
+        </w:rPr>
+        <w:t>configuration files are needed in the workspace directory for the firmware update flow.</w:t>
+      </w:r>
+    </w:p>
+    <w:p>
+      <w:pPr>
+        <w:pStyle w:val="ListParagraph"/>
+        <w:numPr>
+          <w:ilvl w:val="0"/>
+          <w:numId w:val="40"/>
+        </w:numPr>
+        <w:rPr>
+          <w:rFonts w:ascii="Calibri" w:hAnsi="Calibri" w:cs="Calibri"/>
+        </w:rPr>
+      </w:pPr>
+      <w:proofErr w:type="spellStart"/>
+      <w:r>
+        <w:rPr>
+          <w:rFonts w:ascii="Calibri" w:hAnsi="Calibri" w:cs="Calibri"/>
+        </w:rPr>
+        <w:t>dut_info.json</w:t>
+      </w:r>
+      <w:proofErr w:type="spellEnd"/>
+    </w:p>
+    <w:p>
+      <w:pPr>
+        <w:pStyle w:val="ListParagraph"/>
+        <w:numPr>
+          <w:ilvl w:val="0"/>
+          <w:numId w:val="40"/>
+        </w:numPr>
+        <w:rPr>
+          <w:rFonts w:ascii="Calibri" w:hAnsi="Calibri" w:cs="Calibri"/>
+        </w:rPr>
+      </w:pPr>
+      <w:proofErr w:type="spellStart"/>
+      <w:r>
+        <w:rPr>
+          <w:rFonts w:ascii="Calibri" w:hAnsi="Calibri" w:cs="Calibri"/>
+        </w:rPr>
+        <w:t>Redfish_uri_config.json</w:t>
+      </w:r>
+      <w:proofErr w:type="spellEnd"/>
+    </w:p>
+    <w:p>
+      <w:pPr>
+        <w:pStyle w:val="ListParagraph"/>
+        <w:numPr>
+          <w:ilvl w:val="0"/>
+          <w:numId w:val="40"/>
+        </w:numPr>
+        <w:rPr>
+          <w:rFonts w:ascii="Calibri" w:hAnsi="Calibri" w:cs="Calibri"/>
+        </w:rPr>
+      </w:pPr>
+      <w:proofErr w:type="spellStart"/>
+      <w:r>
+        <w:rPr>
+          <w:rFonts w:ascii="Calibri" w:hAnsi="Calibri" w:cs="Calibri"/>
+        </w:rPr>
+        <w:t>Package_info.json</w:t>
+      </w:r>
+      <w:proofErr w:type="spellEnd"/>
+    </w:p>
+    <w:p>
+      <w:pPr>
+        <w:pStyle w:val="ListParagraph"/>
+        <w:numPr>
+          <w:ilvl w:val="0"/>
+          <w:numId w:val="41"/>
+        </w:numPr>
+        <w:rPr>
+          <w:rFonts w:ascii="Calibri" w:hAnsi="Calibri" w:cs="Calibri"/>
+        </w:rPr>
+      </w:pPr>
+      <w:r>
+        <w:rPr>
+          <w:rFonts w:ascii="Calibri" w:hAnsi="Calibri" w:cs="Calibri"/>
+        </w:rPr>
+        <w:t xml:space="preserve">Required </w:t>
+      </w:r>
+      <w:r>
+        <w:rPr>
+          <w:rFonts w:ascii="Calibri" w:hAnsi="Calibri" w:cs="Calibri"/>
+        </w:rPr>
+        <w:t>properties</w:t>
+      </w:r>
+      <w:r>
+        <w:rPr>
+          <w:rFonts w:ascii="Calibri" w:hAnsi="Calibri" w:cs="Calibri"/>
+        </w:rPr>
+        <w:t xml:space="preserve"> </w:t>
+      </w:r>
+      <w:r>
+        <w:rPr>
+          <w:rFonts w:ascii="Calibri" w:hAnsi="Calibri" w:cs="Calibri"/>
+        </w:rPr>
+        <w:t xml:space="preserve">in </w:t>
+      </w:r>
+      <w:r>
+        <w:rPr>
+          <w:rFonts w:ascii="Calibri" w:hAnsi="Calibri" w:cs="Calibri"/>
+        </w:rPr>
+        <w:t xml:space="preserve">the </w:t>
+      </w:r>
+      <w:proofErr w:type="spellStart"/>
+      <w:r>
+        <w:rPr>
+          <w:rFonts w:ascii="Calibri" w:hAnsi="Calibri" w:cs="Calibri"/>
+        </w:rPr>
+        <w:t>dut_info.json</w:t>
+      </w:r>
+      <w:proofErr w:type="spellEnd"/>
+    </w:p>
+    <w:p>
+      <w:pPr>
+        <w:pStyle w:val="ListParagraph"/>
+        <w:numPr>
+          <w:ilvl w:val="1"/>
+          <w:numId w:val="41"/>
+        </w:numPr>
+        <w:rPr>
+          <w:rFonts w:ascii="Calibri" w:hAnsi="Calibri" w:cs="Calibri"/>
+        </w:rPr>
+      </w:pPr>
+      <w:r>
+        <w:rPr>
+          <w:rFonts w:ascii="Calibri" w:hAnsi="Calibri" w:cs="Calibri"/>
+        </w:rPr>
+        <w:t>One of the following power cycle configurations are required.</w:t>
+      </w:r>
+    </w:p>
+    <w:p>
+      <w:pPr>
+        <w:pStyle w:val="ListParagraph"/>
+        <w:numPr>
+          <w:ilvl w:val="2"/>
+          <w:numId w:val="41"/>
+        </w:numPr>
+        <w:rPr>
+          <w:rFonts w:ascii="Calibri" w:hAnsi="Calibri" w:cs="Calibri"/>
+        </w:rPr>
+      </w:pPr>
+      <w:r>
+        <w:rPr>
+          <w:rFonts w:ascii="Calibri" w:hAnsi="Calibri" w:cs="Calibri"/>
+        </w:rPr>
+        <w:t xml:space="preserve">Define PowerOffCommand,  PowerOnCommand,  PowerOffWaitTime, </w:t>
+      </w:r>
+      <w:proofErr w:type="spellStart"/>
+      <w:r>
+        <w:rPr>
+          <w:rFonts w:ascii="Calibri" w:hAnsi="Calibri" w:cs="Calibri"/>
+        </w:rPr>
+        <w:t>PowerOnWaitTime</w:t>
+      </w:r>
+      <w:proofErr w:type="spellEnd"/>
+    </w:p>
+    <w:p>
+      <w:pPr>
+        <w:pStyle w:val="ListParagraph"/>
+        <w:ind w:left="1080"/>
+        <w:rPr>
+          <w:rFonts w:ascii="Calibri" w:hAnsi="Calibri" w:cs="Calibri"/>
+        </w:rPr>
+      </w:pPr>
+      <w:r>
+        <w:rPr>
+          <w:rFonts w:ascii="Calibri" w:hAnsi="Calibri" w:cs="Calibri"/>
+        </w:rPr>
+        <w:t>or</w:t>
+      </w:r>
+    </w:p>
+    <w:p>
+      <w:pPr>
+        <w:pStyle w:val="ListParagraph"/>
+        <w:numPr>
+          <w:ilvl w:val="2"/>
+          <w:numId w:val="41"/>
+        </w:numPr>
+        <w:rPr>
+          <w:rFonts w:ascii="Calibri" w:hAnsi="Calibri" w:cs="Calibri"/>
+        </w:rPr>
+      </w:pPr>
+      <w:r>
+        <w:rPr>
+          <w:rFonts w:ascii="Calibri" w:hAnsi="Calibri" w:cs="Calibri"/>
+        </w:rPr>
+        <w:t xml:space="preserve">Set </w:t>
+      </w:r>
+      <w:proofErr w:type="spellStart"/>
+      <w:r>
+        <w:rPr>
+          <w:rFonts w:ascii="Calibri" w:hAnsi="Calibri" w:cs="Calibri"/>
+        </w:rPr>
+        <w:t>SingleShotPowerCycle</w:t>
+      </w:r>
+      <w:proofErr w:type="spellEnd"/>
+      <w:r>
+        <w:rPr>
+          <w:rFonts w:ascii="Calibri" w:hAnsi="Calibri" w:cs="Calibri"/>
+        </w:rPr>
+        <w:t xml:space="preserve"> to true and define </w:t>
+      </w:r>
+      <w:proofErr w:type="spellStart"/>
+      <w:r>
+        <w:rPr>
+          <w:rFonts w:ascii="Calibri" w:hAnsi="Calibri" w:cs="Calibri"/>
+        </w:rPr>
+        <w:t>SingleShotPowerCycleCommand</w:t>
+      </w:r>
+      <w:proofErr w:type="spellEnd"/>
+      <w:r>
+        <w:rPr>
+          <w:rFonts w:ascii="Calibri" w:hAnsi="Calibri" w:cs="Calibri"/>
+        </w:rPr>
+        <w:t>,</w:t>
+      </w:r>
+    </w:p>
+    <w:p>
+      <w:pPr>
+        <w:pStyle w:val="ListParagraph"/>
+        <w:ind w:left="1080"/>
+        <w:rPr>
+          <w:rFonts w:ascii="Calibri" w:hAnsi="Calibri" w:cs="Calibri"/>
+        </w:rPr>
+      </w:pPr>
+      <w:proofErr w:type="spellStart"/>
+      <w:r>
+        <w:rPr>
+          <w:rFonts w:ascii="Calibri" w:hAnsi="Calibri" w:cs="Calibri"/>
+        </w:rPr>
+        <w:t>SingleShotPowerCycleTimeOut</w:t>
+      </w:r>
+      <w:proofErr w:type="spellEnd"/>
+    </w:p>
+    <w:p>
+      <w:pPr>
+        <w:pStyle w:val="ListParagraph"/>
+        <w:numPr>
+          <w:ilvl w:val="1"/>
+          <w:numId w:val="41"/>
+        </w:numPr>
+        <w:rPr>
+          <w:rFonts w:ascii="Calibri" w:hAnsi="Calibri" w:cs="Calibri"/>
+        </w:rPr>
+      </w:pPr>
+      <w:r>
+        <w:rPr>
+          <w:rFonts w:ascii="Calibri" w:hAnsi="Calibri" w:cs="Calibri"/>
+        </w:rPr>
+        <w:t>The following timing parameters are mandatory:</w:t>
+      </w:r>
+    </w:p>
+    <w:p>
+      <w:pPr>
+        <w:pStyle w:val="ListParagraph"/>
+        <w:numPr>
+          <w:ilvl w:val="2"/>
+          <w:numId w:val="41"/>
+        </w:numPr>
+        <w:rPr>
+          <w:rFonts w:ascii="Calibri" w:hAnsi="Calibri" w:cs="Calibri"/>
+        </w:rPr>
+      </w:pPr>
+      <w:proofErr w:type="spellStart"/>
+      <w:r>
+        <w:rPr>
+          <w:rFonts w:ascii="Calibri" w:hAnsi="Calibri" w:cs="Calibri"/>
+        </w:rPr>
+        <w:t>FWStagingTimeMax</w:t>
+      </w:r>
+      <w:proofErr w:type="spellEnd"/>
+    </w:p>
+    <w:p>
+      <w:pPr>
+        <w:pStyle w:val="ListParagraph"/>
+        <w:numPr>
+          <w:ilvl w:val="2"/>
+          <w:numId w:val="41"/>
+        </w:numPr>
+        <w:rPr>
+          <w:rFonts w:ascii="Calibri" w:hAnsi="Calibri" w:cs="Calibri"/>
+        </w:rPr>
+      </w:pPr>
+      <w:proofErr w:type="spellStart"/>
+      <w:r>
+        <w:rPr>
+          <w:rFonts w:ascii="Calibri" w:hAnsi="Calibri" w:cs="Calibri"/>
+        </w:rPr>
+        <w:t>FWActivationTimeMax</w:t>
+      </w:r>
+      <w:proofErr w:type="spellEnd"/>
+    </w:p>
+    <w:p>
+      <w:pPr>
+        <w:pStyle w:val="ListParagraph"/>
+        <w:numPr>
+          <w:ilvl w:val="2"/>
+          <w:numId w:val="41"/>
+        </w:numPr>
+        <w:rPr>
+          <w:rFonts w:ascii="Calibri" w:hAnsi="Calibri" w:cs="Calibri"/>
+        </w:rPr>
+      </w:pPr>
+      <w:proofErr w:type="spellStart"/>
+      <w:r>
+        <w:rPr>
+          <w:rFonts w:ascii="Calibri" w:hAnsi="Calibri" w:cs="Calibri"/>
+        </w:rPr>
+        <w:t>IdleWaitTimeAfterFirmwareUpdate</w:t>
+      </w:r>
+      <w:proofErr w:type="spellEnd"/>
+    </w:p>
+    <w:p>
+      <w:pPr>
+        <w:pStyle w:val="ListParagraph"/>
+        <w:numPr>
+          <w:ilvl w:val="0"/>
+          <w:numId w:val="41"/>
+        </w:numPr>
+        <w:rPr>
+          <w:rFonts w:ascii="Calibri" w:hAnsi="Calibri" w:cs="Calibri"/>
+        </w:rPr>
+      </w:pPr>
+      <w:r>
+        <w:rPr>
+          <w:rFonts w:ascii="Calibri" w:hAnsi="Calibri" w:cs="Calibri"/>
+        </w:rPr>
+        <w:t xml:space="preserve">Required </w:t>
+      </w:r>
+      <w:r>
+        <w:rPr>
+          <w:rFonts w:ascii="Calibri" w:hAnsi="Calibri" w:cs="Calibri"/>
+        </w:rPr>
+        <w:t xml:space="preserve">properties </w:t>
+      </w:r>
+      <w:r>
+        <w:rPr>
+          <w:rFonts w:ascii="Calibri" w:hAnsi="Calibri" w:cs="Calibri"/>
+        </w:rPr>
+        <w:t xml:space="preserve">from the </w:t>
+      </w:r>
+      <w:proofErr w:type="spellStart"/>
+      <w:r>
+        <w:rPr>
+          <w:rFonts w:ascii="Calibri" w:hAnsi="Calibri" w:cs="Calibri"/>
+        </w:rPr>
+        <w:t>Redfish_uri_config.json</w:t>
+      </w:r>
+      <w:proofErr w:type="spellEnd"/>
+      <w:r>
+        <w:rPr>
+          <w:rFonts w:ascii="Calibri" w:hAnsi="Calibri" w:cs="Calibri"/>
+        </w:rPr>
+        <w:t xml:space="preserve"> are </w:t>
+      </w:r>
+      <w:proofErr w:type="spellStart"/>
+      <w:r>
+        <w:rPr>
+          <w:rFonts w:ascii="Calibri" w:hAnsi="Calibri" w:cs="Calibri"/>
+        </w:rPr>
+        <w:t>GPUCheckURI</w:t>
+      </w:r>
+      <w:proofErr w:type="spellEnd"/>
+    </w:p>
+    <w:p>
+      <w:pPr>
+        <w:shd w:val="clear" w:color="auto" w:fill="1F1F1F"/>
+        <w:spacing w:after="0" w:line="285" w:lineRule="atLeast"/>
+        <w:ind w:firstLine="720"/>
+        <w:rPr>
+          <w:rFonts w:ascii="Calibri" w:hAnsi="Calibri" w:cs="Calibri"/>
+        </w:rPr>
+      </w:pPr>
+      <w:r>
+        <w:rPr>
+          <w:rFonts w:ascii="Calibri" w:hAnsi="Calibri" w:cs="Calibri"/>
+        </w:rPr>
+        <w:t>"</w:t>
+      </w:r>
+      <w:proofErr w:type="spellStart"/>
+      <w:r>
+        <w:rPr>
+          <w:rFonts w:ascii="Calibri" w:hAnsi="Calibri" w:cs="Calibri"/>
+        </w:rPr>
+        <w:t>GPUCheckURI</w:t>
+      </w:r>
+      <w:proofErr w:type="spellEnd"/>
+      <w:r>
+        <w:rPr>
+          <w:rFonts w:ascii="Calibri" w:hAnsi="Calibri" w:cs="Calibri"/>
+        </w:rPr>
+        <w:t>":"/Managers/{</w:t>
+      </w:r>
+      <w:proofErr w:type="spellStart"/>
+      <w:r>
+        <w:rPr>
+          <w:rFonts w:ascii="Calibri" w:hAnsi="Calibri" w:cs="Calibri"/>
+        </w:rPr>
+        <w:t>ManagerID</w:t>
+      </w:r>
+      <w:proofErr w:type="spellEnd"/>
+      <w:r>
+        <w:rPr>
+          <w:rFonts w:ascii="Calibri" w:hAnsi="Calibri" w:cs="Calibri"/>
+        </w:rPr>
+        <w:t>}",</w:t>
+      </w:r>
+    </w:p>
+    <w:p>
+      <w:pPr>
+        <w:pStyle w:val="ListParagraph"/>
+        <w:ind w:left="360"/>
+        <w:rPr>
+          <w:rFonts w:ascii="Calibri" w:hAnsi="Calibri" w:cs="Calibri"/>
+        </w:rPr>
+      </w:pPr>
+      <w:r>
+        <w:rPr>
+          <w:rFonts w:ascii="Calibri" w:hAnsi="Calibri" w:cs="Calibri"/>
+        </w:rPr>
+        <w:t>Note: -</w:t>
+      </w:r>
+      <w:r>
+        <w:rPr>
+          <w:rFonts w:ascii="Calibri" w:hAnsi="Calibri" w:cs="Calibri"/>
+        </w:rPr>
+        <w:t xml:space="preserve"> </w:t>
+      </w:r>
+      <w:r>
+        <w:rPr>
+          <w:rFonts w:ascii="Calibri" w:hAnsi="Calibri" w:cs="Calibri"/>
+        </w:rPr>
+        <w:t>Replace {</w:t>
+      </w:r>
+      <w:proofErr w:type="spellStart"/>
+      <w:r>
+        <w:rPr>
+          <w:rFonts w:ascii="Calibri" w:hAnsi="Calibri" w:cs="Calibri"/>
+        </w:rPr>
+        <w:t>ManagerID</w:t>
+      </w:r>
+      <w:proofErr w:type="spellEnd"/>
+      <w:r>
+        <w:rPr>
+          <w:rFonts w:ascii="Calibri" w:hAnsi="Calibri" w:cs="Calibri"/>
+        </w:rPr>
+        <w:t>} with an actual Manager Identifier from your system’s mangers collection</w:t>
+      </w:r>
+    </w:p>
+    <w:p>
+      <w:pPr>
+        <w:pStyle w:val="ListParagraph"/>
+        <w:numPr>
+          <w:ilvl w:val="0"/>
+          <w:numId w:val="41"/>
+        </w:numPr>
+        <w:rPr>
+          <w:rFonts w:ascii="Calibri" w:hAnsi="Calibri" w:cs="Calibri"/>
+        </w:rPr>
+      </w:pPr>
+      <w:r>
+        <w:rPr>
+          <w:rFonts w:ascii="Calibri" w:hAnsi="Calibri" w:cs="Calibri"/>
+        </w:rPr>
+        <w:t xml:space="preserve">Fill all the entities under </w:t>
+      </w:r>
+      <w:proofErr w:type="spellStart"/>
+      <w:r>
+        <w:rPr>
+          <w:rFonts w:ascii="Calibri" w:hAnsi="Calibri" w:cs="Calibri"/>
+        </w:rPr>
+        <w:t>Package_info.json</w:t>
+      </w:r>
+      <w:proofErr w:type="spellEnd"/>
+      <w:r>
+        <w:rPr>
+          <w:rFonts w:ascii="Calibri" w:hAnsi="Calibri" w:cs="Calibri"/>
+        </w:rPr>
+        <w:t xml:space="preserve"> as they are used under different scenarios for positive and negative FW update flows.</w:t>
+      </w:r>
+    </w:p>
+    <w:p>
+      <w:pPr>
+        <w:pStyle w:val="ListParagraph"/>
+        <w:numPr>
+          <w:ilvl w:val="1"/>
+          <w:numId w:val="41"/>
+        </w:numPr>
+        <w:rPr>
+          <w:rFonts w:ascii="Calibri" w:hAnsi="Calibri" w:cs="Calibri"/>
+        </w:rPr>
+      </w:pPr>
+      <w:r>
+        <w:rPr>
+          <w:rFonts w:ascii="Calibri" w:hAnsi="Calibri" w:cs="Calibri"/>
+        </w:rPr>
+        <w:t>For N to N-1 FW update Scenarios:</w:t>
+      </w:r>
+    </w:p>
+    <w:p>
+      <w:pPr>
+        <w:pStyle w:val="ListParagraph"/>
+        <w:numPr>
+          <w:ilvl w:val="2"/>
+          <w:numId w:val="41"/>
+        </w:numPr>
+        <w:rPr>
+          <w:rFonts w:ascii="Calibri" w:hAnsi="Calibri" w:cs="Calibri"/>
+        </w:rPr>
+      </w:pPr>
+      <w:r>
+        <w:rPr>
+          <w:rFonts w:ascii="Calibri" w:hAnsi="Calibri" w:cs="Calibri"/>
+        </w:rPr>
+        <w:t>GPU_FW_IMAGE_OLD and GPU_FW_IMAGE_BACKUP entities will be used.</w:t>
+      </w:r>
+    </w:p>
+    <w:p>
+      <w:pPr>
+        <w:pStyle w:val="ListParagraph"/>
+        <w:numPr>
+          <w:ilvl w:val="1"/>
+          <w:numId w:val="41"/>
+        </w:numPr>
+        <w:rPr>
+          <w:rFonts w:ascii="Calibri" w:hAnsi="Calibri" w:cs="Calibri"/>
+        </w:rPr>
+      </w:pPr>
+      <w:r>
+        <w:rPr>
+          <w:rFonts w:ascii="Calibri" w:hAnsi="Calibri" w:cs="Calibri"/>
+        </w:rPr>
+        <w:lastRenderedPageBreak/>
+        <w:t>For N -1 to N FW update Scenarios:</w:t>
+      </w:r>
+    </w:p>
+    <w:p>
+      <w:pPr>
+        <w:pStyle w:val="ListParagraph"/>
+        <w:numPr>
+          <w:ilvl w:val="2"/>
+          <w:numId w:val="41"/>
+        </w:numPr>
+        <w:rPr>
+          <w:rFonts w:ascii="Calibri" w:hAnsi="Calibri" w:cs="Calibri"/>
+        </w:rPr>
+      </w:pPr>
+      <w:r>
+        <w:rPr>
+          <w:rFonts w:ascii="Calibri" w:hAnsi="Calibri" w:cs="Calibri"/>
+        </w:rPr>
+        <w:t>GPU_FW_IMAGE entity will be used</w:t>
+      </w:r>
+    </w:p>
+    <w:p>
+      <w:pPr>
+        <w:pStyle w:val="ListParagraph"/>
+        <w:numPr>
+          <w:ilvl w:val="1"/>
+          <w:numId w:val="41"/>
+        </w:numPr>
+        <w:rPr>
+          <w:rFonts w:ascii="Calibri" w:hAnsi="Calibri" w:cs="Calibri"/>
+        </w:rPr>
+      </w:pPr>
+      <w:r>
+        <w:rPr>
+          <w:rFonts w:ascii="Calibri" w:hAnsi="Calibri" w:cs="Calibri"/>
+        </w:rPr>
+        <w:t>For Negative FW update Scenarios:</w:t>
+      </w:r>
+    </w:p>
+    <w:p>
+      <w:pPr>
+        <w:pStyle w:val="ListParagraph"/>
+        <w:numPr>
+          <w:ilvl w:val="2"/>
+          <w:numId w:val="41"/>
+        </w:numPr>
+        <w:rPr>
+          <w:rFonts w:ascii="Calibri" w:hAnsi="Calibri" w:cs="Calibri"/>
+        </w:rPr>
+      </w:pPr>
+      <w:r>
+        <w:rPr>
+          <w:rFonts w:ascii="Calibri" w:hAnsi="Calibri" w:cs="Calibri"/>
+        </w:rPr>
+        <w:t>GPU_FW_IMAGE_LARGE, GPU_FW_IMAGE_INVALID_SIGNED, GPU_FW_IMAGE_UNSIGNED_COMPONENT, GPU_FW_IMAGE_UNSIGNED_BUNDLE,</w:t>
+      </w:r>
+    </w:p>
+    <w:p>
+      <w:pPr>
+        <w:pStyle w:val="ListParagraph"/>
+        <w:ind w:left="1080"/>
+        <w:rPr>
+          <w:rFonts w:ascii="Calibri" w:hAnsi="Calibri" w:cs="Calibri"/>
+        </w:rPr>
+      </w:pPr>
+      <w:r>
+        <w:rPr>
+          <w:rFonts w:ascii="Calibri" w:hAnsi="Calibri" w:cs="Calibri"/>
+        </w:rPr>
+        <w:t>GPU_FW_IMAGE_CORRUPT, GPU_FW_CORRUPT_COMPONENT</w:t>
+      </w:r>
+      <w:r>
+        <w:rPr>
+          <w:rFonts w:ascii="Calibri" w:hAnsi="Calibri" w:cs="Calibri"/>
+        </w:rPr>
+        <w:t xml:space="preserve"> </w:t>
+      </w:r>
+      <w:r>
+        <w:rPr>
+          <w:rFonts w:ascii="Calibri" w:hAnsi="Calibri" w:cs="Calibri"/>
+        </w:rPr>
+        <w:t>entities</w:t>
+      </w:r>
+      <w:r>
+        <w:rPr>
+          <w:rFonts w:ascii="Calibri" w:hAnsi="Calibri" w:cs="Calibri"/>
+        </w:rPr>
+        <w:t xml:space="preserve"> </w:t>
+      </w:r>
+      <w:r>
+        <w:rPr>
+          <w:rFonts w:ascii="Calibri" w:hAnsi="Calibri" w:cs="Calibri"/>
+        </w:rPr>
+        <w:t>are being</w:t>
+      </w:r>
+      <w:r>
+        <w:rPr>
+          <w:rFonts w:ascii="Calibri" w:hAnsi="Calibri" w:cs="Calibri"/>
+        </w:rPr>
+        <w:t xml:space="preserve"> used.</w:t>
+      </w:r>
+      <w:r>
+        <w:rPr>
+          <w:rFonts w:ascii="Calibri" w:hAnsi="Calibri" w:cs="Calibri"/>
+        </w:rPr>
+        <w:br/>
+      </w:r>
+    </w:p>
+    <w:p>
+      <w:pPr>
+        <w:pStyle w:val="ListParagraph"/>
+      </w:pPr>
+    </w:p>
+    <w:p>
+      <w:pPr>
+        <w:pStyle w:val="ListParagraph"/>
+      </w:pPr>
+    </w:p>
+    <w:p>
+      <w:pPr>
+        <w:pStyle w:val="Heading1"/>
+      </w:pPr>
+      <w:bookmarkStart w:id="11" w:name="_Toc219207866"/>
       <w:r>
         <w:t>Full FW Update Flow</w:t>
       </w:r>
-      <w:bookmarkEnd w:id="10"/>
+      <w:bookmarkEnd w:id="11"/>
     </w:p>
     <w:p>
       <w:pPr>
@@ -6808,26 +7577,13 @@
         </w:numPr>
       </w:pPr>
       <w:r>
-        <w:t xml:space="preserve">For running </w:t>
-      </w:r>
-      <w:proofErr w:type="gramStart"/>
-      <w:r>
-        <w:t>firmware update test cases</w:t>
-      </w:r>
-      <w:proofErr w:type="gramEnd"/>
-      <w:r>
-        <w:t xml:space="preserve"> we need additional configuration file which is </w:t>
+        <w:t xml:space="preserve">For running firmware update test cases we need additional configuration file which is </w:t>
       </w:r>
       <w:proofErr w:type="spellStart"/>
       <w:r>
-        <w:t>package_</w:t>
-      </w:r>
-      <w:proofErr w:type="gramStart"/>
-      <w:r>
-        <w:t>info.json</w:t>
+        <w:t>package_info.json</w:t>
       </w:r>
       <w:proofErr w:type="spellEnd"/>
-      <w:proofErr w:type="gramEnd"/>
       <w:r>
         <w:t xml:space="preserve"> in </w:t>
       </w:r>
@@ -6910,19 +7666,7 @@
           <w:szCs w:val="21"/>
           <w14:ligatures w14:val="none"/>
         </w:rPr>
-        <w:t>"GPU_FW_IMAGE</w:t>
-      </w:r>
-      <w:proofErr w:type="gramStart"/>
-      <w:r>
-        <w:rPr>
-          <w:rFonts w:ascii="Consolas" w:eastAsia="Times New Roman" w:hAnsi="Consolas" w:cs="Times New Roman"/>
-          <w:color w:val="0451A5"/>
-          <w:kern w:val="0"/>
-          <w:sz w:val="21"/>
-          <w:szCs w:val="21"/>
-          <w14:ligatures w14:val="none"/>
-        </w:rPr>
-        <w:t>"</w:t>
+        <w:t>"GPU_FW_IMAGE"</w:t>
       </w:r>
       <w:r>
         <w:rPr>
@@ -6935,7 +7679,6 @@
         </w:rPr>
         <w:t>: {</w:t>
       </w:r>
-      <w:proofErr w:type="gramEnd"/>
     </w:p>
     <w:p>
       <w:pPr>
@@ -7143,9 +7886,8 @@
           <w:szCs w:val="21"/>
           <w14:ligatures w14:val="none"/>
         </w:rPr>
-        <w:t>fwpkg_file_to_</w:t>
-      </w:r>
-      <w:proofErr w:type="gramStart"/>
+        <w:t>fwpkg_file_to_update</w:t>
+      </w:r>
       <w:r>
         <w:rPr>
           <w:rFonts w:ascii="Consolas" w:eastAsia="Times New Roman" w:hAnsi="Consolas" w:cs="Times New Roman"/>
@@ -7155,21 +7897,9 @@
           <w:szCs w:val="21"/>
           <w14:ligatures w14:val="none"/>
         </w:rPr>
-        <w:t>update</w:t>
-      </w:r>
-      <w:r>
-        <w:rPr>
-          <w:rFonts w:ascii="Consolas" w:eastAsia="Times New Roman" w:hAnsi="Consolas" w:cs="Times New Roman"/>
-          <w:color w:val="A31515"/>
-          <w:kern w:val="0"/>
-          <w:sz w:val="21"/>
-          <w:szCs w:val="21"/>
-          <w14:ligatures w14:val="none"/>
-        </w:rPr>
         <w:t>.fwpkg</w:t>
       </w:r>
       <w:proofErr w:type="spellEnd"/>
-      <w:proofErr w:type="gramEnd"/>
       <w:r>
         <w:rPr>
           <w:rFonts w:ascii="Consolas" w:eastAsia="Times New Roman" w:hAnsi="Consolas" w:cs="Times New Roman"/>
@@ -7397,9 +8127,8 @@
           <w:szCs w:val="21"/>
           <w14:ligatures w14:val="none"/>
         </w:rPr>
-        <w:t>fwpkg_json_</w:t>
-      </w:r>
-      <w:proofErr w:type="gramStart"/>
+        <w:t>fwpkg_json_file</w:t>
+      </w:r>
       <w:r>
         <w:rPr>
           <w:rFonts w:ascii="Consolas" w:eastAsia="Times New Roman" w:hAnsi="Consolas" w:cs="Times New Roman"/>
@@ -7409,21 +8138,9 @@
           <w:szCs w:val="21"/>
           <w14:ligatures w14:val="none"/>
         </w:rPr>
-        <w:t>file</w:t>
-      </w:r>
-      <w:r>
-        <w:rPr>
-          <w:rFonts w:ascii="Consolas" w:eastAsia="Times New Roman" w:hAnsi="Consolas" w:cs="Times New Roman"/>
-          <w:color w:val="A31515"/>
-          <w:kern w:val="0"/>
-          <w:sz w:val="21"/>
-          <w:szCs w:val="21"/>
-          <w14:ligatures w14:val="none"/>
-        </w:rPr>
         <w:t>.json</w:t>
       </w:r>
       <w:proofErr w:type="spellEnd"/>
-      <w:proofErr w:type="gramEnd"/>
       <w:r>
         <w:rPr>
           <w:rFonts w:ascii="Consolas" w:eastAsia="Times New Roman" w:hAnsi="Consolas" w:cs="Times New Roman"/>
@@ -7729,61 +8446,7 @@
           <w:kern w:val="0"/>
           <w14:ligatures w14:val="none"/>
         </w:rPr>
-        <w:t xml:space="preserve">After </w:t>
-      </w:r>
-      <w:proofErr w:type="gramStart"/>
-      <w:r>
-        <w:rPr>
-          <w:rFonts w:ascii="Calibri" w:eastAsia="Times New Roman" w:hAnsi="Calibri" w:cs="Calibri"/>
-          <w:kern w:val="0"/>
-          <w14:ligatures w14:val="none"/>
-        </w:rPr>
-        <w:t>firmware</w:t>
-      </w:r>
-      <w:proofErr w:type="gramEnd"/>
-      <w:r>
-        <w:rPr>
-          <w:rFonts w:ascii="Calibri" w:eastAsia="Times New Roman" w:hAnsi="Calibri" w:cs="Calibri"/>
-          <w:kern w:val="0"/>
-          <w14:ligatures w14:val="none"/>
-        </w:rPr>
-        <w:t xml:space="preserve"> update </w:t>
-      </w:r>
-      <w:proofErr w:type="gramStart"/>
-      <w:r>
-        <w:rPr>
-          <w:rFonts w:ascii="Calibri" w:eastAsia="Times New Roman" w:hAnsi="Calibri" w:cs="Calibri"/>
-          <w:kern w:val="0"/>
-          <w14:ligatures w14:val="none"/>
-        </w:rPr>
-        <w:t>completed</w:t>
-      </w:r>
-      <w:proofErr w:type="gramEnd"/>
-      <w:r>
-        <w:rPr>
-          <w:rFonts w:ascii="Calibri" w:eastAsia="Times New Roman" w:hAnsi="Calibri" w:cs="Calibri"/>
-          <w:kern w:val="0"/>
-          <w14:ligatures w14:val="none"/>
-        </w:rPr>
-        <w:t xml:space="preserve"> we need to </w:t>
-      </w:r>
-      <w:proofErr w:type="gramStart"/>
-      <w:r>
-        <w:rPr>
-          <w:rFonts w:ascii="Calibri" w:eastAsia="Times New Roman" w:hAnsi="Calibri" w:cs="Calibri"/>
-          <w:kern w:val="0"/>
-          <w14:ligatures w14:val="none"/>
-        </w:rPr>
-        <w:t>verify that</w:t>
-      </w:r>
-      <w:proofErr w:type="gramEnd"/>
-      <w:r>
-        <w:rPr>
-          <w:rFonts w:ascii="Calibri" w:eastAsia="Times New Roman" w:hAnsi="Calibri" w:cs="Calibri"/>
-          <w:kern w:val="0"/>
-          <w14:ligatures w14:val="none"/>
-        </w:rPr>
-        <w:t xml:space="preserve"> if the firmware is updated correctly or not. If verified, then test case passed else fail</w:t>
+        <w:t>After firmware update completed we need to verify that if the firmware is updated correctly or not. If verified, then test case passed else fail</w:t>
       </w:r>
       <w:r>
         <w:rPr>
@@ -8131,11 +8794,11 @@
       <w:pPr>
         <w:pStyle w:val="Heading1"/>
       </w:pPr>
-      <w:bookmarkStart w:id="11" w:name="_Toc193706976"/>
+      <w:bookmarkStart w:id="12" w:name="_Toc219207867"/>
       <w:r>
         <w:t>Full FW Rollback Flow</w:t>
       </w:r>
-      <w:bookmarkEnd w:id="11"/>
+      <w:bookmarkEnd w:id="12"/>
     </w:p>
     <w:p>
       <w:pPr>
@@ -8146,26 +8809,13 @@
         </w:numPr>
       </w:pPr>
       <w:r>
-        <w:t xml:space="preserve">For running </w:t>
-      </w:r>
-      <w:proofErr w:type="gramStart"/>
-      <w:r>
-        <w:t>firmware update test cases</w:t>
-      </w:r>
-      <w:proofErr w:type="gramEnd"/>
-      <w:r>
-        <w:t xml:space="preserve"> we need additional configuration file which is </w:t>
+        <w:t xml:space="preserve">For running firmware update test cases we need additional configuration file which is </w:t>
       </w:r>
       <w:proofErr w:type="spellStart"/>
       <w:r>
-        <w:t>package_</w:t>
-      </w:r>
-      <w:proofErr w:type="gramStart"/>
-      <w:r>
-        <w:t>info.json</w:t>
+        <w:t>package_info.json</w:t>
       </w:r>
       <w:proofErr w:type="spellEnd"/>
-      <w:proofErr w:type="gramEnd"/>
       <w:r>
         <w:t xml:space="preserve"> in the workspace directory.</w:t>
       </w:r>
@@ -8199,7 +8849,6 @@
         </w:numPr>
       </w:pPr>
       <w:r>
-        <w:lastRenderedPageBreak/>
         <w:t>{</w:t>
       </w:r>
     </w:p>
@@ -8250,7 +8899,6 @@
         </w:rPr>
         <w:t>GPU_FW_IMAGE_BACKUP</w:t>
       </w:r>
-      <w:proofErr w:type="gramStart"/>
       <w:r>
         <w:rPr>
           <w:rFonts w:ascii="Consolas" w:eastAsia="Times New Roman" w:hAnsi="Consolas" w:cs="Times New Roman"/>
@@ -8273,7 +8921,6 @@
         </w:rPr>
         <w:t>{</w:t>
       </w:r>
-      <w:proofErr w:type="gramEnd"/>
     </w:p>
     <w:p>
       <w:pPr>
@@ -8298,6 +8945,7 @@
           <w:szCs w:val="21"/>
           <w14:ligatures w14:val="none"/>
         </w:rPr>
+        <w:lastRenderedPageBreak/>
         <w:t xml:space="preserve">    </w:t>
       </w:r>
       <w:r>
@@ -8481,9 +9129,8 @@
           <w:szCs w:val="21"/>
           <w14:ligatures w14:val="none"/>
         </w:rPr>
-        <w:t>fwpkg_file_to_</w:t>
-      </w:r>
-      <w:proofErr w:type="gramStart"/>
+        <w:t>fwpkg_file_to_update</w:t>
+      </w:r>
       <w:r>
         <w:rPr>
           <w:rFonts w:ascii="Consolas" w:eastAsia="Times New Roman" w:hAnsi="Consolas" w:cs="Times New Roman"/>
@@ -8493,21 +9140,9 @@
           <w:szCs w:val="21"/>
           <w14:ligatures w14:val="none"/>
         </w:rPr>
-        <w:t>update</w:t>
-      </w:r>
-      <w:r>
-        <w:rPr>
-          <w:rFonts w:ascii="Consolas" w:eastAsia="Times New Roman" w:hAnsi="Consolas" w:cs="Times New Roman"/>
-          <w:color w:val="A31515"/>
-          <w:kern w:val="0"/>
-          <w:sz w:val="21"/>
-          <w:szCs w:val="21"/>
-          <w14:ligatures w14:val="none"/>
-        </w:rPr>
         <w:t>.fwpkg</w:t>
       </w:r>
       <w:proofErr w:type="spellEnd"/>
-      <w:proofErr w:type="gramEnd"/>
       <w:r>
         <w:rPr>
           <w:rFonts w:ascii="Consolas" w:eastAsia="Times New Roman" w:hAnsi="Consolas" w:cs="Times New Roman"/>
@@ -8735,9 +9370,8 @@
           <w:szCs w:val="21"/>
           <w14:ligatures w14:val="none"/>
         </w:rPr>
-        <w:t>fwpkg_json_</w:t>
-      </w:r>
-      <w:proofErr w:type="gramStart"/>
+        <w:t>fwpkg_json_file</w:t>
+      </w:r>
       <w:r>
         <w:rPr>
           <w:rFonts w:ascii="Consolas" w:eastAsia="Times New Roman" w:hAnsi="Consolas" w:cs="Times New Roman"/>
@@ -8747,21 +9381,9 @@
           <w:szCs w:val="21"/>
           <w14:ligatures w14:val="none"/>
         </w:rPr>
-        <w:t>file</w:t>
-      </w:r>
-      <w:r>
-        <w:rPr>
-          <w:rFonts w:ascii="Consolas" w:eastAsia="Times New Roman" w:hAnsi="Consolas" w:cs="Times New Roman"/>
-          <w:color w:val="A31515"/>
-          <w:kern w:val="0"/>
-          <w:sz w:val="21"/>
-          <w:szCs w:val="21"/>
-          <w14:ligatures w14:val="none"/>
-        </w:rPr>
         <w:t>.json</w:t>
       </w:r>
       <w:proofErr w:type="spellEnd"/>
-      <w:proofErr w:type="gramEnd"/>
       <w:r>
         <w:rPr>
           <w:rFonts w:ascii="Consolas" w:eastAsia="Times New Roman" w:hAnsi="Consolas" w:cs="Times New Roman"/>
@@ -9463,8 +10085,8 @@
       <w:pPr>
         <w:pStyle w:val="Heading1"/>
       </w:pPr>
-      <w:bookmarkStart w:id="12" w:name="_Toc193706520"/>
-      <w:bookmarkStart w:id="13" w:name="_Toc193706977"/>
+      <w:bookmarkStart w:id="13" w:name="_Toc193706520"/>
+      <w:bookmarkStart w:id="14" w:name="_Toc219207868"/>
       <w:r>
         <w:t xml:space="preserve">CTAM </w:t>
       </w:r>
@@ -9474,8 +10096,8 @@
       <w:r>
         <w:t xml:space="preserve"> Guide</w:t>
       </w:r>
-      <w:bookmarkEnd w:id="12"/>
       <w:bookmarkEnd w:id="13"/>
+      <w:bookmarkEnd w:id="14"/>
     </w:p>
     <w:p>
       <w:pPr>
@@ -9612,7 +10234,10 @@
       </w:r>
     </w:p>
     <w:sectPr>
-      <w:footerReference w:type="default" r:id="rId14"/>
+      <w:headerReference w:type="even" r:id="rId14"/>
+      <w:headerReference w:type="default" r:id="rId15"/>
+      <w:footerReference w:type="default" r:id="rId16"/>
+      <w:headerReference w:type="first" r:id="rId17"/>
       <w:pgSz w:w="12240" w:h="15840"/>
       <w:pgMar w:top="1440" w:right="1440" w:bottom="1440" w:left="1440" w:header="720" w:footer="720" w:gutter="0"/>
       <w:cols w:space="720"/>
@@ -9739,6 +10364,396 @@
 </w:footnotes>
 </file>
 
+<file path=word/header1.xml><?xml version="1.0" encoding="utf-8"?>
+<w:hdr xmlns:wpc="http://schemas.microsoft.com/office/word/2010/wordprocessingCanvas" xmlns:cx="http://schemas.microsoft.com/office/drawing/2014/chartex" xmlns:cx1="http://schemas.microsoft.com/office/drawing/2015/9/8/chartex" xmlns:cx2="http://schemas.microsoft.com/office/drawing/2015/10/21/chartex" xmlns:cx3="http://schemas.microsoft.com/office/drawing/2016/5/9/chartex" xmlns:cx4="http://schemas.microsoft.com/office/drawing/2016/5/10/chartex" xmlns:cx5="http://schemas.microsoft.com/office/drawing/2016/5/11/chartex" xmlns:cx6="http://schemas.microsoft.com/office/drawing/2016/5/12/chartex" xmlns:cx7="http://schemas.microsoft.com/office/drawing/2016/5/13/chartex" xmlns:cx8="http://schemas.microsoft.com/office/drawing/2016/5/14/chartex" xmlns:mc="http://schemas.openxmlformats.org/markup-compatibility/2006" xmlns:aink="http://schemas.microsoft.com/office/drawing/2016/ink" xmlns:am3d="http://schemas.microsoft.com/office/drawing/2017/model3d" xmlns:o="urn:schemas-microsoft-com:office:office" xmlns:oel="http://schemas.microsoft.com/office/2019/extlst" xmlns:r="http://schemas.openxmlformats.org/officeDocument/2006/relationships" xmlns:m="http://schemas.openxmlformats.org/officeDocument/2006/math" xmlns:v="urn:schemas-microsoft-com:vml" xmlns:wp14="http://schemas.microsoft.com/office/word/2010/wordprocessingDrawing" xmlns:wp="http://schemas.openxmlformats.org/drawingml/2006/wordprocessingDrawing" xmlns:w10="urn:schemas-microsoft-com:office:word" xmlns:w="http://schemas.openxmlformats.org/wordprocessingml/2006/main" xmlns:w14="http://schemas.microsoft.com/office/word/2010/wordml" xmlns:w15="http://schemas.microsoft.com/office/word/2012/wordml" xmlns:w16cex="http://schemas.microsoft.com/office/word/2018/wordml/cex" xmlns:w16cid="http://schemas.microsoft.com/office/word/2016/wordml/cid" xmlns:w16="http://schemas.microsoft.com/office/word/2018/wordml" xmlns:w16du="http://schemas.microsoft.com/office/word/2023/wordml/word16du" xmlns:w16sdtdh="http://schemas.microsoft.com/office/word/2020/wordml/sdtdatahash" xmlns:w16sdtfl="http://schemas.microsoft.com/office/word/2024/wordml/sdtformatlock" xmlns:w16se="http://schemas.microsoft.com/office/word/2015/wordml/symex" xmlns:wpg="http://schemas.microsoft.com/office/word/2010/wordprocessingGroup" xmlns:wpi="http://schemas.microsoft.com/office/word/2010/wordprocessingInk" xmlns:wne="http://schemas.microsoft.com/office/word/2006/wordml" xmlns:wps="http://schemas.microsoft.com/office/word/2010/wordprocessingShape" mc:Ignorable="w14 w15 w16se w16cid w16 w16cex w16sdtdh w16sdtfl w16du wp14">
+  <w:p>
+    <w:pPr>
+      <w:pStyle w:val="Header"/>
+    </w:pPr>
+    <w:r>
+      <w:rPr>
+        <w:noProof/>
+      </w:rPr>
+      <mc:AlternateContent>
+        <mc:Choice Requires="wps">
+          <w:drawing>
+            <wp:anchor distT="0" distB="0" distL="0" distR="0" simplePos="0" relativeHeight="251659264" behindDoc="0" locked="0" layoutInCell="1" allowOverlap="1" wp14:anchorId="368D827E" wp14:editId="7EA55285">
+              <wp:simplePos x="635" y="635"/>
+              <wp:positionH relativeFrom="page">
+                <wp:align>left</wp:align>
+              </wp:positionH>
+              <wp:positionV relativeFrom="page">
+                <wp:align>top</wp:align>
+              </wp:positionV>
+              <wp:extent cx="670560" cy="357505"/>
+              <wp:effectExtent l="0" t="0" r="15240" b="4445"/>
+              <wp:wrapNone/>
+              <wp:docPr id="976152678" name="Text Box 2" descr="[Public]">
+                <a:extLst xmlns:a="http://schemas.openxmlformats.org/drawingml/2006/main">
+                  <a:ext uri="{5AE41FA2-C0FF-4470-9BD4-5FADCA87CBE2}">
+                    <aclsh:classification xmlns:aclsh="http://schemas.microsoft.com/office/drawing/2020/classificationShape" classificationOutcomeType="hdr"/>
+                  </a:ext>
+                </a:extLst>
+              </wp:docPr>
+              <wp:cNvGraphicFramePr/>
+              <a:graphic xmlns:a="http://schemas.openxmlformats.org/drawingml/2006/main">
+                <a:graphicData uri="http://schemas.microsoft.com/office/word/2010/wordprocessingShape">
+                  <wps:wsp>
+                    <wps:cNvSpPr txBox="1"/>
+                    <wps:spPr>
+                      <a:xfrm>
+                        <a:off x="0" y="0"/>
+                        <a:ext cx="670560" cy="357505"/>
+                      </a:xfrm>
+                      <a:prstGeom prst="rect">
+                        <a:avLst/>
+                      </a:prstGeom>
+                      <a:noFill/>
+                      <a:ln>
+                        <a:noFill/>
+                      </a:ln>
+                    </wps:spPr>
+                    <wps:txbx>
+                      <w:txbxContent>
+                        <w:p>
+                          <w:pPr>
+                            <w:spacing w:after="0"/>
+                            <w:rPr>
+                              <w:rFonts w:ascii="Aptos" w:eastAsia="Aptos" w:hAnsi="Aptos" w:cs="Aptos"/>
+                              <w:noProof/>
+                              <w:color w:val="008000"/>
+                              <w:sz w:val="20"/>
+                              <w:szCs w:val="20"/>
+                            </w:rPr>
+                          </w:pPr>
+                          <w:r>
+                            <w:rPr>
+                              <w:rFonts w:ascii="Aptos" w:eastAsia="Aptos" w:hAnsi="Aptos" w:cs="Aptos"/>
+                              <w:noProof/>
+                              <w:color w:val="008000"/>
+                              <w:sz w:val="20"/>
+                              <w:szCs w:val="20"/>
+                            </w:rPr>
+                            <w:t>[Public]</w:t>
+                          </w:r>
+                        </w:p>
+                      </w:txbxContent>
+                    </wps:txbx>
+                    <wps:bodyPr rot="0" spcFirstLastPara="0" vertOverflow="overflow" horzOverflow="overflow" vert="horz" wrap="none" lIns="254000" tIns="190500" rIns="0" bIns="0" numCol="1" spcCol="0" rtlCol="0" fromWordArt="0" anchor="t" anchorCtr="0" forceAA="0" compatLnSpc="1">
+                      <a:prstTxWarp prst="textNoShape">
+                        <a:avLst/>
+                      </a:prstTxWarp>
+                      <a:spAutoFit/>
+                    </wps:bodyPr>
+                  </wps:wsp>
+                </a:graphicData>
+              </a:graphic>
+            </wp:anchor>
+          </w:drawing>
+        </mc:Choice>
+        <mc:Fallback>
+          <w:pict>
+            <v:shapetype w14:anchorId="368D827E" id="_x0000_t202" coordsize="21600,21600" o:spt="202" path="m,l,21600r21600,l21600,xe">
+              <v:stroke joinstyle="miter"/>
+              <v:path gradientshapeok="t" o:connecttype="rect"/>
+            </v:shapetype>
+            <v:shape id="_x0000_s1027" type="#_x0000_t202" alt="[Public]" style="position:absolute;margin-left:0;margin-top:0;width:52.8pt;height:28.15pt;z-index:251659264;visibility:visible;mso-wrap-style:none;mso-wrap-distance-left:0;mso-wrap-distance-top:0;mso-wrap-distance-right:0;mso-wrap-distance-bottom:0;mso-position-horizontal:left;mso-position-horizontal-relative:page;mso-position-vertical:top;mso-position-vertical-relative:page;v-text-anchor:top" o:gfxdata="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" filled="f" stroked="f">
+              <v:textbox style="mso-fit-shape-to-text:t" inset="20pt,15pt,0,0">
+                <w:txbxContent>
+                  <w:p>
+                    <w:pPr>
+                      <w:spacing w:after="0"/>
+                      <w:rPr>
+                        <w:rFonts w:ascii="Aptos" w:eastAsia="Aptos" w:hAnsi="Aptos" w:cs="Aptos"/>
+                        <w:noProof/>
+                        <w:color w:val="008000"/>
+                        <w:sz w:val="20"/>
+                        <w:szCs w:val="20"/>
+                      </w:rPr>
+                    </w:pPr>
+                    <w:r>
+                      <w:rPr>
+                        <w:rFonts w:ascii="Aptos" w:eastAsia="Aptos" w:hAnsi="Aptos" w:cs="Aptos"/>
+                        <w:noProof/>
+                        <w:color w:val="008000"/>
+                        <w:sz w:val="20"/>
+                        <w:szCs w:val="20"/>
+                      </w:rPr>
+                      <w:t>[Public]</w:t>
+                    </w:r>
+                  </w:p>
+                </w:txbxContent>
+              </v:textbox>
+              <w10:wrap anchorx="page" anchory="page"/>
+            </v:shape>
+          </w:pict>
+        </mc:Fallback>
+      </mc:AlternateContent>
+    </w:r>
+  </w:p>
+</w:hdr>
+</file>
+
+<file path=word/header2.xml><?xml version="1.0" encoding="utf-8"?>
+<w:hdr xmlns:wpc="http://schemas.microsoft.com/office/word/2010/wordprocessingCanvas" xmlns:cx="http://schemas.microsoft.com/office/drawing/2014/chartex" xmlns:cx1="http://schemas.microsoft.com/office/drawing/2015/9/8/chartex" xmlns:cx2="http://schemas.microsoft.com/office/drawing/2015/10/21/chartex" xmlns:cx3="http://schemas.microsoft.com/office/drawing/2016/5/9/chartex" xmlns:cx4="http://schemas.microsoft.com/office/drawing/2016/5/10/chartex" xmlns:cx5="http://schemas.microsoft.com/office/drawing/2016/5/11/chartex" xmlns:cx6="http://schemas.microsoft.com/office/drawing/2016/5/12/chartex" xmlns:cx7="http://schemas.microsoft.com/office/drawing/2016/5/13/chartex" xmlns:cx8="http://schemas.microsoft.com/office/drawing/2016/5/14/chartex" xmlns:mc="http://schemas.openxmlformats.org/markup-compatibility/2006" xmlns:aink="http://schemas.microsoft.com/office/drawing/2016/ink" xmlns:am3d="http://schemas.microsoft.com/office/drawing/2017/model3d" xmlns:o="urn:schemas-microsoft-com:office:office" xmlns:oel="http://schemas.microsoft.com/office/2019/extlst" xmlns:r="http://schemas.openxmlformats.org/officeDocument/2006/relationships" xmlns:m="http://schemas.openxmlformats.org/officeDocument/2006/math" xmlns:v="urn:schemas-microsoft-com:vml" xmlns:wp14="http://schemas.microsoft.com/office/word/2010/wordprocessingDrawing" xmlns:wp="http://schemas.openxmlformats.org/drawingml/2006/wordprocessingDrawing" xmlns:w10="urn:schemas-microsoft-com:office:word" xmlns:w="http://schemas.openxmlformats.org/wordprocessingml/2006/main" xmlns:w14="http://schemas.microsoft.com/office/word/2010/wordml" xmlns:w15="http://schemas.microsoft.com/office/word/2012/wordml" xmlns:w16cex="http://schemas.microsoft.com/office/word/2018/wordml/cex" xmlns:w16cid="http://schemas.microsoft.com/office/word/2016/wordml/cid" xmlns:w16="http://schemas.microsoft.com/office/word/2018/wordml" xmlns:w16du="http://schemas.microsoft.com/office/word/2023/wordml/word16du" xmlns:w16sdtdh="http://schemas.microsoft.com/office/word/2020/wordml/sdtdatahash" xmlns:w16sdtfl="http://schemas.microsoft.com/office/word/2024/wordml/sdtformatlock" xmlns:w16se="http://schemas.microsoft.com/office/word/2015/wordml/symex" xmlns:wpg="http://schemas.microsoft.com/office/word/2010/wordprocessingGroup" xmlns:wpi="http://schemas.microsoft.com/office/word/2010/wordprocessingInk" xmlns:wne="http://schemas.microsoft.com/office/word/2006/wordml" xmlns:wps="http://schemas.microsoft.com/office/word/2010/wordprocessingShape" mc:Ignorable="w14 w15 w16se w16cid w16 w16cex w16sdtdh w16sdtfl w16du wp14">
+  <w:p>
+    <w:pPr>
+      <w:pStyle w:val="Header"/>
+    </w:pPr>
+    <w:r>
+      <w:rPr>
+        <w:noProof/>
+      </w:rPr>
+      <mc:AlternateContent>
+        <mc:Choice Requires="wps">
+          <w:drawing>
+            <wp:anchor distT="0" distB="0" distL="0" distR="0" simplePos="0" relativeHeight="251660288" behindDoc="0" locked="0" layoutInCell="1" allowOverlap="1" wp14:anchorId="4C2C52B0" wp14:editId="168F17CF">
+              <wp:simplePos x="914400" y="457200"/>
+              <wp:positionH relativeFrom="page">
+                <wp:align>left</wp:align>
+              </wp:positionH>
+              <wp:positionV relativeFrom="page">
+                <wp:align>top</wp:align>
+              </wp:positionV>
+              <wp:extent cx="670560" cy="357505"/>
+              <wp:effectExtent l="0" t="0" r="15240" b="4445"/>
+              <wp:wrapNone/>
+              <wp:docPr id="1780944739" name="Text Box 3" descr="[Public]">
+                <a:extLst xmlns:a="http://schemas.openxmlformats.org/drawingml/2006/main">
+                  <a:ext uri="{5AE41FA2-C0FF-4470-9BD4-5FADCA87CBE2}">
+                    <aclsh:classification xmlns:aclsh="http://schemas.microsoft.com/office/drawing/2020/classificationShape" classificationOutcomeType="hdr"/>
+                  </a:ext>
+                </a:extLst>
+              </wp:docPr>
+              <wp:cNvGraphicFramePr/>
+              <a:graphic xmlns:a="http://schemas.openxmlformats.org/drawingml/2006/main">
+                <a:graphicData uri="http://schemas.microsoft.com/office/word/2010/wordprocessingShape">
+                  <wps:wsp>
+                    <wps:cNvSpPr txBox="1"/>
+                    <wps:spPr>
+                      <a:xfrm>
+                        <a:off x="0" y="0"/>
+                        <a:ext cx="670560" cy="357505"/>
+                      </a:xfrm>
+                      <a:prstGeom prst="rect">
+                        <a:avLst/>
+                      </a:prstGeom>
+                      <a:noFill/>
+                      <a:ln>
+                        <a:noFill/>
+                      </a:ln>
+                    </wps:spPr>
+                    <wps:txbx>
+                      <w:txbxContent>
+                        <w:p>
+                          <w:pPr>
+                            <w:spacing w:after="0"/>
+                            <w:rPr>
+                              <w:rFonts w:ascii="Aptos" w:eastAsia="Aptos" w:hAnsi="Aptos" w:cs="Aptos"/>
+                              <w:noProof/>
+                              <w:color w:val="008000"/>
+                              <w:sz w:val="20"/>
+                              <w:szCs w:val="20"/>
+                            </w:rPr>
+                          </w:pPr>
+                          <w:r>
+                            <w:rPr>
+                              <w:rFonts w:ascii="Aptos" w:eastAsia="Aptos" w:hAnsi="Aptos" w:cs="Aptos"/>
+                              <w:noProof/>
+                              <w:color w:val="008000"/>
+                              <w:sz w:val="20"/>
+                              <w:szCs w:val="20"/>
+                            </w:rPr>
+                            <w:t>[Public]</w:t>
+                          </w:r>
+                        </w:p>
+                      </w:txbxContent>
+                    </wps:txbx>
+                    <wps:bodyPr rot="0" spcFirstLastPara="0" vertOverflow="overflow" horzOverflow="overflow" vert="horz" wrap="none" lIns="254000" tIns="190500" rIns="0" bIns="0" numCol="1" spcCol="0" rtlCol="0" fromWordArt="0" anchor="t" anchorCtr="0" forceAA="0" compatLnSpc="1">
+                      <a:prstTxWarp prst="textNoShape">
+                        <a:avLst/>
+                      </a:prstTxWarp>
+                      <a:spAutoFit/>
+                    </wps:bodyPr>
+                  </wps:wsp>
+                </a:graphicData>
+              </a:graphic>
+            </wp:anchor>
+          </w:drawing>
+        </mc:Choice>
+        <mc:Fallback>
+          <w:pict>
+            <v:shapetype w14:anchorId="4C2C52B0" id="_x0000_t202" coordsize="21600,21600" o:spt="202" path="m,l,21600r21600,l21600,xe">
+              <v:stroke joinstyle="miter"/>
+              <v:path gradientshapeok="t" o:connecttype="rect"/>
+            </v:shapetype>
+            <v:shape id="Text Box 3" o:spid="_x0000_s1028" type="#_x0000_t202" alt="[Public]" style="position:absolute;margin-left:0;margin-top:0;width:52.8pt;height:28.15pt;z-index:251660288;visibility:visible;mso-wrap-style:none;mso-wrap-distance-left:0;mso-wrap-distance-top:0;mso-wrap-distance-right:0;mso-wrap-distance-bottom:0;mso-position-horizontal:left;mso-position-horizontal-relative:page;mso-position-vertical:top;mso-position-vertical-relative:page;v-text-anchor:top" o:gfxdata="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" filled="f" stroked="f">
+              <v:textbox style="mso-fit-shape-to-text:t" inset="20pt,15pt,0,0">
+                <w:txbxContent>
+                  <w:p>
+                    <w:pPr>
+                      <w:spacing w:after="0"/>
+                      <w:rPr>
+                        <w:rFonts w:ascii="Aptos" w:eastAsia="Aptos" w:hAnsi="Aptos" w:cs="Aptos"/>
+                        <w:noProof/>
+                        <w:color w:val="008000"/>
+                        <w:sz w:val="20"/>
+                        <w:szCs w:val="20"/>
+                      </w:rPr>
+                    </w:pPr>
+                    <w:r>
+                      <w:rPr>
+                        <w:rFonts w:ascii="Aptos" w:eastAsia="Aptos" w:hAnsi="Aptos" w:cs="Aptos"/>
+                        <w:noProof/>
+                        <w:color w:val="008000"/>
+                        <w:sz w:val="20"/>
+                        <w:szCs w:val="20"/>
+                      </w:rPr>
+                      <w:t>[Public]</w:t>
+                    </w:r>
+                  </w:p>
+                </w:txbxContent>
+              </v:textbox>
+              <w10:wrap anchorx="page" anchory="page"/>
+            </v:shape>
+          </w:pict>
+        </mc:Fallback>
+      </mc:AlternateContent>
+    </w:r>
+  </w:p>
+</w:hdr>
+</file>
+
+<file path=word/header3.xml><?xml version="1.0" encoding="utf-8"?>
+<w:hdr xmlns:wpc="http://schemas.microsoft.com/office/word/2010/wordprocessingCanvas" xmlns:cx="http://schemas.microsoft.com/office/drawing/2014/chartex" xmlns:cx1="http://schemas.microsoft.com/office/drawing/2015/9/8/chartex" xmlns:cx2="http://schemas.microsoft.com/office/drawing/2015/10/21/chartex" xmlns:cx3="http://schemas.microsoft.com/office/drawing/2016/5/9/chartex" xmlns:cx4="http://schemas.microsoft.com/office/drawing/2016/5/10/chartex" xmlns:cx5="http://schemas.microsoft.com/office/drawing/2016/5/11/chartex" xmlns:cx6="http://schemas.microsoft.com/office/drawing/2016/5/12/chartex" xmlns:cx7="http://schemas.microsoft.com/office/drawing/2016/5/13/chartex" xmlns:cx8="http://schemas.microsoft.com/office/drawing/2016/5/14/chartex" xmlns:mc="http://schemas.openxmlformats.org/markup-compatibility/2006" xmlns:aink="http://schemas.microsoft.com/office/drawing/2016/ink" xmlns:am3d="http://schemas.microsoft.com/office/drawing/2017/model3d" xmlns:o="urn:schemas-microsoft-com:office:office" xmlns:oel="http://schemas.microsoft.com/office/2019/extlst" xmlns:r="http://schemas.openxmlformats.org/officeDocument/2006/relationships" xmlns:m="http://schemas.openxmlformats.org/officeDocument/2006/math" xmlns:v="urn:schemas-microsoft-com:vml" xmlns:wp14="http://schemas.microsoft.com/office/word/2010/wordprocessingDrawing" xmlns:wp="http://schemas.openxmlformats.org/drawingml/2006/wordprocessingDrawing" xmlns:w10="urn:schemas-microsoft-com:office:word" xmlns:w="http://schemas.openxmlformats.org/wordprocessingml/2006/main" xmlns:w14="http://schemas.microsoft.com/office/word/2010/wordml" xmlns:w15="http://schemas.microsoft.com/office/word/2012/wordml" xmlns:w16cex="http://schemas.microsoft.com/office/word/2018/wordml/cex" xmlns:w16cid="http://schemas.microsoft.com/office/word/2016/wordml/cid" xmlns:w16="http://schemas.microsoft.com/office/word/2018/wordml" xmlns:w16du="http://schemas.microsoft.com/office/word/2023/wordml/word16du" xmlns:w16sdtdh="http://schemas.microsoft.com/office/word/2020/wordml/sdtdatahash" xmlns:w16sdtfl="http://schemas.microsoft.com/office/word/2024/wordml/sdtformatlock" xmlns:w16se="http://schemas.microsoft.com/office/word/2015/wordml/symex" xmlns:wpg="http://schemas.microsoft.com/office/word/2010/wordprocessingGroup" xmlns:wpi="http://schemas.microsoft.com/office/word/2010/wordprocessingInk" xmlns:wne="http://schemas.microsoft.com/office/word/2006/wordml" xmlns:wps="http://schemas.microsoft.com/office/word/2010/wordprocessingShape" mc:Ignorable="w14 w15 w16se w16cid w16 w16cex w16sdtdh w16sdtfl w16du wp14">
+  <w:p>
+    <w:pPr>
+      <w:pStyle w:val="Header"/>
+    </w:pPr>
+    <w:r>
+      <w:rPr>
+        <w:noProof/>
+      </w:rPr>
+      <mc:AlternateContent>
+        <mc:Choice Requires="wps">
+          <w:drawing>
+            <wp:anchor distT="0" distB="0" distL="0" distR="0" simplePos="0" relativeHeight="251658240" behindDoc="0" locked="0" layoutInCell="1" allowOverlap="1" wp14:anchorId="14BC4292" wp14:editId="3FA66108">
+              <wp:simplePos x="635" y="635"/>
+              <wp:positionH relativeFrom="page">
+                <wp:align>left</wp:align>
+              </wp:positionH>
+              <wp:positionV relativeFrom="page">
+                <wp:align>top</wp:align>
+              </wp:positionV>
+              <wp:extent cx="670560" cy="357505"/>
+              <wp:effectExtent l="0" t="0" r="15240" b="4445"/>
+              <wp:wrapNone/>
+              <wp:docPr id="239522217" name="Text Box 1" descr="[Public]">
+                <a:extLst xmlns:a="http://schemas.openxmlformats.org/drawingml/2006/main">
+                  <a:ext uri="{5AE41FA2-C0FF-4470-9BD4-5FADCA87CBE2}">
+                    <aclsh:classification xmlns:aclsh="http://schemas.microsoft.com/office/drawing/2020/classificationShape" classificationOutcomeType="hdr"/>
+                  </a:ext>
+                </a:extLst>
+              </wp:docPr>
+              <wp:cNvGraphicFramePr/>
+              <a:graphic xmlns:a="http://schemas.openxmlformats.org/drawingml/2006/main">
+                <a:graphicData uri="http://schemas.microsoft.com/office/word/2010/wordprocessingShape">
+                  <wps:wsp>
+                    <wps:cNvSpPr txBox="1"/>
+                    <wps:spPr>
+                      <a:xfrm>
+                        <a:off x="0" y="0"/>
+                        <a:ext cx="670560" cy="357505"/>
+                      </a:xfrm>
+                      <a:prstGeom prst="rect">
+                        <a:avLst/>
+                      </a:prstGeom>
+                      <a:noFill/>
+                      <a:ln>
+                        <a:noFill/>
+                      </a:ln>
+                    </wps:spPr>
+                    <wps:txbx>
+                      <w:txbxContent>
+                        <w:p>
+                          <w:pPr>
+                            <w:spacing w:after="0"/>
+                            <w:rPr>
+                              <w:rFonts w:ascii="Aptos" w:eastAsia="Aptos" w:hAnsi="Aptos" w:cs="Aptos"/>
+                              <w:noProof/>
+                              <w:color w:val="008000"/>
+                              <w:sz w:val="20"/>
+                              <w:szCs w:val="20"/>
+                            </w:rPr>
+                          </w:pPr>
+                          <w:r>
+                            <w:rPr>
+                              <w:rFonts w:ascii="Aptos" w:eastAsia="Aptos" w:hAnsi="Aptos" w:cs="Aptos"/>
+                              <w:noProof/>
+                              <w:color w:val="008000"/>
+                              <w:sz w:val="20"/>
+                              <w:szCs w:val="20"/>
+                            </w:rPr>
+                            <w:t>[Public]</w:t>
+                          </w:r>
+                        </w:p>
+                      </w:txbxContent>
+                    </wps:txbx>
+                    <wps:bodyPr rot="0" spcFirstLastPara="0" vertOverflow="overflow" horzOverflow="overflow" vert="horz" wrap="none" lIns="254000" tIns="190500" rIns="0" bIns="0" numCol="1" spcCol="0" rtlCol="0" fromWordArt="0" anchor="t" anchorCtr="0" forceAA="0" compatLnSpc="1">
+                      <a:prstTxWarp prst="textNoShape">
+                        <a:avLst/>
+                      </a:prstTxWarp>
+                      <a:spAutoFit/>
+                    </wps:bodyPr>
+                  </wps:wsp>
+                </a:graphicData>
+              </a:graphic>
+            </wp:anchor>
+          </w:drawing>
+        </mc:Choice>
+        <mc:Fallback>
+          <w:pict>
+            <v:shapetype w14:anchorId="14BC4292" id="_x0000_t202" coordsize="21600,21600" o:spt="202" path="m,l,21600r21600,l21600,xe">
+              <v:stroke joinstyle="miter"/>
+              <v:path gradientshapeok="t" o:connecttype="rect"/>
+            </v:shapetype>
+            <v:shape id="Text Box 1" o:spid="_x0000_s1029" type="#_x0000_t202" alt="[Public]" style="position:absolute;margin-left:0;margin-top:0;width:52.8pt;height:28.15pt;z-index:251658240;visibility:visible;mso-wrap-style:none;mso-wrap-distance-left:0;mso-wrap-distance-top:0;mso-wrap-distance-right:0;mso-wrap-distance-bottom:0;mso-position-horizontal:left;mso-position-horizontal-relative:page;mso-position-vertical:top;mso-position-vertical-relative:page;v-text-anchor:top" o:gfxdata="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" filled="f" stroked="f">
+              <v:textbox style="mso-fit-shape-to-text:t" inset="20pt,15pt,0,0">
+                <w:txbxContent>
+                  <w:p>
+                    <w:pPr>
+                      <w:spacing w:after="0"/>
+                      <w:rPr>
+                        <w:rFonts w:ascii="Aptos" w:eastAsia="Aptos" w:hAnsi="Aptos" w:cs="Aptos"/>
+                        <w:noProof/>
+                        <w:color w:val="008000"/>
+                        <w:sz w:val="20"/>
+                        <w:szCs w:val="20"/>
+                      </w:rPr>
+                    </w:pPr>
+                    <w:r>
+                      <w:rPr>
+                        <w:rFonts w:ascii="Aptos" w:eastAsia="Aptos" w:hAnsi="Aptos" w:cs="Aptos"/>
+                        <w:noProof/>
+                        <w:color w:val="008000"/>
+                        <w:sz w:val="20"/>
+                        <w:szCs w:val="20"/>
+                      </w:rPr>
+                      <w:t>[Public]</w:t>
+                    </w:r>
+                  </w:p>
+                </w:txbxContent>
+              </v:textbox>
+              <w10:wrap anchorx="page" anchory="page"/>
+            </v:shape>
+          </w:pict>
+        </mc:Fallback>
+      </mc:AlternateContent>
+    </w:r>
+  </w:p>
+</w:hdr>
+</file>
+
 <file path=word/numbering.xml><?xml version="1.0" encoding="utf-8"?>
 <w:numbering xmlns:wpc="http://schemas.microsoft.com/office/word/2010/wordprocessingCanvas" xmlns:cx="http://schemas.microsoft.com/office/drawing/2014/chartex" xmlns:cx1="http://schemas.microsoft.com/office/drawing/2015/9/8/chartex" xmlns:cx2="http://schemas.microsoft.com/office/drawing/2015/10/21/chartex" xmlns:cx3="http://schemas.microsoft.com/office/drawing/2016/5/9/chartex" xmlns:cx4="http://schemas.microsoft.com/office/drawing/2016/5/10/chartex" xmlns:cx5="http://schemas.microsoft.com/office/drawing/2016/5/11/chartex" xmlns:cx6="http://schemas.microsoft.com/office/drawing/2016/5/12/chartex" xmlns:cx7="http://schemas.microsoft.com/office/drawing/2016/5/13/chartex" xmlns:cx8="http://schemas.microsoft.com/office/drawing/2016/5/14/chartex" xmlns:mc="http://schemas.openxmlformats.org/markup-compatibility/2006" xmlns:aink="http://schemas.microsoft.com/office/drawing/2016/ink" xmlns:am3d="http://schemas.microsoft.com/office/drawing/2017/model3d" xmlns:o="urn:schemas-microsoft-com:office:office" xmlns:oel="http://schemas.microsoft.com/office/2019/extlst" xmlns:r="http://schemas.openxmlformats.org/officeDocument/2006/relationships" xmlns:m="http://schemas.openxmlformats.org/officeDocument/2006/math" xmlns:v="urn:schemas-microsoft-com:vml" xmlns:wp14="http://schemas.microsoft.com/office/word/2010/wordprocessingDrawing" xmlns:wp="http://schemas.openxmlformats.org/drawingml/2006/wordprocessingDrawing" xmlns:w10="urn:schemas-microsoft-com:office:word" xmlns:w="http://schemas.openxmlformats.org/wordprocessingml/2006/main" xmlns:w14="http://schemas.microsoft.com/office/word/2010/wordml" xmlns:w15="http://schemas.microsoft.com/office/word/2012/wordml" xmlns:w16cex="http://schemas.microsoft.com/office/word/2018/wordml/cex" xmlns:w16cid="http://schemas.microsoft.com/office/word/2016/wordml/cid" xmlns:w16="http://schemas.microsoft.com/office/word/2018/wordml" xmlns:w16du="http://schemas.microsoft.com/office/word/2023/wordml/word16du" xmlns:w16sdtdh="http://schemas.microsoft.com/office/word/2020/wordml/sdtdatahash" xmlns:w16sdtfl="http://schemas.microsoft.com/office/word/2024/wordml/sdtformatlock" xmlns:w16se="http://schemas.microsoft.com/office/word/2015/wordml/symex" xmlns:wpg="http://schemas.microsoft.com/office/word/2010/wordprocessingGroup" xmlns:wpi="http://schemas.microsoft.com/office/word/2010/wordprocessingInk" xmlns:wne="http://schemas.microsoft.com/office/word/2006/wordml" xmlns:wps="http://schemas.microsoft.com/office/word/2010/wordprocessingShape" mc:Ignorable="w14 w15 w16se w16cid w16 w16cex w16sdtdh w16sdtfl w16du wp14">
   <w:abstractNum w:abstractNumId="0" w15:restartNumberingAfterBreak="0">
@@ -10944,6 +11959,119 @@
     </w:lvl>
   </w:abstractNum>
   <w:abstractNum w:abstractNumId="10" w15:restartNumberingAfterBreak="0">
+    <w:nsid w:val="188567D0"/>
+    <w:multiLevelType w:val="hybridMultilevel"/>
+    <w:tmpl w:val="A1F02396"/>
+    <w:lvl w:ilvl="0" w:tplc="04090001">
+      <w:start w:val="1"/>
+      <w:numFmt w:val="bullet"/>
+      <w:lvlText w:val=""/>
+      <w:lvlJc w:val="left"/>
+      <w:pPr>
+        <w:ind w:left="720" w:hanging="360"/>
+      </w:pPr>
+      <w:rPr>
+        <w:rFonts w:ascii="Symbol" w:hAnsi="Symbol" w:hint="default"/>
+      </w:rPr>
+    </w:lvl>
+    <w:lvl w:ilvl="1" w:tplc="04090003" w:tentative="1">
+      <w:start w:val="1"/>
+      <w:numFmt w:val="bullet"/>
+      <w:lvlText w:val="o"/>
+      <w:lvlJc w:val="left"/>
+      <w:pPr>
+        <w:ind w:left="1440" w:hanging="360"/>
+      </w:pPr>
+      <w:rPr>
+        <w:rFonts w:ascii="Courier New" w:hAnsi="Courier New" w:cs="Courier New" w:hint="default"/>
+      </w:rPr>
+    </w:lvl>
+    <w:lvl w:ilvl="2" w:tplc="04090005" w:tentative="1">
+      <w:start w:val="1"/>
+      <w:numFmt w:val="bullet"/>
+      <w:lvlText w:val=""/>
+      <w:lvlJc w:val="left"/>
+      <w:pPr>
+        <w:ind w:left="2160" w:hanging="360"/>
+      </w:pPr>
+      <w:rPr>
+        <w:rFonts w:ascii="Wingdings" w:hAnsi="Wingdings" w:hint="default"/>
+      </w:rPr>
+    </w:lvl>
+    <w:lvl w:ilvl="3" w:tplc="04090001" w:tentative="1">
+      <w:start w:val="1"/>
+      <w:numFmt w:val="bullet"/>
+      <w:lvlText w:val=""/>
+      <w:lvlJc w:val="left"/>
+      <w:pPr>
+        <w:ind w:left="2880" w:hanging="360"/>
+      </w:pPr>
+      <w:rPr>
+        <w:rFonts w:ascii="Symbol" w:hAnsi="Symbol" w:hint="default"/>
+      </w:rPr>
+    </w:lvl>
+    <w:lvl w:ilvl="4" w:tplc="04090003" w:tentative="1">
+      <w:start w:val="1"/>
+      <w:numFmt w:val="bullet"/>
+      <w:lvlText w:val="o"/>
+      <w:lvlJc w:val="left"/>
+      <w:pPr>
+        <w:ind w:left="3600" w:hanging="360"/>
+      </w:pPr>
+      <w:rPr>
+        <w:rFonts w:ascii="Courier New" w:hAnsi="Courier New" w:cs="Courier New" w:hint="default"/>
+      </w:rPr>
+    </w:lvl>
+    <w:lvl w:ilvl="5" w:tplc="04090005" w:tentative="1">
+      <w:start w:val="1"/>
+      <w:numFmt w:val="bullet"/>
+      <w:lvlText w:val=""/>
+      <w:lvlJc w:val="left"/>
+      <w:pPr>
+        <w:ind w:left="4320" w:hanging="360"/>
+      </w:pPr>
+      <w:rPr>
+        <w:rFonts w:ascii="Wingdings" w:hAnsi="Wingdings" w:hint="default"/>
+      </w:rPr>
+    </w:lvl>
+    <w:lvl w:ilvl="6" w:tplc="04090001" w:tentative="1">
+      <w:start w:val="1"/>
+      <w:numFmt w:val="bullet"/>
+      <w:lvlText w:val=""/>
+      <w:lvlJc w:val="left"/>
+      <w:pPr>
+        <w:ind w:left="5040" w:hanging="360"/>
+      </w:pPr>
+      <w:rPr>
+        <w:rFonts w:ascii="Symbol" w:hAnsi="Symbol" w:hint="default"/>
+      </w:rPr>
+    </w:lvl>
+    <w:lvl w:ilvl="7" w:tplc="04090003" w:tentative="1">
+      <w:start w:val="1"/>
+      <w:numFmt w:val="bullet"/>
+      <w:lvlText w:val="o"/>
+      <w:lvlJc w:val="left"/>
+      <w:pPr>
+        <w:ind w:left="5760" w:hanging="360"/>
+      </w:pPr>
+      <w:rPr>
+        <w:rFonts w:ascii="Courier New" w:hAnsi="Courier New" w:cs="Courier New" w:hint="default"/>
+      </w:rPr>
+    </w:lvl>
+    <w:lvl w:ilvl="8" w:tplc="04090005" w:tentative="1">
+      <w:start w:val="1"/>
+      <w:numFmt w:val="bullet"/>
+      <w:lvlText w:val=""/>
+      <w:lvlJc w:val="left"/>
+      <w:pPr>
+        <w:ind w:left="6480" w:hanging="360"/>
+      </w:pPr>
+      <w:rPr>
+        <w:rFonts w:ascii="Wingdings" w:hAnsi="Wingdings" w:hint="default"/>
+      </w:rPr>
+    </w:lvl>
+  </w:abstractNum>
+  <w:abstractNum w:abstractNumId="11" w15:restartNumberingAfterBreak="0">
     <w:nsid w:val="1AE9241E"/>
     <w:multiLevelType w:val="hybridMultilevel"/>
     <w:tmpl w:val="AB882408"/>
@@ -10971,7 +12099,7 @@
         <w:rFonts w:ascii="Courier New" w:hAnsi="Courier New" w:cs="Courier New" w:hint="default"/>
       </w:rPr>
     </w:lvl>
-    <w:lvl w:ilvl="2" w:tplc="04090005" w:tentative="1">
+    <w:lvl w:ilvl="2" w:tplc="04090005">
       <w:start w:val="1"/>
       <w:numFmt w:val="bullet"/>
       <w:lvlText w:val=""/>
@@ -11056,7 +12184,7 @@
       </w:rPr>
     </w:lvl>
   </w:abstractNum>
-  <w:abstractNum w:abstractNumId="11" w15:restartNumberingAfterBreak="0">
+  <w:abstractNum w:abstractNumId="12" w15:restartNumberingAfterBreak="0">
     <w:nsid w:val="1B9A230C"/>
     <w:multiLevelType w:val="hybridMultilevel"/>
     <w:tmpl w:val="75DC1000"/>
@@ -11169,7 +12297,7 @@
       </w:rPr>
     </w:lvl>
   </w:abstractNum>
-  <w:abstractNum w:abstractNumId="12" w15:restartNumberingAfterBreak="0">
+  <w:abstractNum w:abstractNumId="13" w15:restartNumberingAfterBreak="0">
     <w:nsid w:val="1FAE09F0"/>
     <w:multiLevelType w:val="multilevel"/>
     <w:tmpl w:val="D5EEA086"/>
@@ -11318,7 +12446,7 @@
       </w:rPr>
     </w:lvl>
   </w:abstractNum>
-  <w:abstractNum w:abstractNumId="13" w15:restartNumberingAfterBreak="0">
+  <w:abstractNum w:abstractNumId="14" w15:restartNumberingAfterBreak="0">
     <w:nsid w:val="220427E4"/>
     <w:multiLevelType w:val="hybridMultilevel"/>
     <w:tmpl w:val="BDCA8448"/>
@@ -11407,7 +12535,7 @@
       </w:pPr>
     </w:lvl>
   </w:abstractNum>
-  <w:abstractNum w:abstractNumId="14" w15:restartNumberingAfterBreak="0">
+  <w:abstractNum w:abstractNumId="15" w15:restartNumberingAfterBreak="0">
     <w:nsid w:val="229A2E9D"/>
     <w:multiLevelType w:val="hybridMultilevel"/>
     <w:tmpl w:val="4BB247A4"/>
@@ -11499,7 +12627,7 @@
       </w:pPr>
     </w:lvl>
   </w:abstractNum>
-  <w:abstractNum w:abstractNumId="15" w15:restartNumberingAfterBreak="0">
+  <w:abstractNum w:abstractNumId="16" w15:restartNumberingAfterBreak="0">
     <w:nsid w:val="26083786"/>
     <w:multiLevelType w:val="hybridMultilevel"/>
     <w:tmpl w:val="AC967D72"/>
@@ -11612,7 +12740,7 @@
       </w:rPr>
     </w:lvl>
   </w:abstractNum>
-  <w:abstractNum w:abstractNumId="16" w15:restartNumberingAfterBreak="0">
+  <w:abstractNum w:abstractNumId="17" w15:restartNumberingAfterBreak="0">
     <w:nsid w:val="273267DB"/>
     <w:multiLevelType w:val="hybridMultilevel"/>
     <w:tmpl w:val="15BE7576"/>
@@ -11725,7 +12853,7 @@
       </w:rPr>
     </w:lvl>
   </w:abstractNum>
-  <w:abstractNum w:abstractNumId="17" w15:restartNumberingAfterBreak="0">
+  <w:abstractNum w:abstractNumId="18" w15:restartNumberingAfterBreak="0">
     <w:nsid w:val="2C43513B"/>
     <w:multiLevelType w:val="multilevel"/>
     <w:tmpl w:val="0296A074"/>
@@ -11874,7 +13002,93 @@
       </w:rPr>
     </w:lvl>
   </w:abstractNum>
-  <w:abstractNum w:abstractNumId="18" w15:restartNumberingAfterBreak="0">
+  <w:abstractNum w:abstractNumId="19" w15:restartNumberingAfterBreak="0">
+    <w:nsid w:val="2F6272E6"/>
+    <w:multiLevelType w:val="multilevel"/>
+    <w:tmpl w:val="0409001D"/>
+    <w:lvl w:ilvl="0">
+      <w:start w:val="1"/>
+      <w:numFmt w:val="decimal"/>
+      <w:lvlText w:val="%1)"/>
+      <w:lvlJc w:val="left"/>
+      <w:pPr>
+        <w:ind w:left="360" w:hanging="360"/>
+      </w:pPr>
+    </w:lvl>
+    <w:lvl w:ilvl="1">
+      <w:start w:val="1"/>
+      <w:numFmt w:val="lowerLetter"/>
+      <w:lvlText w:val="%2)"/>
+      <w:lvlJc w:val="left"/>
+      <w:pPr>
+        <w:ind w:left="720" w:hanging="360"/>
+      </w:pPr>
+    </w:lvl>
+    <w:lvl w:ilvl="2">
+      <w:start w:val="1"/>
+      <w:numFmt w:val="lowerRoman"/>
+      <w:lvlText w:val="%3)"/>
+      <w:lvlJc w:val="left"/>
+      <w:pPr>
+        <w:ind w:left="1080" w:hanging="360"/>
+      </w:pPr>
+    </w:lvl>
+    <w:lvl w:ilvl="3">
+      <w:start w:val="1"/>
+      <w:numFmt w:val="decimal"/>
+      <w:lvlText w:val="(%4)"/>
+      <w:lvlJc w:val="left"/>
+      <w:pPr>
+        <w:ind w:left="1440" w:hanging="360"/>
+      </w:pPr>
+    </w:lvl>
+    <w:lvl w:ilvl="4">
+      <w:start w:val="1"/>
+      <w:numFmt w:val="lowerLetter"/>
+      <w:lvlText w:val="(%5)"/>
+      <w:lvlJc w:val="left"/>
+      <w:pPr>
+        <w:ind w:left="1800" w:hanging="360"/>
+      </w:pPr>
+    </w:lvl>
+    <w:lvl w:ilvl="5">
+      <w:start w:val="1"/>
+      <w:numFmt w:val="lowerRoman"/>
+      <w:lvlText w:val="(%6)"/>
+      <w:lvlJc w:val="left"/>
+      <w:pPr>
+        <w:ind w:left="2160" w:hanging="360"/>
+      </w:pPr>
+    </w:lvl>
+    <w:lvl w:ilvl="6">
+      <w:start w:val="1"/>
+      <w:numFmt w:val="decimal"/>
+      <w:lvlText w:val="%7."/>
+      <w:lvlJc w:val="left"/>
+      <w:pPr>
+        <w:ind w:left="2520" w:hanging="360"/>
+      </w:pPr>
+    </w:lvl>
+    <w:lvl w:ilvl="7">
+      <w:start w:val="1"/>
+      <w:numFmt w:val="lowerLetter"/>
+      <w:lvlText w:val="%8."/>
+      <w:lvlJc w:val="left"/>
+      <w:pPr>
+        <w:ind w:left="2880" w:hanging="360"/>
+      </w:pPr>
+    </w:lvl>
+    <w:lvl w:ilvl="8">
+      <w:start w:val="1"/>
+      <w:numFmt w:val="lowerRoman"/>
+      <w:lvlText w:val="%9."/>
+      <w:lvlJc w:val="left"/>
+      <w:pPr>
+        <w:ind w:left="3240" w:hanging="360"/>
+      </w:pPr>
+    </w:lvl>
+  </w:abstractNum>
+  <w:abstractNum w:abstractNumId="20" w15:restartNumberingAfterBreak="0">
     <w:nsid w:val="317800EA"/>
     <w:multiLevelType w:val="hybridMultilevel"/>
     <w:tmpl w:val="61FA1A7E"/>
@@ -11987,7 +13201,206 @@
       </w:rPr>
     </w:lvl>
   </w:abstractNum>
-  <w:abstractNum w:abstractNumId="19" w15:restartNumberingAfterBreak="0">
+  <w:abstractNum w:abstractNumId="21" w15:restartNumberingAfterBreak="0">
+    <w:nsid w:val="359C611B"/>
+    <w:multiLevelType w:val="multilevel"/>
+    <w:tmpl w:val="0409001D"/>
+    <w:lvl w:ilvl="0">
+      <w:start w:val="1"/>
+      <w:numFmt w:val="decimal"/>
+      <w:lvlText w:val="%1)"/>
+      <w:lvlJc w:val="left"/>
+      <w:pPr>
+        <w:ind w:left="360" w:hanging="360"/>
+      </w:pPr>
+    </w:lvl>
+    <w:lvl w:ilvl="1">
+      <w:start w:val="1"/>
+      <w:numFmt w:val="lowerLetter"/>
+      <w:lvlText w:val="%2)"/>
+      <w:lvlJc w:val="left"/>
+      <w:pPr>
+        <w:ind w:left="720" w:hanging="360"/>
+      </w:pPr>
+    </w:lvl>
+    <w:lvl w:ilvl="2">
+      <w:start w:val="1"/>
+      <w:numFmt w:val="lowerRoman"/>
+      <w:lvlText w:val="%3)"/>
+      <w:lvlJc w:val="left"/>
+      <w:pPr>
+        <w:ind w:left="1080" w:hanging="360"/>
+      </w:pPr>
+    </w:lvl>
+    <w:lvl w:ilvl="3">
+      <w:start w:val="1"/>
+      <w:numFmt w:val="decimal"/>
+      <w:lvlText w:val="(%4)"/>
+      <w:lvlJc w:val="left"/>
+      <w:pPr>
+        <w:ind w:left="1440" w:hanging="360"/>
+      </w:pPr>
+    </w:lvl>
+    <w:lvl w:ilvl="4">
+      <w:start w:val="1"/>
+      <w:numFmt w:val="lowerLetter"/>
+      <w:lvlText w:val="(%5)"/>
+      <w:lvlJc w:val="left"/>
+      <w:pPr>
+        <w:ind w:left="1800" w:hanging="360"/>
+      </w:pPr>
+    </w:lvl>
+    <w:lvl w:ilvl="5">
+      <w:start w:val="1"/>
+      <w:numFmt w:val="lowerRoman"/>
+      <w:lvlText w:val="(%6)"/>
+      <w:lvlJc w:val="left"/>
+      <w:pPr>
+        <w:ind w:left="2160" w:hanging="360"/>
+      </w:pPr>
+    </w:lvl>
+    <w:lvl w:ilvl="6">
+      <w:start w:val="1"/>
+      <w:numFmt w:val="decimal"/>
+      <w:lvlText w:val="%7."/>
+      <w:lvlJc w:val="left"/>
+      <w:pPr>
+        <w:ind w:left="2520" w:hanging="360"/>
+      </w:pPr>
+    </w:lvl>
+    <w:lvl w:ilvl="7">
+      <w:start w:val="1"/>
+      <w:numFmt w:val="lowerLetter"/>
+      <w:lvlText w:val="%8."/>
+      <w:lvlJc w:val="left"/>
+      <w:pPr>
+        <w:ind w:left="2880" w:hanging="360"/>
+      </w:pPr>
+    </w:lvl>
+    <w:lvl w:ilvl="8">
+      <w:start w:val="1"/>
+      <w:numFmt w:val="lowerRoman"/>
+      <w:lvlText w:val="%9."/>
+      <w:lvlJc w:val="left"/>
+      <w:pPr>
+        <w:ind w:left="3240" w:hanging="360"/>
+      </w:pPr>
+    </w:lvl>
+  </w:abstractNum>
+  <w:abstractNum w:abstractNumId="22" w15:restartNumberingAfterBreak="0">
+    <w:nsid w:val="364D6529"/>
+    <w:multiLevelType w:val="hybridMultilevel"/>
+    <w:tmpl w:val="37065876"/>
+    <w:lvl w:ilvl="0" w:tplc="04090001">
+      <w:start w:val="1"/>
+      <w:numFmt w:val="bullet"/>
+      <w:lvlText w:val=""/>
+      <w:lvlJc w:val="left"/>
+      <w:pPr>
+        <w:ind w:left="720" w:hanging="360"/>
+      </w:pPr>
+      <w:rPr>
+        <w:rFonts w:ascii="Symbol" w:hAnsi="Symbol" w:hint="default"/>
+      </w:rPr>
+    </w:lvl>
+    <w:lvl w:ilvl="1" w:tplc="04090003" w:tentative="1">
+      <w:start w:val="1"/>
+      <w:numFmt w:val="bullet"/>
+      <w:lvlText w:val="o"/>
+      <w:lvlJc w:val="left"/>
+      <w:pPr>
+        <w:ind w:left="1440" w:hanging="360"/>
+      </w:pPr>
+      <w:rPr>
+        <w:rFonts w:ascii="Courier New" w:hAnsi="Courier New" w:cs="Courier New" w:hint="default"/>
+      </w:rPr>
+    </w:lvl>
+    <w:lvl w:ilvl="2" w:tplc="04090005" w:tentative="1">
+      <w:start w:val="1"/>
+      <w:numFmt w:val="bullet"/>
+      <w:lvlText w:val=""/>
+      <w:lvlJc w:val="left"/>
+      <w:pPr>
+        <w:ind w:left="2160" w:hanging="360"/>
+      </w:pPr>
+      <w:rPr>
+        <w:rFonts w:ascii="Wingdings" w:hAnsi="Wingdings" w:hint="default"/>
+      </w:rPr>
+    </w:lvl>
+    <w:lvl w:ilvl="3" w:tplc="04090001" w:tentative="1">
+      <w:start w:val="1"/>
+      <w:numFmt w:val="bullet"/>
+      <w:lvlText w:val=""/>
+      <w:lvlJc w:val="left"/>
+      <w:pPr>
+        <w:ind w:left="2880" w:hanging="360"/>
+      </w:pPr>
+      <w:rPr>
+        <w:rFonts w:ascii="Symbol" w:hAnsi="Symbol" w:hint="default"/>
+      </w:rPr>
+    </w:lvl>
+    <w:lvl w:ilvl="4" w:tplc="04090003" w:tentative="1">
+      <w:start w:val="1"/>
+      <w:numFmt w:val="bullet"/>
+      <w:lvlText w:val="o"/>
+      <w:lvlJc w:val="left"/>
+      <w:pPr>
+        <w:ind w:left="3600" w:hanging="360"/>
+      </w:pPr>
+      <w:rPr>
+        <w:rFonts w:ascii="Courier New" w:hAnsi="Courier New" w:cs="Courier New" w:hint="default"/>
+      </w:rPr>
+    </w:lvl>
+    <w:lvl w:ilvl="5" w:tplc="04090005" w:tentative="1">
+      <w:start w:val="1"/>
+      <w:numFmt w:val="bullet"/>
+      <w:lvlText w:val=""/>
+      <w:lvlJc w:val="left"/>
+      <w:pPr>
+        <w:ind w:left="4320" w:hanging="360"/>
+      </w:pPr>
+      <w:rPr>
+        <w:rFonts w:ascii="Wingdings" w:hAnsi="Wingdings" w:hint="default"/>
+      </w:rPr>
+    </w:lvl>
+    <w:lvl w:ilvl="6" w:tplc="04090001" w:tentative="1">
+      <w:start w:val="1"/>
+      <w:numFmt w:val="bullet"/>
+      <w:lvlText w:val=""/>
+      <w:lvlJc w:val="left"/>
+      <w:pPr>
+        <w:ind w:left="5040" w:hanging="360"/>
+      </w:pPr>
+      <w:rPr>
+        <w:rFonts w:ascii="Symbol" w:hAnsi="Symbol" w:hint="default"/>
+      </w:rPr>
+    </w:lvl>
+    <w:lvl w:ilvl="7" w:tplc="04090003" w:tentative="1">
+      <w:start w:val="1"/>
+      <w:numFmt w:val="bullet"/>
+      <w:lvlText w:val="o"/>
+      <w:lvlJc w:val="left"/>
+      <w:pPr>
+        <w:ind w:left="5760" w:hanging="360"/>
+      </w:pPr>
+      <w:rPr>
+        <w:rFonts w:ascii="Courier New" w:hAnsi="Courier New" w:cs="Courier New" w:hint="default"/>
+      </w:rPr>
+    </w:lvl>
+    <w:lvl w:ilvl="8" w:tplc="04090005" w:tentative="1">
+      <w:start w:val="1"/>
+      <w:numFmt w:val="bullet"/>
+      <w:lvlText w:val=""/>
+      <w:lvlJc w:val="left"/>
+      <w:pPr>
+        <w:ind w:left="6480" w:hanging="360"/>
+      </w:pPr>
+      <w:rPr>
+        <w:rFonts w:ascii="Wingdings" w:hAnsi="Wingdings" w:hint="default"/>
+      </w:rPr>
+    </w:lvl>
+  </w:abstractNum>
+  <w:abstractNum w:abstractNumId="23" w15:restartNumberingAfterBreak="0">
     <w:nsid w:val="36575EBA"/>
     <w:multiLevelType w:val="multilevel"/>
     <w:tmpl w:val="A3F2FEE2"/>
@@ -12136,7 +13549,7 @@
       </w:rPr>
     </w:lvl>
   </w:abstractNum>
-  <w:abstractNum w:abstractNumId="20" w15:restartNumberingAfterBreak="0">
+  <w:abstractNum w:abstractNumId="24" w15:restartNumberingAfterBreak="0">
     <w:nsid w:val="395A03D9"/>
     <w:multiLevelType w:val="hybridMultilevel"/>
     <w:tmpl w:val="B15C8266"/>
@@ -12222,7 +13635,7 @@
       </w:pPr>
     </w:lvl>
   </w:abstractNum>
-  <w:abstractNum w:abstractNumId="21" w15:restartNumberingAfterBreak="0">
+  <w:abstractNum w:abstractNumId="25" w15:restartNumberingAfterBreak="0">
     <w:nsid w:val="3A28556D"/>
     <w:multiLevelType w:val="multilevel"/>
     <w:tmpl w:val="E94ED27A"/>
@@ -12371,7 +13784,93 @@
       </w:rPr>
     </w:lvl>
   </w:abstractNum>
-  <w:abstractNum w:abstractNumId="22" w15:restartNumberingAfterBreak="0">
+  <w:abstractNum w:abstractNumId="26" w15:restartNumberingAfterBreak="0">
+    <w:nsid w:val="3D372E58"/>
+    <w:multiLevelType w:val="multilevel"/>
+    <w:tmpl w:val="0409001D"/>
+    <w:lvl w:ilvl="0">
+      <w:start w:val="1"/>
+      <w:numFmt w:val="decimal"/>
+      <w:lvlText w:val="%1)"/>
+      <w:lvlJc w:val="left"/>
+      <w:pPr>
+        <w:ind w:left="360" w:hanging="360"/>
+      </w:pPr>
+    </w:lvl>
+    <w:lvl w:ilvl="1">
+      <w:start w:val="1"/>
+      <w:numFmt w:val="lowerLetter"/>
+      <w:lvlText w:val="%2)"/>
+      <w:lvlJc w:val="left"/>
+      <w:pPr>
+        <w:ind w:left="720" w:hanging="360"/>
+      </w:pPr>
+    </w:lvl>
+    <w:lvl w:ilvl="2">
+      <w:start w:val="1"/>
+      <w:numFmt w:val="lowerRoman"/>
+      <w:lvlText w:val="%3)"/>
+      <w:lvlJc w:val="left"/>
+      <w:pPr>
+        <w:ind w:left="1080" w:hanging="360"/>
+      </w:pPr>
+    </w:lvl>
+    <w:lvl w:ilvl="3">
+      <w:start w:val="1"/>
+      <w:numFmt w:val="decimal"/>
+      <w:lvlText w:val="(%4)"/>
+      <w:lvlJc w:val="left"/>
+      <w:pPr>
+        <w:ind w:left="1440" w:hanging="360"/>
+      </w:pPr>
+    </w:lvl>
+    <w:lvl w:ilvl="4">
+      <w:start w:val="1"/>
+      <w:numFmt w:val="lowerLetter"/>
+      <w:lvlText w:val="(%5)"/>
+      <w:lvlJc w:val="left"/>
+      <w:pPr>
+        <w:ind w:left="1800" w:hanging="360"/>
+      </w:pPr>
+    </w:lvl>
+    <w:lvl w:ilvl="5">
+      <w:start w:val="1"/>
+      <w:numFmt w:val="lowerRoman"/>
+      <w:lvlText w:val="(%6)"/>
+      <w:lvlJc w:val="left"/>
+      <w:pPr>
+        <w:ind w:left="2160" w:hanging="360"/>
+      </w:pPr>
+    </w:lvl>
+    <w:lvl w:ilvl="6">
+      <w:start w:val="1"/>
+      <w:numFmt w:val="decimal"/>
+      <w:lvlText w:val="%7."/>
+      <w:lvlJc w:val="left"/>
+      <w:pPr>
+        <w:ind w:left="2520" w:hanging="360"/>
+      </w:pPr>
+    </w:lvl>
+    <w:lvl w:ilvl="7">
+      <w:start w:val="1"/>
+      <w:numFmt w:val="lowerLetter"/>
+      <w:lvlText w:val="%8."/>
+      <w:lvlJc w:val="left"/>
+      <w:pPr>
+        <w:ind w:left="2880" w:hanging="360"/>
+      </w:pPr>
+    </w:lvl>
+    <w:lvl w:ilvl="8">
+      <w:start w:val="1"/>
+      <w:numFmt w:val="lowerRoman"/>
+      <w:lvlText w:val="%9."/>
+      <w:lvlJc w:val="left"/>
+      <w:pPr>
+        <w:ind w:left="3240" w:hanging="360"/>
+      </w:pPr>
+    </w:lvl>
+  </w:abstractNum>
+  <w:abstractNum w:abstractNumId="27" w15:restartNumberingAfterBreak="0">
     <w:nsid w:val="45127D7C"/>
     <w:multiLevelType w:val="hybridMultilevel"/>
     <w:tmpl w:val="B1824946"/>
@@ -12484,7 +13983,7 @@
       </w:rPr>
     </w:lvl>
   </w:abstractNum>
-  <w:abstractNum w:abstractNumId="23" w15:restartNumberingAfterBreak="0">
+  <w:abstractNum w:abstractNumId="28" w15:restartNumberingAfterBreak="0">
     <w:nsid w:val="4EDF0A52"/>
     <w:multiLevelType w:val="hybridMultilevel"/>
     <w:tmpl w:val="39CCC5D0"/>
@@ -12597,7 +14096,7 @@
       </w:rPr>
     </w:lvl>
   </w:abstractNum>
-  <w:abstractNum w:abstractNumId="24" w15:restartNumberingAfterBreak="0">
+  <w:abstractNum w:abstractNumId="29" w15:restartNumberingAfterBreak="0">
     <w:nsid w:val="4F99727E"/>
     <w:multiLevelType w:val="hybridMultilevel"/>
     <w:tmpl w:val="5204B6DA"/>
@@ -12710,7 +14209,7 @@
       </w:rPr>
     </w:lvl>
   </w:abstractNum>
-  <w:abstractNum w:abstractNumId="25" w15:restartNumberingAfterBreak="0">
+  <w:abstractNum w:abstractNumId="30" w15:restartNumberingAfterBreak="0">
     <w:nsid w:val="6099287D"/>
     <w:multiLevelType w:val="hybridMultilevel"/>
     <w:tmpl w:val="E5FA6B5E"/>
@@ -12823,7 +14322,93 @@
       </w:rPr>
     </w:lvl>
   </w:abstractNum>
-  <w:abstractNum w:abstractNumId="26" w15:restartNumberingAfterBreak="0">
+  <w:abstractNum w:abstractNumId="31" w15:restartNumberingAfterBreak="0">
+    <w:nsid w:val="62E7032A"/>
+    <w:multiLevelType w:val="multilevel"/>
+    <w:tmpl w:val="0409001D"/>
+    <w:lvl w:ilvl="0">
+      <w:start w:val="1"/>
+      <w:numFmt w:val="decimal"/>
+      <w:lvlText w:val="%1)"/>
+      <w:lvlJc w:val="left"/>
+      <w:pPr>
+        <w:ind w:left="360" w:hanging="360"/>
+      </w:pPr>
+    </w:lvl>
+    <w:lvl w:ilvl="1">
+      <w:start w:val="1"/>
+      <w:numFmt w:val="lowerLetter"/>
+      <w:lvlText w:val="%2)"/>
+      <w:lvlJc w:val="left"/>
+      <w:pPr>
+        <w:ind w:left="720" w:hanging="360"/>
+      </w:pPr>
+    </w:lvl>
+    <w:lvl w:ilvl="2">
+      <w:start w:val="1"/>
+      <w:numFmt w:val="lowerRoman"/>
+      <w:lvlText w:val="%3)"/>
+      <w:lvlJc w:val="left"/>
+      <w:pPr>
+        <w:ind w:left="1080" w:hanging="360"/>
+      </w:pPr>
+    </w:lvl>
+    <w:lvl w:ilvl="3">
+      <w:start w:val="1"/>
+      <w:numFmt w:val="decimal"/>
+      <w:lvlText w:val="(%4)"/>
+      <w:lvlJc w:val="left"/>
+      <w:pPr>
+        <w:ind w:left="1440" w:hanging="360"/>
+      </w:pPr>
+    </w:lvl>
+    <w:lvl w:ilvl="4">
+      <w:start w:val="1"/>
+      <w:numFmt w:val="lowerLetter"/>
+      <w:lvlText w:val="(%5)"/>
+      <w:lvlJc w:val="left"/>
+      <w:pPr>
+        <w:ind w:left="1800" w:hanging="360"/>
+      </w:pPr>
+    </w:lvl>
+    <w:lvl w:ilvl="5">
+      <w:start w:val="1"/>
+      <w:numFmt w:val="lowerRoman"/>
+      <w:lvlText w:val="(%6)"/>
+      <w:lvlJc w:val="left"/>
+      <w:pPr>
+        <w:ind w:left="2160" w:hanging="360"/>
+      </w:pPr>
+    </w:lvl>
+    <w:lvl w:ilvl="6">
+      <w:start w:val="1"/>
+      <w:numFmt w:val="decimal"/>
+      <w:lvlText w:val="%7."/>
+      <w:lvlJc w:val="left"/>
+      <w:pPr>
+        <w:ind w:left="2520" w:hanging="360"/>
+      </w:pPr>
+    </w:lvl>
+    <w:lvl w:ilvl="7">
+      <w:start w:val="1"/>
+      <w:numFmt w:val="lowerLetter"/>
+      <w:lvlText w:val="%8."/>
+      <w:lvlJc w:val="left"/>
+      <w:pPr>
+        <w:ind w:left="2880" w:hanging="360"/>
+      </w:pPr>
+    </w:lvl>
+    <w:lvl w:ilvl="8">
+      <w:start w:val="1"/>
+      <w:numFmt w:val="lowerRoman"/>
+      <w:lvlText w:val="%9."/>
+      <w:lvlJc w:val="left"/>
+      <w:pPr>
+        <w:ind w:left="3240" w:hanging="360"/>
+      </w:pPr>
+    </w:lvl>
+  </w:abstractNum>
+  <w:abstractNum w:abstractNumId="32" w15:restartNumberingAfterBreak="0">
     <w:nsid w:val="635D27EB"/>
     <w:multiLevelType w:val="hybridMultilevel"/>
     <w:tmpl w:val="CF3A5BF2"/>
@@ -12912,7 +14497,7 @@
       </w:pPr>
     </w:lvl>
   </w:abstractNum>
-  <w:abstractNum w:abstractNumId="27" w15:restartNumberingAfterBreak="0">
+  <w:abstractNum w:abstractNumId="33" w15:restartNumberingAfterBreak="0">
     <w:nsid w:val="68D21616"/>
     <w:multiLevelType w:val="multilevel"/>
     <w:tmpl w:val="E6644EEE"/>
@@ -13061,7 +14646,7 @@
       </w:rPr>
     </w:lvl>
   </w:abstractNum>
-  <w:abstractNum w:abstractNumId="28" w15:restartNumberingAfterBreak="0">
+  <w:abstractNum w:abstractNumId="34" w15:restartNumberingAfterBreak="0">
     <w:nsid w:val="69C85B05"/>
     <w:multiLevelType w:val="hybridMultilevel"/>
     <w:tmpl w:val="37783E10"/>
@@ -13174,7 +14759,7 @@
       </w:rPr>
     </w:lvl>
   </w:abstractNum>
-  <w:abstractNum w:abstractNumId="29" w15:restartNumberingAfterBreak="0">
+  <w:abstractNum w:abstractNumId="35" w15:restartNumberingAfterBreak="0">
     <w:nsid w:val="6EA04BAA"/>
     <w:multiLevelType w:val="hybridMultilevel"/>
     <w:tmpl w:val="01240CBA"/>
@@ -13287,7 +14872,7 @@
       </w:rPr>
     </w:lvl>
   </w:abstractNum>
-  <w:abstractNum w:abstractNumId="30" w15:restartNumberingAfterBreak="0">
+  <w:abstractNum w:abstractNumId="36" w15:restartNumberingAfterBreak="0">
     <w:nsid w:val="73682DC8"/>
     <w:multiLevelType w:val="multilevel"/>
     <w:tmpl w:val="087CE96E"/>
@@ -13436,7 +15021,7 @@
       </w:rPr>
     </w:lvl>
   </w:abstractNum>
-  <w:abstractNum w:abstractNumId="31" w15:restartNumberingAfterBreak="0">
+  <w:abstractNum w:abstractNumId="37" w15:restartNumberingAfterBreak="0">
     <w:nsid w:val="736C53A0"/>
     <w:multiLevelType w:val="hybridMultilevel"/>
     <w:tmpl w:val="5B5C4D10"/>
@@ -13549,7 +15134,7 @@
       </w:rPr>
     </w:lvl>
   </w:abstractNum>
-  <w:abstractNum w:abstractNumId="32" w15:restartNumberingAfterBreak="0">
+  <w:abstractNum w:abstractNumId="38" w15:restartNumberingAfterBreak="0">
     <w:nsid w:val="73C23052"/>
     <w:multiLevelType w:val="hybridMultilevel"/>
     <w:tmpl w:val="D690FECA"/>
@@ -13662,7 +15247,7 @@
       </w:rPr>
     </w:lvl>
   </w:abstractNum>
-  <w:abstractNum w:abstractNumId="33" w15:restartNumberingAfterBreak="0">
+  <w:abstractNum w:abstractNumId="39" w15:restartNumberingAfterBreak="0">
     <w:nsid w:val="74984525"/>
     <w:multiLevelType w:val="hybridMultilevel"/>
     <w:tmpl w:val="B92AF58C"/>
@@ -13775,7 +15360,7 @@
       </w:rPr>
     </w:lvl>
   </w:abstractNum>
-  <w:abstractNum w:abstractNumId="34" w15:restartNumberingAfterBreak="0">
+  <w:abstractNum w:abstractNumId="40" w15:restartNumberingAfterBreak="0">
     <w:nsid w:val="75A2131D"/>
     <w:multiLevelType w:val="multilevel"/>
     <w:tmpl w:val="E3E68A84"/>
@@ -13924,7 +15509,7 @@
       </w:rPr>
     </w:lvl>
   </w:abstractNum>
-  <w:abstractNum w:abstractNumId="35" w15:restartNumberingAfterBreak="0">
+  <w:abstractNum w:abstractNumId="41" w15:restartNumberingAfterBreak="0">
     <w:nsid w:val="797E21D2"/>
     <w:multiLevelType w:val="multilevel"/>
     <w:tmpl w:val="6C0A5A54"/>
@@ -14073,7 +15658,7 @@
       </w:rPr>
     </w:lvl>
   </w:abstractNum>
-  <w:abstractNum w:abstractNumId="36" w15:restartNumberingAfterBreak="0">
+  <w:abstractNum w:abstractNumId="42" w15:restartNumberingAfterBreak="0">
     <w:nsid w:val="7C6B7663"/>
     <w:multiLevelType w:val="hybridMultilevel"/>
     <w:tmpl w:val="4FF6193C"/>
@@ -14162,7 +15747,7 @@
       </w:pPr>
     </w:lvl>
   </w:abstractNum>
-  <w:abstractNum w:abstractNumId="37" w15:restartNumberingAfterBreak="0">
+  <w:abstractNum w:abstractNumId="43" w15:restartNumberingAfterBreak="0">
     <w:nsid w:val="7F860919"/>
     <w:multiLevelType w:val="hybridMultilevel"/>
     <w:tmpl w:val="450A1098"/>
@@ -14255,16 +15840,16 @@
     </w:lvl>
   </w:abstractNum>
   <w:num w:numId="1" w16cid:durableId="1068459917">
-    <w:abstractNumId w:val="13"/>
+    <w:abstractNumId w:val="14"/>
   </w:num>
   <w:num w:numId="2" w16cid:durableId="1850634775">
-    <w:abstractNumId w:val="20"/>
+    <w:abstractNumId w:val="24"/>
   </w:num>
   <w:num w:numId="3" w16cid:durableId="657225218">
-    <w:abstractNumId w:val="21"/>
+    <w:abstractNumId w:val="25"/>
   </w:num>
   <w:num w:numId="4" w16cid:durableId="1516962698">
-    <w:abstractNumId w:val="32"/>
+    <w:abstractNumId w:val="38"/>
   </w:num>
   <w:num w:numId="5" w16cid:durableId="1868324600">
     <w:abstractNumId w:val="7"/>
@@ -14273,7 +15858,7 @@
     <w:abstractNumId w:val="0"/>
   </w:num>
   <w:num w:numId="7" w16cid:durableId="1648783324">
-    <w:abstractNumId w:val="19"/>
+    <w:abstractNumId w:val="23"/>
   </w:num>
   <w:num w:numId="8" w16cid:durableId="861626321">
     <w:abstractNumId w:val="5"/>
@@ -14282,91 +15867,109 @@
     <w:abstractNumId w:val="8"/>
   </w:num>
   <w:num w:numId="10" w16cid:durableId="886142108">
-    <w:abstractNumId w:val="25"/>
+    <w:abstractNumId w:val="30"/>
   </w:num>
   <w:num w:numId="11" w16cid:durableId="1563323906">
-    <w:abstractNumId w:val="11"/>
+    <w:abstractNumId w:val="12"/>
   </w:num>
   <w:num w:numId="12" w16cid:durableId="1507281334">
-    <w:abstractNumId w:val="12"/>
+    <w:abstractNumId w:val="13"/>
   </w:num>
   <w:num w:numId="13" w16cid:durableId="1547596144">
-    <w:abstractNumId w:val="30"/>
+    <w:abstractNumId w:val="36"/>
   </w:num>
   <w:num w:numId="14" w16cid:durableId="494346921">
-    <w:abstractNumId w:val="28"/>
+    <w:abstractNumId w:val="34"/>
   </w:num>
   <w:num w:numId="15" w16cid:durableId="170723990">
-    <w:abstractNumId w:val="23"/>
+    <w:abstractNumId w:val="28"/>
   </w:num>
   <w:num w:numId="16" w16cid:durableId="531649451">
     <w:abstractNumId w:val="6"/>
   </w:num>
   <w:num w:numId="17" w16cid:durableId="254680269">
-    <w:abstractNumId w:val="15"/>
+    <w:abstractNumId w:val="16"/>
   </w:num>
   <w:num w:numId="18" w16cid:durableId="43876029">
-    <w:abstractNumId w:val="33"/>
+    <w:abstractNumId w:val="39"/>
   </w:num>
   <w:num w:numId="19" w16cid:durableId="866063410">
     <w:abstractNumId w:val="2"/>
   </w:num>
   <w:num w:numId="20" w16cid:durableId="1264606595">
-    <w:abstractNumId w:val="18"/>
+    <w:abstractNumId w:val="20"/>
   </w:num>
   <w:num w:numId="21" w16cid:durableId="682978570">
-    <w:abstractNumId w:val="34"/>
+    <w:abstractNumId w:val="40"/>
   </w:num>
   <w:num w:numId="22" w16cid:durableId="54202293">
-    <w:abstractNumId w:val="22"/>
+    <w:abstractNumId w:val="27"/>
   </w:num>
   <w:num w:numId="23" w16cid:durableId="611089396">
     <w:abstractNumId w:val="4"/>
   </w:num>
   <w:num w:numId="24" w16cid:durableId="55668285">
-    <w:abstractNumId w:val="31"/>
+    <w:abstractNumId w:val="37"/>
   </w:num>
   <w:num w:numId="25" w16cid:durableId="445080443">
-    <w:abstractNumId w:val="16"/>
+    <w:abstractNumId w:val="17"/>
   </w:num>
   <w:num w:numId="26" w16cid:durableId="1060055889">
     <w:abstractNumId w:val="1"/>
   </w:num>
   <w:num w:numId="27" w16cid:durableId="2132242381">
-    <w:abstractNumId w:val="17"/>
+    <w:abstractNumId w:val="18"/>
   </w:num>
   <w:num w:numId="28" w16cid:durableId="1643922697">
-    <w:abstractNumId w:val="10"/>
+    <w:abstractNumId w:val="11"/>
   </w:num>
   <w:num w:numId="29" w16cid:durableId="699818087">
-    <w:abstractNumId w:val="27"/>
+    <w:abstractNumId w:val="33"/>
   </w:num>
   <w:num w:numId="30" w16cid:durableId="2037731468">
-    <w:abstractNumId w:val="36"/>
+    <w:abstractNumId w:val="42"/>
   </w:num>
   <w:num w:numId="31" w16cid:durableId="2102876044">
-    <w:abstractNumId w:val="24"/>
+    <w:abstractNumId w:val="29"/>
   </w:num>
   <w:num w:numId="32" w16cid:durableId="528033152">
-    <w:abstractNumId w:val="26"/>
+    <w:abstractNumId w:val="32"/>
   </w:num>
   <w:num w:numId="33" w16cid:durableId="756635604">
-    <w:abstractNumId w:val="37"/>
+    <w:abstractNumId w:val="43"/>
   </w:num>
   <w:num w:numId="34" w16cid:durableId="1955012707">
-    <w:abstractNumId w:val="14"/>
+    <w:abstractNumId w:val="15"/>
   </w:num>
   <w:num w:numId="35" w16cid:durableId="355078805">
     <w:abstractNumId w:val="9"/>
   </w:num>
   <w:num w:numId="36" w16cid:durableId="1421946264">
-    <w:abstractNumId w:val="35"/>
+    <w:abstractNumId w:val="41"/>
   </w:num>
   <w:num w:numId="37" w16cid:durableId="1901288590">
     <w:abstractNumId w:val="3"/>
   </w:num>
   <w:num w:numId="38" w16cid:durableId="1902520508">
-    <w:abstractNumId w:val="29"/>
+    <w:abstractNumId w:val="35"/>
+  </w:num>
+  <w:num w:numId="39" w16cid:durableId="584607918">
+    <w:abstractNumId w:val="22"/>
+  </w:num>
+  <w:num w:numId="40" w16cid:durableId="464740755">
+    <w:abstractNumId w:val="10"/>
+  </w:num>
+  <w:num w:numId="41" w16cid:durableId="1775704176">
+    <w:abstractNumId w:val="21"/>
+  </w:num>
+  <w:num w:numId="42" w16cid:durableId="1351102935">
+    <w:abstractNumId w:val="26"/>
+  </w:num>
+  <w:num w:numId="43" w16cid:durableId="1666585886">
+    <w:abstractNumId w:val="31"/>
+  </w:num>
+  <w:num w:numId="44" w16cid:durableId="149254239">
+    <w:abstractNumId w:val="19"/>
   </w:num>
 </w:numbering>
 </file>
@@ -15717,12 +17320,13 @@
 </file>
 
 <file path=customXml/item1.xml><?xml version="1.0" encoding="utf-8"?>
-<?mso-contentType ?>
-<FormTemplates xmlns="http://schemas.microsoft.com/sharepoint/v3/contenttype/forms">
-  <Display>DocumentLibraryForm</Display>
-  <Edit>DocumentLibraryForm</Edit>
-  <New>DocumentLibraryForm</New>
-</FormTemplates>
+<p:properties xmlns:p="http://schemas.microsoft.com/office/2006/metadata/properties" xmlns:xsi="http://www.w3.org/2001/XMLSchema-instance" xmlns:pc="http://schemas.microsoft.com/office/infopath/2007/PartnerControls">
+  <documentManagement>
+    <_ip_UnifiedCompliancePolicyUIAction xmlns="http://schemas.microsoft.com/sharepoint/v3" xsi:nil="true"/>
+    <_ip_UnifiedCompliancePolicyProperties xmlns="http://schemas.microsoft.com/sharepoint/v3" xsi:nil="true"/>
+    <_activity xmlns="aaca710f-348c-473b-8ae4-cd608da168de" xsi:nil="true"/>
+  </documentManagement>
+</p:properties>
 </file>
 
 <file path=customXml/item2.xml><?xml version="1.0" encoding="utf-8"?>
@@ -15730,13 +17334,12 @@
 </file>
 
 <file path=customXml/item3.xml><?xml version="1.0" encoding="utf-8"?>
-<p:properties xmlns:p="http://schemas.microsoft.com/office/2006/metadata/properties" xmlns:xsi="http://www.w3.org/2001/XMLSchema-instance" xmlns:pc="http://schemas.microsoft.com/office/infopath/2007/PartnerControls">
-  <documentManagement>
-    <_ip_UnifiedCompliancePolicyUIAction xmlns="http://schemas.microsoft.com/sharepoint/v3" xsi:nil="true"/>
-    <_ip_UnifiedCompliancePolicyProperties xmlns="http://schemas.microsoft.com/sharepoint/v3" xsi:nil="true"/>
-    <_activity xmlns="aaca710f-348c-473b-8ae4-cd608da168de" xsi:nil="true"/>
-  </documentManagement>
-</p:properties>
+<?mso-contentType ?>
+<FormTemplates xmlns="http://schemas.microsoft.com/sharepoint/v3/contenttype/forms">
+  <Display>DocumentLibraryForm</Display>
+  <Edit>DocumentLibraryForm</Edit>
+  <New>DocumentLibraryForm</New>
+</FormTemplates>
 </file>
 
 <file path=customXml/item4.xml><?xml version="1.0" encoding="utf-8"?>
@@ -15972,9 +17575,12 @@
 </file>
 
 <file path=customXml/itemProps1.xml><?xml version="1.0" encoding="utf-8"?>
-<ds:datastoreItem xmlns:ds="http://schemas.openxmlformats.org/officeDocument/2006/customXml" ds:itemID="{DC69FB58-C24C-408F-A3A8-92FAB5FC24B3}">
+<ds:datastoreItem xmlns:ds="http://schemas.openxmlformats.org/officeDocument/2006/customXml" ds:itemID="{8DDCC28F-0174-4A9E-9BC4-6160A553800D}">
   <ds:schemaRefs>
-    <ds:schemaRef ds:uri="http://schemas.microsoft.com/sharepoint/v3/contenttype/forms"/>
+    <ds:schemaRef ds:uri="http://schemas.microsoft.com/office/2006/metadata/properties"/>
+    <ds:schemaRef ds:uri="http://schemas.microsoft.com/office/infopath/2007/PartnerControls"/>
+    <ds:schemaRef ds:uri="http://schemas.microsoft.com/sharepoint/v3"/>
+    <ds:schemaRef ds:uri="aaca710f-348c-473b-8ae4-cd608da168de"/>
   </ds:schemaRefs>
 </ds:datastoreItem>
 </file>
@@ -15988,12 +17594,9 @@
 </file>
 
 <file path=customXml/itemProps3.xml><?xml version="1.0" encoding="utf-8"?>
-<ds:datastoreItem xmlns:ds="http://schemas.openxmlformats.org/officeDocument/2006/customXml" ds:itemID="{8DDCC28F-0174-4A9E-9BC4-6160A553800D}">
+<ds:datastoreItem xmlns:ds="http://schemas.openxmlformats.org/officeDocument/2006/customXml" ds:itemID="{DC69FB58-C24C-408F-A3A8-92FAB5FC24B3}">
   <ds:schemaRefs>
-    <ds:schemaRef ds:uri="http://schemas.microsoft.com/office/2006/metadata/properties"/>
-    <ds:schemaRef ds:uri="http://schemas.microsoft.com/office/infopath/2007/PartnerControls"/>
-    <ds:schemaRef ds:uri="http://schemas.microsoft.com/sharepoint/v3"/>
-    <ds:schemaRef ds:uri="aaca710f-348c-473b-8ae4-cd608da168de"/>
+    <ds:schemaRef ds:uri="http://schemas.microsoft.com/sharepoint/v3/contenttype/forms"/>
   </ds:schemaRefs>
 </ds:datastoreItem>
 </file>
@@ -16020,6 +17623,7 @@
 
 <file path=docMetadata/LabelInfo.xml><?xml version="1.0" encoding="utf-8"?>
 <clbl:labelList xmlns:clbl="http://schemas.microsoft.com/office/2020/mipLabelMetadata">
+  <clbl:label id="{f265efc6-e181-49d6-80f4-fae95cf838a0}" enabled="1" method="Privileged" siteId="{3dd8961f-e488-4e60-8e11-a82d994e183d}" contentBits="1" removed="0"/>
   <clbl:label id="{f42aa342-8706-4288-bd11-ebb85995028c}" enabled="1" method="Standard" siteId="{72f988bf-86f1-41af-91ab-2d7cd011db47}" removed="0"/>
 </clbl:labelList>
 </file>
</xml_diff>